<commit_message>
Proje2 Adim2: Tam yedekleme - Chinook_Full.bak olusturuldu, RESTORE VERIFYONLY ile dogrulandi
</commit_message>
<xml_diff>
--- a/Proje2-YedeklemeveKurtarma/Proje2_Rapor.docx
+++ b/Proje2-YedeklemeveKurtarma/Proje2_Rapor.docx
@@ -1258,14 +1258,360 @@
       <w:r>
         <w:rPr>
           <w:rFonts w:ascii="Times New Roman" w:cs="Times New Roman" w:eastAsia="Times New Roman" w:hAnsi="Times New Roman"/>
+          <w:sz w:val="22"/>
+          <w:szCs w:val="22"/>
+        </w:rPr>
+        <w:t xml:space="preserve">Tam yedekleme, veritabanının tamamını tek bir yedek dosyasına kopyalar. Diğer yedekleme türlerinin (diferansiyel, log) temeli olup felaketten kurtarma senaryolarında ilk başvurulan yöntemdir.</w:t>
+      </w:r>
+    </w:p>
+    <w:p>
+      <w:pPr>
+        <w:spacing w:after="100" w:before="100"/>
+      </w:pPr>
+    </w:p>
+    <w:p>
+      <w:pPr>
+        <w:pStyle w:val="Heading2"/>
+        <w:spacing w:after="80" w:before="200"/>
+      </w:pPr>
+      <w:r>
+        <w:rPr>
+          <w:rFonts w:ascii="Times New Roman" w:cs="Times New Roman" w:eastAsia="Times New Roman" w:hAnsi="Times New Roman"/>
+          <w:b/>
+          <w:bCs/>
+          <w:sz w:val="24"/>
+          <w:szCs w:val="24"/>
+        </w:rPr>
+        <w:t xml:space="preserve">3.1 Yedek Alma</w:t>
+      </w:r>
+    </w:p>
+    <w:p>
+      <w:pPr>
+        <w:spacing w:after="80" w:before="80"/>
+        <w:jc w:val="both"/>
+      </w:pPr>
+      <w:r>
+        <w:rPr>
+          <w:rFonts w:ascii="Times New Roman" w:cs="Times New Roman" w:eastAsia="Times New Roman" w:hAnsi="Times New Roman"/>
+          <w:sz w:val="22"/>
+          <w:szCs w:val="22"/>
+        </w:rPr>
+        <w:t xml:space="preserve">BACKUP DATABASE komutu ile Chinook veritabanının tam yedeği C:\Backup\Chinook_Full.bak dosyasına alınmıştır. WITH FORMAT parametresi mevcut yedeğin üzerine yazılmasını sağlar.</w:t>
+      </w:r>
+    </w:p>
+    <w:p>
+      <w:pPr>
+        <w:shd w:fill="F2F2F2" w:val="clear"/>
+        <w:spacing w:after="0" w:before="0"/>
+      </w:pPr>
+      <w:r>
+        <w:rPr>
+          <w:rFonts w:ascii="Courier New" w:cs="Courier New" w:eastAsia="Courier New" w:hAnsi="Courier New"/>
+          <w:sz w:val="18"/>
+          <w:szCs w:val="18"/>
+        </w:rPr>
+        <w:t xml:space="preserve">USE master;</w:t>
+      </w:r>
+    </w:p>
+    <w:p>
+      <w:pPr>
+        <w:shd w:fill="F2F2F2" w:val="clear"/>
+        <w:spacing w:after="0" w:before="0"/>
+      </w:pPr>
+      <w:r>
+        <w:rPr>
+          <w:rFonts w:ascii="Courier New" w:cs="Courier New" w:eastAsia="Courier New" w:hAnsi="Courier New"/>
+          <w:sz w:val="18"/>
+          <w:szCs w:val="18"/>
+        </w:rPr>
+        <w:t xml:space="preserve"/>
+      </w:r>
+    </w:p>
+    <w:p>
+      <w:pPr>
+        <w:shd w:fill="F2F2F2" w:val="clear"/>
+        <w:spacing w:after="0" w:before="0"/>
+      </w:pPr>
+      <w:r>
+        <w:rPr>
+          <w:rFonts w:ascii="Courier New" w:cs="Courier New" w:eastAsia="Courier New" w:hAnsi="Courier New"/>
+          <w:sz w:val="18"/>
+          <w:szCs w:val="18"/>
+        </w:rPr>
+        <w:t xml:space="preserve">BACKUP DATABASE Chinook</w:t>
+      </w:r>
+    </w:p>
+    <w:p>
+      <w:pPr>
+        <w:shd w:fill="F2F2F2" w:val="clear"/>
+        <w:spacing w:after="0" w:before="0"/>
+      </w:pPr>
+      <w:r>
+        <w:rPr>
+          <w:rFonts w:ascii="Courier New" w:cs="Courier New" w:eastAsia="Courier New" w:hAnsi="Courier New"/>
+          <w:sz w:val="18"/>
+          <w:szCs w:val="18"/>
+        </w:rPr>
+        <w:t xml:space="preserve">TO DISK = 'C:\Backup\Chinook_Full.bak'</w:t>
+      </w:r>
+    </w:p>
+    <w:p>
+      <w:pPr>
+        <w:shd w:fill="F2F2F2" w:val="clear"/>
+        <w:spacing w:after="0" w:before="0"/>
+      </w:pPr>
+      <w:r>
+        <w:rPr>
+          <w:rFonts w:ascii="Courier New" w:cs="Courier New" w:eastAsia="Courier New" w:hAnsi="Courier New"/>
+          <w:sz w:val="18"/>
+          <w:szCs w:val="18"/>
+        </w:rPr>
+        <w:t xml:space="preserve">WITH FORMAT,</w:t>
+      </w:r>
+    </w:p>
+    <w:p>
+      <w:pPr>
+        <w:shd w:fill="F2F2F2" w:val="clear"/>
+        <w:spacing w:after="0" w:before="0"/>
+      </w:pPr>
+      <w:r>
+        <w:rPr>
+          <w:rFonts w:ascii="Courier New" w:cs="Courier New" w:eastAsia="Courier New" w:hAnsi="Courier New"/>
+          <w:sz w:val="18"/>
+          <w:szCs w:val="18"/>
+        </w:rPr>
+        <w:t xml:space="preserve">     NAME = 'Chinook Tam Yedek',</w:t>
+      </w:r>
+    </w:p>
+    <w:p>
+      <w:pPr>
+        <w:shd w:fill="F2F2F2" w:val="clear"/>
+        <w:spacing w:after="0" w:before="0"/>
+      </w:pPr>
+      <w:r>
+        <w:rPr>
+          <w:rFonts w:ascii="Courier New" w:cs="Courier New" w:eastAsia="Courier New" w:hAnsi="Courier New"/>
+          <w:sz w:val="18"/>
+          <w:szCs w:val="18"/>
+        </w:rPr>
+        <w:t xml:space="preserve">     DESCRIPTION = 'Chinook veritabani tam yedekleme';</w:t>
+      </w:r>
+    </w:p>
+    <w:p>
+      <w:pPr>
+        <w:spacing w:after="100" w:before="100"/>
+      </w:pPr>
+    </w:p>
+    <w:p>
+      <w:pPr>
+        <w:spacing w:after="40" w:before="100"/>
+        <w:jc w:val="center"/>
+      </w:pPr>
+      <w:r>
+        <w:drawing>
+          <wp:inline distT="0" distB="0" distL="0" distR="0">
+            <wp:extent cx="5143500" cy="2476500"/>
+            <wp:effectExtent t="0" r="0" b="0" l="0"/>
+            <wp:docPr id="1" name="Tam yedekleme" descr="Tam yedekleme" title="Tam yedekleme"/>
+            <wp:cNvGraphicFramePr>
+              <a:graphicFrameLocks xmlns:a="http://schemas.openxmlformats.org/drawingml/2006/main" noChangeAspect="1"/>
+            </wp:cNvGraphicFramePr>
+            <a:graphic xmlns:a="http://schemas.openxmlformats.org/drawingml/2006/main">
+              <a:graphicData uri="http://schemas.openxmlformats.org/drawingml/2006/picture">
+                <pic:pic xmlns:pic="http://schemas.openxmlformats.org/drawingml/2006/picture">
+                  <pic:nvPicPr>
+                    <pic:cNvPr id="0" name="" descr=""/>
+                    <pic:cNvPicPr>
+                      <a:picLocks noChangeAspect="1" noChangeArrowheads="1"/>
+                    </pic:cNvPicPr>
+                  </pic:nvPicPr>
+                  <pic:blipFill>
+                    <a:blip r:embed="rId15" cstate="none"/>
+                    <a:srcRect/>
+                    <a:stretch>
+                      <a:fillRect/>
+                    </a:stretch>
+                  </pic:blipFill>
+                  <pic:spPr bwMode="auto">
+                    <a:xfrm>
+                      <a:off x="0" y="0"/>
+                      <a:ext cx="5143500" cy="2476500"/>
+                    </a:xfrm>
+                    <a:prstGeom prst="rect">
+                      <a:avLst/>
+                    </a:prstGeom>
+                  </pic:spPr>
+                </pic:pic>
+              </a:graphicData>
+            </a:graphic>
+          </wp:inline>
+        </w:drawing>
+      </w:r>
+    </w:p>
+    <w:p>
+      <w:pPr>
+        <w:spacing w:after="160" w:before="40"/>
+        <w:jc w:val="center"/>
+      </w:pPr>
+      <w:r>
+        <w:rPr>
+          <w:rFonts w:ascii="Times New Roman" w:cs="Times New Roman" w:eastAsia="Times New Roman" w:hAnsi="Times New Roman"/>
           <w:i/>
           <w:iCs/>
-          <w:color w:val="888888"/>
+          <w:sz w:val="18"/>
+          <w:szCs w:val="18"/>
+        </w:rPr>
+        <w:t xml:space="preserve">Şekil 7 – Tam yedekleme başarılı: 762 sayfa, 0.030 saniyede işlendi (198.307 MB/sn)</w:t>
+      </w:r>
+    </w:p>
+    <w:p>
+      <w:pPr>
+        <w:spacing w:after="80" w:before="80"/>
+        <w:jc w:val="both"/>
+      </w:pPr>
+      <w:r>
+        <w:rPr>
+          <w:rFonts w:ascii="Times New Roman" w:cs="Times New Roman" w:eastAsia="Times New Roman" w:hAnsi="Times New Roman"/>
           <w:sz w:val="22"/>
           <w:szCs w:val="22"/>
         </w:rPr>
-        <w:t xml:space="preserve">Bu bölüm doldurulacaktır.</w:t>
-      </w:r>
+        <w:t xml:space="preserve">Sonuç: Chinook veritabanı küçük boyutu sayesinde 0.030 saniyede yedeklenmiştir. Büyük veritabanlarında bu süre dakikalar hatta saatler alabilir.</w:t>
+      </w:r>
+    </w:p>
+    <w:p>
+      <w:pPr>
+        <w:spacing w:after="100" w:before="100"/>
+      </w:pPr>
+    </w:p>
+    <w:p>
+      <w:pPr>
+        <w:pStyle w:val="Heading2"/>
+        <w:spacing w:after="80" w:before="200"/>
+      </w:pPr>
+      <w:r>
+        <w:rPr>
+          <w:rFonts w:ascii="Times New Roman" w:cs="Times New Roman" w:eastAsia="Times New Roman" w:hAnsi="Times New Roman"/>
+          <w:b/>
+          <w:bCs/>
+          <w:sz w:val="24"/>
+          <w:szCs w:val="24"/>
+        </w:rPr>
+        <w:t xml:space="preserve">3.2 Yedek Doğrulama</w:t>
+      </w:r>
+    </w:p>
+    <w:p>
+      <w:pPr>
+        <w:spacing w:after="80" w:before="80"/>
+        <w:jc w:val="both"/>
+      </w:pPr>
+      <w:r>
+        <w:rPr>
+          <w:rFonts w:ascii="Times New Roman" w:cs="Times New Roman" w:eastAsia="Times New Roman" w:hAnsi="Times New Roman"/>
+          <w:sz w:val="22"/>
+          <w:szCs w:val="22"/>
+        </w:rPr>
+        <w:t xml:space="preserve">RESTORE VERIFYONLY komutu, yedek dosyasının bütünlüğünü ve okunabilirliğini kontrol eder. Gerçek bir geri yükleme yapmadan yedeğin geçerli olup olmadığını doğrular.</w:t>
+      </w:r>
+    </w:p>
+    <w:p>
+      <w:pPr>
+        <w:shd w:fill="F2F2F2" w:val="clear"/>
+        <w:spacing w:after="0" w:before="0"/>
+      </w:pPr>
+      <w:r>
+        <w:rPr>
+          <w:rFonts w:ascii="Courier New" w:cs="Courier New" w:eastAsia="Courier New" w:hAnsi="Courier New"/>
+          <w:sz w:val="18"/>
+          <w:szCs w:val="18"/>
+        </w:rPr>
+        <w:t xml:space="preserve">RESTORE VERIFYONLY</w:t>
+      </w:r>
+    </w:p>
+    <w:p>
+      <w:pPr>
+        <w:shd w:fill="F2F2F2" w:val="clear"/>
+        <w:spacing w:after="0" w:before="0"/>
+      </w:pPr>
+      <w:r>
+        <w:rPr>
+          <w:rFonts w:ascii="Courier New" w:cs="Courier New" w:eastAsia="Courier New" w:hAnsi="Courier New"/>
+          <w:sz w:val="18"/>
+          <w:szCs w:val="18"/>
+        </w:rPr>
+        <w:t xml:space="preserve">FROM DISK = 'C:\Backup\Chinook_Full.bak';</w:t>
+      </w:r>
+    </w:p>
+    <w:p>
+      <w:pPr>
+        <w:spacing w:after="100" w:before="100"/>
+      </w:pPr>
+    </w:p>
+    <w:p>
+      <w:pPr>
+        <w:spacing w:after="40" w:before="100"/>
+        <w:jc w:val="center"/>
+      </w:pPr>
+      <w:r>
+        <w:drawing>
+          <wp:inline distT="0" distB="0" distL="0" distR="0">
+            <wp:extent cx="5143500" cy="2095500"/>
+            <wp:effectExtent t="0" r="0" b="0" l="0"/>
+            <wp:docPr id="1" name="Yedek doğrulama" descr="Yedek doğrulama" title="Yedek doğrulama"/>
+            <wp:cNvGraphicFramePr>
+              <a:graphicFrameLocks xmlns:a="http://schemas.openxmlformats.org/drawingml/2006/main" noChangeAspect="1"/>
+            </wp:cNvGraphicFramePr>
+            <a:graphic xmlns:a="http://schemas.openxmlformats.org/drawingml/2006/main">
+              <a:graphicData uri="http://schemas.openxmlformats.org/drawingml/2006/picture">
+                <pic:pic xmlns:pic="http://schemas.openxmlformats.org/drawingml/2006/picture">
+                  <pic:nvPicPr>
+                    <pic:cNvPr id="0" name="" descr=""/>
+                    <pic:cNvPicPr>
+                      <a:picLocks noChangeAspect="1" noChangeArrowheads="1"/>
+                    </pic:cNvPicPr>
+                  </pic:nvPicPr>
+                  <pic:blipFill>
+                    <a:blip r:embed="rId16" cstate="none"/>
+                    <a:srcRect/>
+                    <a:stretch>
+                      <a:fillRect/>
+                    </a:stretch>
+                  </pic:blipFill>
+                  <pic:spPr bwMode="auto">
+                    <a:xfrm>
+                      <a:off x="0" y="0"/>
+                      <a:ext cx="5143500" cy="2095500"/>
+                    </a:xfrm>
+                    <a:prstGeom prst="rect">
+                      <a:avLst/>
+                    </a:prstGeom>
+                  </pic:spPr>
+                </pic:pic>
+              </a:graphicData>
+            </a:graphic>
+          </wp:inline>
+        </w:drawing>
+      </w:r>
+    </w:p>
+    <w:p>
+      <w:pPr>
+        <w:spacing w:after="160" w:before="40"/>
+        <w:jc w:val="center"/>
+      </w:pPr>
+      <w:r>
+        <w:rPr>
+          <w:rFonts w:ascii="Times New Roman" w:cs="Times New Roman" w:eastAsia="Times New Roman" w:hAnsi="Times New Roman"/>
+          <w:i/>
+          <w:iCs/>
+          <w:sz w:val="18"/>
+          <w:szCs w:val="18"/>
+        </w:rPr>
+        <w:t xml:space="preserve">Şekil 8 – "The backup set on file 1 is valid." – Yedek dosyası geçerli ve kullanılabilir</w:t>
+      </w:r>
+    </w:p>
+    <w:p>
+      <w:pPr>
+        <w:spacing w:after="100" w:before="100"/>
+      </w:pPr>
     </w:p>
     <w:p>
       <w:pPr>

</xml_diff>

<commit_message>
Proje2 Adim3: Diferansiyel yedekleme - Jazz Fusion ve Ambient genre eklendi, Chinook_Diff.bak olusturuldu
</commit_message>
<xml_diff>
--- a/Proje2-YedeklemeveKurtarma/Proje2_Rapor.docx
+++ b/Proje2-YedeklemeveKurtarma/Proje2_Rapor.docx
@@ -1637,14 +1637,701 @@
       <w:r>
         <w:rPr>
           <w:rFonts w:ascii="Times New Roman" w:cs="Times New Roman" w:eastAsia="Times New Roman" w:hAnsi="Times New Roman"/>
+          <w:sz w:val="22"/>
+          <w:szCs w:val="22"/>
+        </w:rPr>
+        <w:t xml:space="preserve">Diferansiyel yedekleme, son tam yedekten bu yana değişen verileri yedekler. Tam yedekten daha küçük ve hızlıdır; ancak geri yüklemede önce tam yedek, ardından diferansiyel yedek uygulanmalıdır.</w:t>
+      </w:r>
+    </w:p>
+    <w:p>
+      <w:pPr>
+        <w:spacing w:after="100" w:before="100"/>
+      </w:pPr>
+    </w:p>
+    <w:p>
+      <w:pPr>
+        <w:pStyle w:val="Heading2"/>
+        <w:spacing w:after="80" w:before="200"/>
+      </w:pPr>
+      <w:r>
+        <w:rPr>
+          <w:rFonts w:ascii="Times New Roman" w:cs="Times New Roman" w:eastAsia="Times New Roman" w:hAnsi="Times New Roman"/>
+          <w:b/>
+          <w:bCs/>
+          <w:sz w:val="24"/>
+          <w:szCs w:val="24"/>
+        </w:rPr>
+        <w:t xml:space="preserve">4.1 Veri Değişikliği</w:t>
+      </w:r>
+    </w:p>
+    <w:p>
+      <w:pPr>
+        <w:spacing w:after="80" w:before="80"/>
+        <w:jc w:val="both"/>
+      </w:pPr>
+      <w:r>
+        <w:rPr>
+          <w:rFonts w:ascii="Times New Roman" w:cs="Times New Roman" w:eastAsia="Times New Roman" w:hAnsi="Times New Roman"/>
+          <w:sz w:val="22"/>
+          <w:szCs w:val="22"/>
+        </w:rPr>
+        <w:t xml:space="preserve">Diferansiyel yedeğin değişen veriyi kapsadığını göstermek amacıyla Genre tablosuna iki yeni kayıt eklenmiştir.</w:t>
+      </w:r>
+    </w:p>
+    <w:p>
+      <w:pPr>
+        <w:shd w:fill="F2F2F2" w:val="clear"/>
+        <w:spacing w:after="0" w:before="0"/>
+      </w:pPr>
+      <w:r>
+        <w:rPr>
+          <w:rFonts w:ascii="Courier New" w:cs="Courier New" w:eastAsia="Courier New" w:hAnsi="Courier New"/>
+          <w:sz w:val="18"/>
+          <w:szCs w:val="18"/>
+        </w:rPr>
+        <w:t xml:space="preserve">USE Chinook;</w:t>
+      </w:r>
+    </w:p>
+    <w:p>
+      <w:pPr>
+        <w:shd w:fill="F2F2F2" w:val="clear"/>
+        <w:spacing w:after="0" w:before="0"/>
+      </w:pPr>
+      <w:r>
+        <w:rPr>
+          <w:rFonts w:ascii="Courier New" w:cs="Courier New" w:eastAsia="Courier New" w:hAnsi="Courier New"/>
+          <w:sz w:val="18"/>
+          <w:szCs w:val="18"/>
+        </w:rPr>
+        <w:t xml:space="preserve"/>
+      </w:r>
+    </w:p>
+    <w:p>
+      <w:pPr>
+        <w:shd w:fill="F2F2F2" w:val="clear"/>
+        <w:spacing w:after="0" w:before="0"/>
+      </w:pPr>
+      <w:r>
+        <w:rPr>
+          <w:rFonts w:ascii="Courier New" w:cs="Courier New" w:eastAsia="Courier New" w:hAnsi="Courier New"/>
+          <w:sz w:val="18"/>
+          <w:szCs w:val="18"/>
+        </w:rPr>
+        <w:t xml:space="preserve">INSERT INTO Genre (GenreId, Name) VALUES (26, 'Jazz Fusion');</w:t>
+      </w:r>
+    </w:p>
+    <w:p>
+      <w:pPr>
+        <w:shd w:fill="F2F2F2" w:val="clear"/>
+        <w:spacing w:after="0" w:before="0"/>
+      </w:pPr>
+      <w:r>
+        <w:rPr>
+          <w:rFonts w:ascii="Courier New" w:cs="Courier New" w:eastAsia="Courier New" w:hAnsi="Courier New"/>
+          <w:sz w:val="18"/>
+          <w:szCs w:val="18"/>
+        </w:rPr>
+        <w:t xml:space="preserve">INSERT INTO Genre (GenreId, Name) VALUES (27, 'Ambient');</w:t>
+      </w:r>
+    </w:p>
+    <w:p>
+      <w:pPr>
+        <w:shd w:fill="F2F2F2" w:val="clear"/>
+        <w:spacing w:after="0" w:before="0"/>
+      </w:pPr>
+      <w:r>
+        <w:rPr>
+          <w:rFonts w:ascii="Courier New" w:cs="Courier New" w:eastAsia="Courier New" w:hAnsi="Courier New"/>
+          <w:sz w:val="18"/>
+          <w:szCs w:val="18"/>
+        </w:rPr>
+        <w:t xml:space="preserve"/>
+      </w:r>
+    </w:p>
+    <w:p>
+      <w:pPr>
+        <w:shd w:fill="F2F2F2" w:val="clear"/>
+        <w:spacing w:after="0" w:before="0"/>
+      </w:pPr>
+      <w:r>
+        <w:rPr>
+          <w:rFonts w:ascii="Courier New" w:cs="Courier New" w:eastAsia="Courier New" w:hAnsi="Courier New"/>
+          <w:sz w:val="18"/>
+          <w:szCs w:val="18"/>
+        </w:rPr>
+        <w:t xml:space="preserve">SELECT * FROM Genre;</w:t>
+      </w:r>
+    </w:p>
+    <w:p>
+      <w:pPr>
+        <w:spacing w:after="100" w:before="100"/>
+      </w:pPr>
+    </w:p>
+    <w:p>
+      <w:pPr>
+        <w:spacing w:after="40" w:before="100"/>
+        <w:jc w:val="center"/>
+      </w:pPr>
+      <w:r>
+        <w:drawing>
+          <wp:inline distT="0" distB="0" distL="0" distR="0">
+            <wp:extent cx="3619500" cy="3619500"/>
+            <wp:effectExtent t="0" r="0" b="0" l="0"/>
+            <wp:docPr id="1" name="Genre tablosu 1" descr="Genre tablosu 1" title="Genre tablosu 1"/>
+            <wp:cNvGraphicFramePr>
+              <a:graphicFrameLocks xmlns:a="http://schemas.openxmlformats.org/drawingml/2006/main" noChangeAspect="1"/>
+            </wp:cNvGraphicFramePr>
+            <a:graphic xmlns:a="http://schemas.openxmlformats.org/drawingml/2006/main">
+              <a:graphicData uri="http://schemas.openxmlformats.org/drawingml/2006/picture">
+                <pic:pic xmlns:pic="http://schemas.openxmlformats.org/drawingml/2006/picture">
+                  <pic:nvPicPr>
+                    <pic:cNvPr id="0" name="" descr=""/>
+                    <pic:cNvPicPr>
+                      <a:picLocks noChangeAspect="1" noChangeArrowheads="1"/>
+                    </pic:cNvPicPr>
+                  </pic:nvPicPr>
+                  <pic:blipFill>
+                    <a:blip r:embed="rId17" cstate="none"/>
+                    <a:srcRect/>
+                    <a:stretch>
+                      <a:fillRect/>
+                    </a:stretch>
+                  </pic:blipFill>
+                  <pic:spPr bwMode="auto">
+                    <a:xfrm>
+                      <a:off x="0" y="0"/>
+                      <a:ext cx="3619500" cy="3619500"/>
+                    </a:xfrm>
+                    <a:prstGeom prst="rect">
+                      <a:avLst/>
+                    </a:prstGeom>
+                  </pic:spPr>
+                </pic:pic>
+              </a:graphicData>
+            </a:graphic>
+          </wp:inline>
+        </w:drawing>
+      </w:r>
+    </w:p>
+    <w:p>
+      <w:pPr>
+        <w:spacing w:after="160" w:before="40"/>
+        <w:jc w:val="center"/>
+      </w:pPr>
+      <w:r>
+        <w:rPr>
+          <w:rFonts w:ascii="Times New Roman" w:cs="Times New Roman" w:eastAsia="Times New Roman" w:hAnsi="Times New Roman"/>
           <w:i/>
           <w:iCs/>
-          <w:color w:val="888888"/>
+          <w:sz w:val="18"/>
+          <w:szCs w:val="18"/>
+        </w:rPr>
+        <w:t xml:space="preserve">Şekil 9 – Genre tablosu (1-14. kayıtlar)</w:t>
+      </w:r>
+    </w:p>
+    <w:p>
+      <w:pPr>
+        <w:spacing w:after="40" w:before="100"/>
+        <w:jc w:val="center"/>
+      </w:pPr>
+      <w:r>
+        <w:drawing>
+          <wp:inline distT="0" distB="0" distL="0" distR="0">
+            <wp:extent cx="3619500" cy="3238500"/>
+            <wp:effectExtent t="0" r="0" b="0" l="0"/>
+            <wp:docPr id="1" name="Genre tablosu 2" descr="Genre tablosu 2" title="Genre tablosu 2"/>
+            <wp:cNvGraphicFramePr>
+              <a:graphicFrameLocks xmlns:a="http://schemas.openxmlformats.org/drawingml/2006/main" noChangeAspect="1"/>
+            </wp:cNvGraphicFramePr>
+            <a:graphic xmlns:a="http://schemas.openxmlformats.org/drawingml/2006/main">
+              <a:graphicData uri="http://schemas.openxmlformats.org/drawingml/2006/picture">
+                <pic:pic xmlns:pic="http://schemas.openxmlformats.org/drawingml/2006/picture">
+                  <pic:nvPicPr>
+                    <pic:cNvPr id="0" name="" descr=""/>
+                    <pic:cNvPicPr>
+                      <a:picLocks noChangeAspect="1" noChangeArrowheads="1"/>
+                    </pic:cNvPicPr>
+                  </pic:nvPicPr>
+                  <pic:blipFill>
+                    <a:blip r:embed="rId18" cstate="none"/>
+                    <a:srcRect/>
+                    <a:stretch>
+                      <a:fillRect/>
+                    </a:stretch>
+                  </pic:blipFill>
+                  <pic:spPr bwMode="auto">
+                    <a:xfrm>
+                      <a:off x="0" y="0"/>
+                      <a:ext cx="3619500" cy="3238500"/>
+                    </a:xfrm>
+                    <a:prstGeom prst="rect">
+                      <a:avLst/>
+                    </a:prstGeom>
+                  </pic:spPr>
+                </pic:pic>
+              </a:graphicData>
+            </a:graphic>
+          </wp:inline>
+        </w:drawing>
+      </w:r>
+    </w:p>
+    <w:p>
+      <w:pPr>
+        <w:spacing w:after="160" w:before="40"/>
+        <w:jc w:val="center"/>
+      </w:pPr>
+      <w:r>
+        <w:rPr>
+          <w:rFonts w:ascii="Times New Roman" w:cs="Times New Roman" w:eastAsia="Times New Roman" w:hAnsi="Times New Roman"/>
+          <w:i/>
+          <w:iCs/>
+          <w:sz w:val="18"/>
+          <w:szCs w:val="18"/>
+        </w:rPr>
+        <w:t xml:space="preserve">Şekil 10 – Genre tablosu: GenreId 26 Jazz Fusion ve 27 Ambient eklendi (toplam 27 kayıt)</w:t>
+      </w:r>
+    </w:p>
+    <w:p>
+      <w:pPr>
+        <w:pStyle w:val="Heading2"/>
+        <w:spacing w:after="80" w:before="200"/>
+      </w:pPr>
+      <w:r>
+        <w:rPr>
+          <w:rFonts w:ascii="Times New Roman" w:cs="Times New Roman" w:eastAsia="Times New Roman" w:hAnsi="Times New Roman"/>
+          <w:b/>
+          <w:bCs/>
+          <w:sz w:val="24"/>
+          <w:szCs w:val="24"/>
+        </w:rPr>
+        <w:t xml:space="preserve">4.2 Diferansiyel Yedek Alma</w:t>
+      </w:r>
+    </w:p>
+    <w:p>
+      <w:pPr>
+        <w:spacing w:after="80" w:before="80"/>
+        <w:jc w:val="both"/>
+      </w:pPr>
+      <w:r>
+        <w:rPr>
+          <w:rFonts w:ascii="Times New Roman" w:cs="Times New Roman" w:eastAsia="Times New Roman" w:hAnsi="Times New Roman"/>
           <w:sz w:val="22"/>
           <w:szCs w:val="22"/>
         </w:rPr>
-        <w:t xml:space="preserve">Bu bölüm doldurulacaktır.</w:t>
-      </w:r>
+        <w:t xml:space="preserve">WITH DIFFERENTIAL parametresi kullanılarak son tam yedekten bu yana değişen veriler Chinook_Diff.bak dosyasına yedeklenmiştir.</w:t>
+      </w:r>
+    </w:p>
+    <w:p>
+      <w:pPr>
+        <w:shd w:fill="F2F2F2" w:val="clear"/>
+        <w:spacing w:after="0" w:before="0"/>
+      </w:pPr>
+      <w:r>
+        <w:rPr>
+          <w:rFonts w:ascii="Courier New" w:cs="Courier New" w:eastAsia="Courier New" w:hAnsi="Courier New"/>
+          <w:sz w:val="18"/>
+          <w:szCs w:val="18"/>
+        </w:rPr>
+        <w:t xml:space="preserve">USE master;</w:t>
+      </w:r>
+    </w:p>
+    <w:p>
+      <w:pPr>
+        <w:shd w:fill="F2F2F2" w:val="clear"/>
+        <w:spacing w:after="0" w:before="0"/>
+      </w:pPr>
+      <w:r>
+        <w:rPr>
+          <w:rFonts w:ascii="Courier New" w:cs="Courier New" w:eastAsia="Courier New" w:hAnsi="Courier New"/>
+          <w:sz w:val="18"/>
+          <w:szCs w:val="18"/>
+        </w:rPr>
+        <w:t xml:space="preserve"/>
+      </w:r>
+    </w:p>
+    <w:p>
+      <w:pPr>
+        <w:shd w:fill="F2F2F2" w:val="clear"/>
+        <w:spacing w:after="0" w:before="0"/>
+      </w:pPr>
+      <w:r>
+        <w:rPr>
+          <w:rFonts w:ascii="Courier New" w:cs="Courier New" w:eastAsia="Courier New" w:hAnsi="Courier New"/>
+          <w:sz w:val="18"/>
+          <w:szCs w:val="18"/>
+        </w:rPr>
+        <w:t xml:space="preserve">BACKUP DATABASE Chinook</w:t>
+      </w:r>
+    </w:p>
+    <w:p>
+      <w:pPr>
+        <w:shd w:fill="F2F2F2" w:val="clear"/>
+        <w:spacing w:after="0" w:before="0"/>
+      </w:pPr>
+      <w:r>
+        <w:rPr>
+          <w:rFonts w:ascii="Courier New" w:cs="Courier New" w:eastAsia="Courier New" w:hAnsi="Courier New"/>
+          <w:sz w:val="18"/>
+          <w:szCs w:val="18"/>
+        </w:rPr>
+        <w:t xml:space="preserve">TO DISK = 'C:\Backup\Chinook_Diff.bak'</w:t>
+      </w:r>
+    </w:p>
+    <w:p>
+      <w:pPr>
+        <w:shd w:fill="F2F2F2" w:val="clear"/>
+        <w:spacing w:after="0" w:before="0"/>
+      </w:pPr>
+      <w:r>
+        <w:rPr>
+          <w:rFonts w:ascii="Courier New" w:cs="Courier New" w:eastAsia="Courier New" w:hAnsi="Courier New"/>
+          <w:sz w:val="18"/>
+          <w:szCs w:val="18"/>
+        </w:rPr>
+        <w:t xml:space="preserve">WITH DIFFERENTIAL,</w:t>
+      </w:r>
+    </w:p>
+    <w:p>
+      <w:pPr>
+        <w:shd w:fill="F2F2F2" w:val="clear"/>
+        <w:spacing w:after="0" w:before="0"/>
+      </w:pPr>
+      <w:r>
+        <w:rPr>
+          <w:rFonts w:ascii="Courier New" w:cs="Courier New" w:eastAsia="Courier New" w:hAnsi="Courier New"/>
+          <w:sz w:val="18"/>
+          <w:szCs w:val="18"/>
+        </w:rPr>
+        <w:t xml:space="preserve">     NAME = 'Chinook Diferansiyel Yedek',</w:t>
+      </w:r>
+    </w:p>
+    <w:p>
+      <w:pPr>
+        <w:shd w:fill="F2F2F2" w:val="clear"/>
+        <w:spacing w:after="0" w:before="0"/>
+      </w:pPr>
+      <w:r>
+        <w:rPr>
+          <w:rFonts w:ascii="Courier New" w:cs="Courier New" w:eastAsia="Courier New" w:hAnsi="Courier New"/>
+          <w:sz w:val="18"/>
+          <w:szCs w:val="18"/>
+        </w:rPr>
+        <w:t xml:space="preserve">     DESCRIPTION = 'Chinook veritabani diferansiyel yedekleme';</w:t>
+      </w:r>
+    </w:p>
+    <w:p>
+      <w:pPr>
+        <w:spacing w:after="100" w:before="100"/>
+      </w:pPr>
+    </w:p>
+    <w:p>
+      <w:pPr>
+        <w:spacing w:after="40" w:before="100"/>
+        <w:jc w:val="center"/>
+      </w:pPr>
+      <w:r>
+        <w:drawing>
+          <wp:inline distT="0" distB="0" distL="0" distR="0">
+            <wp:extent cx="5143500" cy="2286000"/>
+            <wp:effectExtent t="0" r="0" b="0" l="0"/>
+            <wp:docPr id="1" name="Diferansiyel yedek" descr="Diferansiyel yedek" title="Diferansiyel yedek"/>
+            <wp:cNvGraphicFramePr>
+              <a:graphicFrameLocks xmlns:a="http://schemas.openxmlformats.org/drawingml/2006/main" noChangeAspect="1"/>
+            </wp:cNvGraphicFramePr>
+            <a:graphic xmlns:a="http://schemas.openxmlformats.org/drawingml/2006/main">
+              <a:graphicData uri="http://schemas.openxmlformats.org/drawingml/2006/picture">
+                <pic:pic xmlns:pic="http://schemas.openxmlformats.org/drawingml/2006/picture">
+                  <pic:nvPicPr>
+                    <pic:cNvPr id="0" name="" descr=""/>
+                    <pic:cNvPicPr>
+                      <a:picLocks noChangeAspect="1" noChangeArrowheads="1"/>
+                    </pic:cNvPicPr>
+                  </pic:nvPicPr>
+                  <pic:blipFill>
+                    <a:blip r:embed="rId19" cstate="none"/>
+                    <a:srcRect/>
+                    <a:stretch>
+                      <a:fillRect/>
+                    </a:stretch>
+                  </pic:blipFill>
+                  <pic:spPr bwMode="auto">
+                    <a:xfrm>
+                      <a:off x="0" y="0"/>
+                      <a:ext cx="5143500" cy="2286000"/>
+                    </a:xfrm>
+                    <a:prstGeom prst="rect">
+                      <a:avLst/>
+                    </a:prstGeom>
+                  </pic:spPr>
+                </pic:pic>
+              </a:graphicData>
+            </a:graphic>
+          </wp:inline>
+        </w:drawing>
+      </w:r>
+    </w:p>
+    <w:p>
+      <w:pPr>
+        <w:spacing w:after="160" w:before="40"/>
+        <w:jc w:val="center"/>
+      </w:pPr>
+      <w:r>
+        <w:rPr>
+          <w:rFonts w:ascii="Times New Roman" w:cs="Times New Roman" w:eastAsia="Times New Roman" w:hAnsi="Times New Roman"/>
+          <w:i/>
+          <w:iCs/>
+          <w:sz w:val="18"/>
+          <w:szCs w:val="18"/>
+        </w:rPr>
+        <w:t xml:space="preserve">Şekil 11 – Diferansiyel yedek: 90 sayfa, 0.007 saniyede işlendi (99.888 MB/sn)</w:t>
+      </w:r>
+    </w:p>
+    <w:p>
+      <w:pPr>
+        <w:spacing w:after="80" w:before="80"/>
+        <w:jc w:val="both"/>
+      </w:pPr>
+      <w:r>
+        <w:rPr>
+          <w:rFonts w:ascii="Times New Roman" w:cs="Times New Roman" w:eastAsia="Times New Roman" w:hAnsi="Times New Roman"/>
+          <w:sz w:val="22"/>
+          <w:szCs w:val="22"/>
+        </w:rPr>
+        <w:t xml:space="preserve">Karşılaştırma: Tam yedek 762 sayfa iken diferansiyel yedek yalnızca 90 sayfadır. Sadece değişen veriler yedeklendiğinden çok daha hızlı ve küçüktür.</w:t>
+      </w:r>
+    </w:p>
+    <w:p>
+      <w:pPr>
+        <w:spacing w:after="100" w:before="100"/>
+      </w:pPr>
+    </w:p>
+    <w:p>
+      <w:pPr>
+        <w:pStyle w:val="Heading2"/>
+        <w:spacing w:after="80" w:before="200"/>
+      </w:pPr>
+      <w:r>
+        <w:rPr>
+          <w:rFonts w:ascii="Times New Roman" w:cs="Times New Roman" w:eastAsia="Times New Roman" w:hAnsi="Times New Roman"/>
+          <w:b/>
+          <w:bCs/>
+          <w:sz w:val="24"/>
+          <w:szCs w:val="24"/>
+        </w:rPr>
+        <w:t xml:space="preserve">4.3 Yedek Geçmişi</w:t>
+      </w:r>
+    </w:p>
+    <w:p>
+      <w:pPr>
+        <w:spacing w:after="80" w:before="80"/>
+        <w:jc w:val="both"/>
+      </w:pPr>
+      <w:r>
+        <w:rPr>
+          <w:rFonts w:ascii="Times New Roman" w:cs="Times New Roman" w:eastAsia="Times New Roman" w:hAnsi="Times New Roman"/>
+          <w:sz w:val="22"/>
+          <w:szCs w:val="22"/>
+        </w:rPr>
+        <w:t xml:space="preserve">msdb.dbo.backupset görünümü ile alınan tüm yedeklerin geçmişi listelenmiştir.</w:t>
+      </w:r>
+    </w:p>
+    <w:p>
+      <w:pPr>
+        <w:shd w:fill="F2F2F2" w:val="clear"/>
+        <w:spacing w:after="0" w:before="0"/>
+      </w:pPr>
+      <w:r>
+        <w:rPr>
+          <w:rFonts w:ascii="Courier New" w:cs="Courier New" w:eastAsia="Courier New" w:hAnsi="Courier New"/>
+          <w:sz w:val="18"/>
+          <w:szCs w:val="18"/>
+        </w:rPr>
+        <w:t xml:space="preserve">SELECT bs.database_name, bs.backup_start_date,</w:t>
+      </w:r>
+    </w:p>
+    <w:p>
+      <w:pPr>
+        <w:shd w:fill="F2F2F2" w:val="clear"/>
+        <w:spacing w:after="0" w:before="0"/>
+      </w:pPr>
+      <w:r>
+        <w:rPr>
+          <w:rFonts w:ascii="Courier New" w:cs="Courier New" w:eastAsia="Courier New" w:hAnsi="Courier New"/>
+          <w:sz w:val="18"/>
+          <w:szCs w:val="18"/>
+        </w:rPr>
+        <w:t xml:space="preserve">    bs.type AS YedekTuru,</w:t>
+      </w:r>
+    </w:p>
+    <w:p>
+      <w:pPr>
+        <w:shd w:fill="F2F2F2" w:val="clear"/>
+        <w:spacing w:after="0" w:before="0"/>
+      </w:pPr>
+      <w:r>
+        <w:rPr>
+          <w:rFonts w:ascii="Courier New" w:cs="Courier New" w:eastAsia="Courier New" w:hAnsi="Courier New"/>
+          <w:sz w:val="18"/>
+          <w:szCs w:val="18"/>
+        </w:rPr>
+        <w:t xml:space="preserve">    CAST(bs.backup_size/1024.0/1024.0 AS DECIMAL(10,2)) AS BoyutMB,</w:t>
+      </w:r>
+    </w:p>
+    <w:p>
+      <w:pPr>
+        <w:shd w:fill="F2F2F2" w:val="clear"/>
+        <w:spacing w:after="0" w:before="0"/>
+      </w:pPr>
+      <w:r>
+        <w:rPr>
+          <w:rFonts w:ascii="Courier New" w:cs="Courier New" w:eastAsia="Courier New" w:hAnsi="Courier New"/>
+          <w:sz w:val="18"/>
+          <w:szCs w:val="18"/>
+        </w:rPr>
+        <w:t xml:space="preserve">    bmf.physical_device_name AS DosyaYolu</w:t>
+      </w:r>
+    </w:p>
+    <w:p>
+      <w:pPr>
+        <w:shd w:fill="F2F2F2" w:val="clear"/>
+        <w:spacing w:after="0" w:before="0"/>
+      </w:pPr>
+      <w:r>
+        <w:rPr>
+          <w:rFonts w:ascii="Courier New" w:cs="Courier New" w:eastAsia="Courier New" w:hAnsi="Courier New"/>
+          <w:sz w:val="18"/>
+          <w:szCs w:val="18"/>
+        </w:rPr>
+        <w:t xml:space="preserve">FROM msdb.dbo.backupset bs</w:t>
+      </w:r>
+    </w:p>
+    <w:p>
+      <w:pPr>
+        <w:shd w:fill="F2F2F2" w:val="clear"/>
+        <w:spacing w:after="0" w:before="0"/>
+      </w:pPr>
+      <w:r>
+        <w:rPr>
+          <w:rFonts w:ascii="Courier New" w:cs="Courier New" w:eastAsia="Courier New" w:hAnsi="Courier New"/>
+          <w:sz w:val="18"/>
+          <w:szCs w:val="18"/>
+        </w:rPr>
+        <w:t xml:space="preserve">JOIN msdb.dbo.backupmediafamily bmf</w:t>
+      </w:r>
+    </w:p>
+    <w:p>
+      <w:pPr>
+        <w:shd w:fill="F2F2F2" w:val="clear"/>
+        <w:spacing w:after="0" w:before="0"/>
+      </w:pPr>
+      <w:r>
+        <w:rPr>
+          <w:rFonts w:ascii="Courier New" w:cs="Courier New" w:eastAsia="Courier New" w:hAnsi="Courier New"/>
+          <w:sz w:val="18"/>
+          <w:szCs w:val="18"/>
+        </w:rPr>
+        <w:t xml:space="preserve">    ON bs.media_set_id = bmf.media_set_id</w:t>
+      </w:r>
+    </w:p>
+    <w:p>
+      <w:pPr>
+        <w:shd w:fill="F2F2F2" w:val="clear"/>
+        <w:spacing w:after="0" w:before="0"/>
+      </w:pPr>
+      <w:r>
+        <w:rPr>
+          <w:rFonts w:ascii="Courier New" w:cs="Courier New" w:eastAsia="Courier New" w:hAnsi="Courier New"/>
+          <w:sz w:val="18"/>
+          <w:szCs w:val="18"/>
+        </w:rPr>
+        <w:t xml:space="preserve">WHERE bs.database_name = 'Chinook'</w:t>
+      </w:r>
+    </w:p>
+    <w:p>
+      <w:pPr>
+        <w:shd w:fill="F2F2F2" w:val="clear"/>
+        <w:spacing w:after="0" w:before="0"/>
+      </w:pPr>
+      <w:r>
+        <w:rPr>
+          <w:rFonts w:ascii="Courier New" w:cs="Courier New" w:eastAsia="Courier New" w:hAnsi="Courier New"/>
+          <w:sz w:val="18"/>
+          <w:szCs w:val="18"/>
+        </w:rPr>
+        <w:t xml:space="preserve">ORDER BY bs.backup_start_date DESC;</w:t>
+      </w:r>
+    </w:p>
+    <w:p>
+      <w:pPr>
+        <w:spacing w:after="100" w:before="100"/>
+      </w:pPr>
+    </w:p>
+    <w:p>
+      <w:pPr>
+        <w:spacing w:after="40" w:before="100"/>
+        <w:jc w:val="center"/>
+      </w:pPr>
+      <w:r>
+        <w:drawing>
+          <wp:inline distT="0" distB="0" distL="0" distR="0">
+            <wp:extent cx="5334000" cy="1714500"/>
+            <wp:effectExtent t="0" r="0" b="0" l="0"/>
+            <wp:docPr id="1" name="Yedek geçmişi" descr="Yedek geçmişi" title="Yedek geçmişi"/>
+            <wp:cNvGraphicFramePr>
+              <a:graphicFrameLocks xmlns:a="http://schemas.openxmlformats.org/drawingml/2006/main" noChangeAspect="1"/>
+            </wp:cNvGraphicFramePr>
+            <a:graphic xmlns:a="http://schemas.openxmlformats.org/drawingml/2006/main">
+              <a:graphicData uri="http://schemas.openxmlformats.org/drawingml/2006/picture">
+                <pic:pic xmlns:pic="http://schemas.openxmlformats.org/drawingml/2006/picture">
+                  <pic:nvPicPr>
+                    <pic:cNvPr id="0" name="" descr=""/>
+                    <pic:cNvPicPr>
+                      <a:picLocks noChangeAspect="1" noChangeArrowheads="1"/>
+                    </pic:cNvPicPr>
+                  </pic:nvPicPr>
+                  <pic:blipFill>
+                    <a:blip r:embed="rId20" cstate="none"/>
+                    <a:srcRect/>
+                    <a:stretch>
+                      <a:fillRect/>
+                    </a:stretch>
+                  </pic:blipFill>
+                  <pic:spPr bwMode="auto">
+                    <a:xfrm>
+                      <a:off x="0" y="0"/>
+                      <a:ext cx="5334000" cy="1714500"/>
+                    </a:xfrm>
+                    <a:prstGeom prst="rect">
+                      <a:avLst/>
+                    </a:prstGeom>
+                  </pic:spPr>
+                </pic:pic>
+              </a:graphicData>
+            </a:graphic>
+          </wp:inline>
+        </w:drawing>
+      </w:r>
+    </w:p>
+    <w:p>
+      <w:pPr>
+        <w:spacing w:after="160" w:before="40"/>
+        <w:jc w:val="center"/>
+      </w:pPr>
+      <w:r>
+        <w:rPr>
+          <w:rFonts w:ascii="Times New Roman" w:cs="Times New Roman" w:eastAsia="Times New Roman" w:hAnsi="Times New Roman"/>
+          <w:i/>
+          <w:iCs/>
+          <w:sz w:val="18"/>
+          <w:szCs w:val="18"/>
+        </w:rPr>
+        <w:t xml:space="preserve">Şekil 12 – Yedek geçmişi: D=Tam yedek (6.03 MB), I=Diferansiyel yedek (0.78 MB)</w:t>
+      </w:r>
+    </w:p>
+    <w:p>
+      <w:pPr>
+        <w:spacing w:after="100" w:before="100"/>
+      </w:pPr>
     </w:p>
     <w:p>
       <w:pPr>

</xml_diff>

<commit_message>
Proje2 Adim4: Geri yukleme - Chinook_Full.bak Chinook_Restored olarak geri yuklendi, Bolum 5 ve 6 tamamlandi
</commit_message>
<xml_diff>
--- a/Proje2-YedeklemeveKurtarma/Proje2_Rapor.docx
+++ b/Proje2-YedeklemeveKurtarma/Proje2_Rapor.docx
@@ -2357,14 +2357,507 @@
       <w:r>
         <w:rPr>
           <w:rFonts w:ascii="Times New Roman" w:cs="Times New Roman" w:eastAsia="Times New Roman" w:hAnsi="Times New Roman"/>
+          <w:sz w:val="22"/>
+          <w:szCs w:val="22"/>
+        </w:rPr>
+        <w:t xml:space="preserve">Geri yükleme, bir yedek dosyasından veritabanının belirli bir andaki durumunu yeniden oluşturma işlemidir. Bu bölümde tam yedek (Chinook_Full.bak) farklı bir veritabanı adıyla (Chinook_Restored) geri yüklenmiş ve sonuç doğrulanmıştır.</w:t>
+      </w:r>
+    </w:p>
+    <w:p>
+      <w:pPr>
+        <w:spacing w:after="100" w:before="100"/>
+      </w:pPr>
+    </w:p>
+    <w:p>
+      <w:pPr>
+        <w:pStyle w:val="Heading2"/>
+        <w:spacing w:after="80" w:before="200"/>
+      </w:pPr>
+      <w:r>
+        <w:rPr>
+          <w:rFonts w:ascii="Times New Roman" w:cs="Times New Roman" w:eastAsia="Times New Roman" w:hAnsi="Times New Roman"/>
+          <w:b/>
+          <w:bCs/>
+          <w:sz w:val="24"/>
+          <w:szCs w:val="24"/>
+        </w:rPr>
+        <w:t xml:space="preserve">5.1 Tam Yedeği Geri Yükleme</w:t>
+      </w:r>
+    </w:p>
+    <w:p>
+      <w:pPr>
+        <w:spacing w:after="80" w:before="80"/>
+        <w:jc w:val="both"/>
+      </w:pPr>
+      <w:r>
+        <w:rPr>
+          <w:rFonts w:ascii="Times New Roman" w:cs="Times New Roman" w:eastAsia="Times New Roman" w:hAnsi="Times New Roman"/>
+          <w:sz w:val="22"/>
+          <w:szCs w:val="22"/>
+        </w:rPr>
+        <w:t xml:space="preserve">RESTORE DATABASE komutu ile Chinook_Full.bak dosyası Chinook_Restored adlı yeni bir veritabanına geri yüklenmiştir. WITH MOVE parametresi dosyaların konumunu belirtmek için kullanılmıştır.</w:t>
+      </w:r>
+    </w:p>
+    <w:p>
+      <w:pPr>
+        <w:shd w:fill="F2F2F2" w:val="clear"/>
+        <w:spacing w:after="0" w:before="0"/>
+      </w:pPr>
+      <w:r>
+        <w:rPr>
+          <w:rFonts w:ascii="Courier New" w:cs="Courier New" w:eastAsia="Courier New" w:hAnsi="Courier New"/>
+          <w:sz w:val="18"/>
+          <w:szCs w:val="18"/>
+        </w:rPr>
+        <w:t xml:space="preserve">USE master;</w:t>
+      </w:r>
+    </w:p>
+    <w:p>
+      <w:pPr>
+        <w:shd w:fill="F2F2F2" w:val="clear"/>
+        <w:spacing w:after="0" w:before="0"/>
+      </w:pPr>
+      <w:r>
+        <w:rPr>
+          <w:rFonts w:ascii="Courier New" w:cs="Courier New" w:eastAsia="Courier New" w:hAnsi="Courier New"/>
+          <w:sz w:val="18"/>
+          <w:szCs w:val="18"/>
+        </w:rPr>
+        <w:t xml:space="preserve"/>
+      </w:r>
+    </w:p>
+    <w:p>
+      <w:pPr>
+        <w:shd w:fill="F2F2F2" w:val="clear"/>
+        <w:spacing w:after="0" w:before="0"/>
+      </w:pPr>
+      <w:r>
+        <w:rPr>
+          <w:rFonts w:ascii="Courier New" w:cs="Courier New" w:eastAsia="Courier New" w:hAnsi="Courier New"/>
+          <w:sz w:val="18"/>
+          <w:szCs w:val="18"/>
+        </w:rPr>
+        <w:t xml:space="preserve">RESTORE DATABASE Chinook_Restored</w:t>
+      </w:r>
+    </w:p>
+    <w:p>
+      <w:pPr>
+        <w:shd w:fill="F2F2F2" w:val="clear"/>
+        <w:spacing w:after="0" w:before="0"/>
+      </w:pPr>
+      <w:r>
+        <w:rPr>
+          <w:rFonts w:ascii="Courier New" w:cs="Courier New" w:eastAsia="Courier New" w:hAnsi="Courier New"/>
+          <w:sz w:val="18"/>
+          <w:szCs w:val="18"/>
+        </w:rPr>
+        <w:t xml:space="preserve">FROM DISK = 'C:\Backup\Chinook_Full.bak'</w:t>
+      </w:r>
+    </w:p>
+    <w:p>
+      <w:pPr>
+        <w:shd w:fill="F2F2F2" w:val="clear"/>
+        <w:spacing w:after="0" w:before="0"/>
+      </w:pPr>
+      <w:r>
+        <w:rPr>
+          <w:rFonts w:ascii="Courier New" w:cs="Courier New" w:eastAsia="Courier New" w:hAnsi="Courier New"/>
+          <w:sz w:val="18"/>
+          <w:szCs w:val="18"/>
+        </w:rPr>
+        <w:t xml:space="preserve">WITH MOVE 'Chinook' TO 'C:\Backup\Chinook_Restored.mdf',</w:t>
+      </w:r>
+    </w:p>
+    <w:p>
+      <w:pPr>
+        <w:shd w:fill="F2F2F2" w:val="clear"/>
+        <w:spacing w:after="0" w:before="0"/>
+      </w:pPr>
+      <w:r>
+        <w:rPr>
+          <w:rFonts w:ascii="Courier New" w:cs="Courier New" w:eastAsia="Courier New" w:hAnsi="Courier New"/>
+          <w:sz w:val="18"/>
+          <w:szCs w:val="18"/>
+        </w:rPr>
+        <w:t xml:space="preserve">     MOVE 'Chinook_log' TO 'C:\Backup\Chinook_Restored_log.ldf',</w:t>
+      </w:r>
+    </w:p>
+    <w:p>
+      <w:pPr>
+        <w:shd w:fill="F2F2F2" w:val="clear"/>
+        <w:spacing w:after="0" w:before="0"/>
+      </w:pPr>
+      <w:r>
+        <w:rPr>
+          <w:rFonts w:ascii="Courier New" w:cs="Courier New" w:eastAsia="Courier New" w:hAnsi="Courier New"/>
+          <w:sz w:val="18"/>
+          <w:szCs w:val="18"/>
+        </w:rPr>
+        <w:t xml:space="preserve">     REPLACE;</w:t>
+      </w:r>
+    </w:p>
+    <w:p>
+      <w:pPr>
+        <w:spacing w:after="100" w:before="100"/>
+      </w:pPr>
+    </w:p>
+    <w:p>
+      <w:pPr>
+        <w:spacing w:after="40" w:before="100"/>
+        <w:jc w:val="center"/>
+      </w:pPr>
+      <w:r>
+        <w:drawing>
+          <wp:inline distT="0" distB="0" distL="0" distR="0">
+            <wp:extent cx="5143500" cy="2286000"/>
+            <wp:effectExtent t="0" r="0" b="0" l="0"/>
+            <wp:docPr id="1" name="Geri yükleme" descr="Geri yükleme" title="Geri yükleme"/>
+            <wp:cNvGraphicFramePr>
+              <a:graphicFrameLocks xmlns:a="http://schemas.openxmlformats.org/drawingml/2006/main" noChangeAspect="1"/>
+            </wp:cNvGraphicFramePr>
+            <a:graphic xmlns:a="http://schemas.openxmlformats.org/drawingml/2006/main">
+              <a:graphicData uri="http://schemas.openxmlformats.org/drawingml/2006/picture">
+                <pic:pic xmlns:pic="http://schemas.openxmlformats.org/drawingml/2006/picture">
+                  <pic:nvPicPr>
+                    <pic:cNvPr id="0" name="" descr=""/>
+                    <pic:cNvPicPr>
+                      <a:picLocks noChangeAspect="1" noChangeArrowheads="1"/>
+                    </pic:cNvPicPr>
+                  </pic:nvPicPr>
+                  <pic:blipFill>
+                    <a:blip r:embed="rId21" cstate="none"/>
+                    <a:srcRect/>
+                    <a:stretch>
+                      <a:fillRect/>
+                    </a:stretch>
+                  </pic:blipFill>
+                  <pic:spPr bwMode="auto">
+                    <a:xfrm>
+                      <a:off x="0" y="0"/>
+                      <a:ext cx="5143500" cy="2286000"/>
+                    </a:xfrm>
+                    <a:prstGeom prst="rect">
+                      <a:avLst/>
+                    </a:prstGeom>
+                  </pic:spPr>
+                </pic:pic>
+              </a:graphicData>
+            </a:graphic>
+          </wp:inline>
+        </w:drawing>
+      </w:r>
+    </w:p>
+    <w:p>
+      <w:pPr>
+        <w:spacing w:after="160" w:before="40"/>
+        <w:jc w:val="center"/>
+      </w:pPr>
+      <w:r>
+        <w:rPr>
+          <w:rFonts w:ascii="Times New Roman" w:cs="Times New Roman" w:eastAsia="Times New Roman" w:hAnsi="Times New Roman"/>
           <w:i/>
           <w:iCs/>
-          <w:color w:val="888888"/>
+          <w:sz w:val="18"/>
+          <w:szCs w:val="18"/>
+        </w:rPr>
+        <w:t xml:space="preserve">Şekil 13 – Geri yükleme başarılı: 762 sayfa, 0.014 saniyede işlendi (424.944 MB/sn)</w:t>
+      </w:r>
+    </w:p>
+    <w:p>
+      <w:pPr>
+        <w:pStyle w:val="Heading2"/>
+        <w:spacing w:after="80" w:before="200"/>
+      </w:pPr>
+      <w:r>
+        <w:rPr>
+          <w:rFonts w:ascii="Times New Roman" w:cs="Times New Roman" w:eastAsia="Times New Roman" w:hAnsi="Times New Roman"/>
+          <w:b/>
+          <w:bCs/>
+          <w:sz w:val="24"/>
+          <w:szCs w:val="24"/>
+        </w:rPr>
+        <w:t xml:space="preserve">5.2 Geri Yüklemenin Doğrulanması</w:t>
+      </w:r>
+    </w:p>
+    <w:p>
+      <w:pPr>
+        <w:spacing w:after="80" w:before="80"/>
+        <w:jc w:val="both"/>
+      </w:pPr>
+      <w:r>
+        <w:rPr>
+          <w:rFonts w:ascii="Times New Roman" w:cs="Times New Roman" w:eastAsia="Times New Roman" w:hAnsi="Times New Roman"/>
           <w:sz w:val="22"/>
           <w:szCs w:val="22"/>
         </w:rPr>
-        <w:t xml:space="preserve">Bu bölüm doldurulacaktır.</w:t>
-      </w:r>
+        <w:t xml:space="preserve">Chinook_Restored veritabanındaki Genre tablosu sorgulanarak geri yüklemenin doğruluğu kontrol edilmiştir.</w:t>
+      </w:r>
+    </w:p>
+    <w:p>
+      <w:pPr>
+        <w:shd w:fill="F2F2F2" w:val="clear"/>
+        <w:spacing w:after="0" w:before="0"/>
+      </w:pPr>
+      <w:r>
+        <w:rPr>
+          <w:rFonts w:ascii="Courier New" w:cs="Courier New" w:eastAsia="Courier New" w:hAnsi="Courier New"/>
+          <w:sz w:val="18"/>
+          <w:szCs w:val="18"/>
+        </w:rPr>
+        <w:t xml:space="preserve">USE Chinook_Restored;</w:t>
+      </w:r>
+    </w:p>
+    <w:p>
+      <w:pPr>
+        <w:shd w:fill="F2F2F2" w:val="clear"/>
+        <w:spacing w:after="0" w:before="0"/>
+      </w:pPr>
+      <w:r>
+        <w:rPr>
+          <w:rFonts w:ascii="Courier New" w:cs="Courier New" w:eastAsia="Courier New" w:hAnsi="Courier New"/>
+          <w:sz w:val="18"/>
+          <w:szCs w:val="18"/>
+        </w:rPr>
+        <w:t xml:space="preserve"/>
+      </w:r>
+    </w:p>
+    <w:p>
+      <w:pPr>
+        <w:shd w:fill="F2F2F2" w:val="clear"/>
+        <w:spacing w:after="0" w:before="0"/>
+      </w:pPr>
+      <w:r>
+        <w:rPr>
+          <w:rFonts w:ascii="Courier New" w:cs="Courier New" w:eastAsia="Courier New" w:hAnsi="Courier New"/>
+          <w:sz w:val="18"/>
+          <w:szCs w:val="18"/>
+        </w:rPr>
+        <w:t xml:space="preserve">SELECT COUNT(*) AS GenreSayisi FROM Genre;</w:t>
+      </w:r>
+    </w:p>
+    <w:p>
+      <w:pPr>
+        <w:shd w:fill="F2F2F2" w:val="clear"/>
+        <w:spacing w:after="0" w:before="0"/>
+      </w:pPr>
+      <w:r>
+        <w:rPr>
+          <w:rFonts w:ascii="Courier New" w:cs="Courier New" w:eastAsia="Courier New" w:hAnsi="Courier New"/>
+          <w:sz w:val="18"/>
+          <w:szCs w:val="18"/>
+        </w:rPr>
+        <w:t xml:space="preserve">SELECT * FROM Genre ORDER BY GenreId DESC;</w:t>
+      </w:r>
+    </w:p>
+    <w:p>
+      <w:pPr>
+        <w:spacing w:after="100" w:before="100"/>
+      </w:pPr>
+    </w:p>
+    <w:p>
+      <w:pPr>
+        <w:spacing w:after="40" w:before="100"/>
+        <w:jc w:val="center"/>
+      </w:pPr>
+      <w:r>
+        <w:drawing>
+          <wp:inline distT="0" distB="0" distL="0" distR="0">
+            <wp:extent cx="3619500" cy="3619500"/>
+            <wp:effectExtent t="0" r="0" b="0" l="0"/>
+            <wp:docPr id="1" name="Doğrulama 1" descr="Doğrulama 1" title="Doğrulama 1"/>
+            <wp:cNvGraphicFramePr>
+              <a:graphicFrameLocks xmlns:a="http://schemas.openxmlformats.org/drawingml/2006/main" noChangeAspect="1"/>
+            </wp:cNvGraphicFramePr>
+            <a:graphic xmlns:a="http://schemas.openxmlformats.org/drawingml/2006/main">
+              <a:graphicData uri="http://schemas.openxmlformats.org/drawingml/2006/picture">
+                <pic:pic xmlns:pic="http://schemas.openxmlformats.org/drawingml/2006/picture">
+                  <pic:nvPicPr>
+                    <pic:cNvPr id="0" name="" descr=""/>
+                    <pic:cNvPicPr>
+                      <a:picLocks noChangeAspect="1" noChangeArrowheads="1"/>
+                    </pic:cNvPicPr>
+                  </pic:nvPicPr>
+                  <pic:blipFill>
+                    <a:blip r:embed="rId22" cstate="none"/>
+                    <a:srcRect/>
+                    <a:stretch>
+                      <a:fillRect/>
+                    </a:stretch>
+                  </pic:blipFill>
+                  <pic:spPr bwMode="auto">
+                    <a:xfrm>
+                      <a:off x="0" y="0"/>
+                      <a:ext cx="3619500" cy="3619500"/>
+                    </a:xfrm>
+                    <a:prstGeom prst="rect">
+                      <a:avLst/>
+                    </a:prstGeom>
+                  </pic:spPr>
+                </pic:pic>
+              </a:graphicData>
+            </a:graphic>
+          </wp:inline>
+        </w:drawing>
+      </w:r>
+    </w:p>
+    <w:p>
+      <w:pPr>
+        <w:spacing w:after="160" w:before="40"/>
+        <w:jc w:val="center"/>
+      </w:pPr>
+      <w:r>
+        <w:rPr>
+          <w:rFonts w:ascii="Times New Roman" w:cs="Times New Roman" w:eastAsia="Times New Roman" w:hAnsi="Times New Roman"/>
+          <w:i/>
+          <w:iCs/>
+          <w:sz w:val="18"/>
+          <w:szCs w:val="18"/>
+        </w:rPr>
+        <w:t xml:space="preserve">Şekil 14 – Genre sayısı = 25; en yüksek GenreId = 25 (Opera)</w:t>
+      </w:r>
+    </w:p>
+    <w:p>
+      <w:pPr>
+        <w:spacing w:after="40" w:before="100"/>
+        <w:jc w:val="center"/>
+      </w:pPr>
+      <w:r>
+        <w:drawing>
+          <wp:inline distT="0" distB="0" distL="0" distR="0">
+            <wp:extent cx="3619500" cy="3048000"/>
+            <wp:effectExtent t="0" r="0" b="0" l="0"/>
+            <wp:docPr id="1" name="Doğrulama 2" descr="Doğrulama 2" title="Doğrulama 2"/>
+            <wp:cNvGraphicFramePr>
+              <a:graphicFrameLocks xmlns:a="http://schemas.openxmlformats.org/drawingml/2006/main" noChangeAspect="1"/>
+            </wp:cNvGraphicFramePr>
+            <a:graphic xmlns:a="http://schemas.openxmlformats.org/drawingml/2006/main">
+              <a:graphicData uri="http://schemas.openxmlformats.org/drawingml/2006/picture">
+                <pic:pic xmlns:pic="http://schemas.openxmlformats.org/drawingml/2006/picture">
+                  <pic:nvPicPr>
+                    <pic:cNvPr id="0" name="" descr=""/>
+                    <pic:cNvPicPr>
+                      <a:picLocks noChangeAspect="1" noChangeArrowheads="1"/>
+                    </pic:cNvPicPr>
+                  </pic:nvPicPr>
+                  <pic:blipFill>
+                    <a:blip r:embed="rId23" cstate="none"/>
+                    <a:srcRect/>
+                    <a:stretch>
+                      <a:fillRect/>
+                    </a:stretch>
+                  </pic:blipFill>
+                  <pic:spPr bwMode="auto">
+                    <a:xfrm>
+                      <a:off x="0" y="0"/>
+                      <a:ext cx="3619500" cy="3048000"/>
+                    </a:xfrm>
+                    <a:prstGeom prst="rect">
+                      <a:avLst/>
+                    </a:prstGeom>
+                  </pic:spPr>
+                </pic:pic>
+              </a:graphicData>
+            </a:graphic>
+          </wp:inline>
+        </w:drawing>
+      </w:r>
+    </w:p>
+    <w:p>
+      <w:pPr>
+        <w:spacing w:after="160" w:before="40"/>
+        <w:jc w:val="center"/>
+      </w:pPr>
+      <w:r>
+        <w:rPr>
+          <w:rFonts w:ascii="Times New Roman" w:cs="Times New Roman" w:eastAsia="Times New Roman" w:hAnsi="Times New Roman"/>
+          <w:i/>
+          <w:iCs/>
+          <w:sz w:val="18"/>
+          <w:szCs w:val="18"/>
+        </w:rPr>
+        <w:t xml:space="preserve">Şekil 15 – Genre listesi devamı (GenreId 15–6)</w:t>
+      </w:r>
+    </w:p>
+    <w:p>
+      <w:pPr>
+        <w:spacing w:after="40" w:before="100"/>
+        <w:jc w:val="center"/>
+      </w:pPr>
+      <w:r>
+        <w:drawing>
+          <wp:inline distT="0" distB="0" distL="0" distR="0">
+            <wp:extent cx="3619500" cy="2667000"/>
+            <wp:effectExtent t="0" r="0" b="0" l="0"/>
+            <wp:docPr id="1" name="Doğrulama 3" descr="Doğrulama 3" title="Doğrulama 3"/>
+            <wp:cNvGraphicFramePr>
+              <a:graphicFrameLocks xmlns:a="http://schemas.openxmlformats.org/drawingml/2006/main" noChangeAspect="1"/>
+            </wp:cNvGraphicFramePr>
+            <a:graphic xmlns:a="http://schemas.openxmlformats.org/drawingml/2006/main">
+              <a:graphicData uri="http://schemas.openxmlformats.org/drawingml/2006/picture">
+                <pic:pic xmlns:pic="http://schemas.openxmlformats.org/drawingml/2006/picture">
+                  <pic:nvPicPr>
+                    <pic:cNvPr id="0" name="" descr=""/>
+                    <pic:cNvPicPr>
+                      <a:picLocks noChangeAspect="1" noChangeArrowheads="1"/>
+                    </pic:cNvPicPr>
+                  </pic:nvPicPr>
+                  <pic:blipFill>
+                    <a:blip r:embed="rId24" cstate="none"/>
+                    <a:srcRect/>
+                    <a:stretch>
+                      <a:fillRect/>
+                    </a:stretch>
+                  </pic:blipFill>
+                  <pic:spPr bwMode="auto">
+                    <a:xfrm>
+                      <a:off x="0" y="0"/>
+                      <a:ext cx="3619500" cy="2667000"/>
+                    </a:xfrm>
+                    <a:prstGeom prst="rect">
+                      <a:avLst/>
+                    </a:prstGeom>
+                  </pic:spPr>
+                </pic:pic>
+              </a:graphicData>
+            </a:graphic>
+          </wp:inline>
+        </w:drawing>
+      </w:r>
+    </w:p>
+    <w:p>
+      <w:pPr>
+        <w:spacing w:after="160" w:before="40"/>
+        <w:jc w:val="center"/>
+      </w:pPr>
+      <w:r>
+        <w:rPr>
+          <w:rFonts w:ascii="Times New Roman" w:cs="Times New Roman" w:eastAsia="Times New Roman" w:hAnsi="Times New Roman"/>
+          <w:i/>
+          <w:iCs/>
+          <w:sz w:val="18"/>
+          <w:szCs w:val="18"/>
+        </w:rPr>
+        <w:t xml:space="preserve">Şekil 16 – Genre listesi sonu: GenreId 1 Rock'a kadar tüm kayıtlar mevcut</w:t>
+      </w:r>
+    </w:p>
+    <w:p>
+      <w:pPr>
+        <w:spacing w:after="80" w:before="80"/>
+        <w:jc w:val="both"/>
+      </w:pPr>
+      <w:r>
+        <w:rPr>
+          <w:rFonts w:ascii="Times New Roman" w:cs="Times New Roman" w:eastAsia="Times New Roman" w:hAnsi="Times New Roman"/>
+          <w:sz w:val="22"/>
+          <w:szCs w:val="22"/>
+        </w:rPr>
+        <w:t xml:space="preserve">Önemli Gözlem: Chinook_Restored veritabanında Genre sayısı 25 olarak gelmiştir. Jazz Fusion (26) ve Ambient (27) kayıtları burada görünmemektedir. Bunun nedeni, tam yedeğin bu kayıtlar eklenmeden önce alınmış olmasıdır. Bu durum, yedeğin tam olarak alındığı andaki veri durumunu yansıttığını kanıtlamaktadır.</w:t>
+      </w:r>
+    </w:p>
+    <w:p>
+      <w:pPr>
+        <w:spacing w:after="100" w:before="100"/>
+      </w:pPr>
     </w:p>
     <w:p>
       <w:pPr>
@@ -2390,14 +2883,566 @@
       <w:r>
         <w:rPr>
           <w:rFonts w:ascii="Times New Roman" w:cs="Times New Roman" w:eastAsia="Times New Roman" w:hAnsi="Times New Roman"/>
-          <w:i/>
-          <w:iCs/>
-          <w:color w:val="888888"/>
           <w:sz w:val="22"/>
           <w:szCs w:val="22"/>
         </w:rPr>
-        <w:t xml:space="preserve">Bu bölüm doldurulacaktır.</w:t>
-      </w:r>
+        <w:t xml:space="preserve">Bu proje kapsamında Chinook veritabanı üzerinde kapsamlı bir yedekleme ve felaketten kurtarma çalışması gerçekleştirilmiştir. Üç farklı yedekleme yöntemi uygulanmış ve geri yükleme senaryosu test edilmiştir.</w:t>
+      </w:r>
+    </w:p>
+    <w:p>
+      <w:pPr>
+        <w:spacing w:after="100" w:before="100"/>
+      </w:pPr>
+    </w:p>
+    <w:p>
+      <w:pPr>
+        <w:spacing w:after="80" w:before="80"/>
+        <w:jc w:val="both"/>
+      </w:pPr>
+      <w:r>
+        <w:rPr>
+          <w:rFonts w:ascii="Times New Roman" w:cs="Times New Roman" w:eastAsia="Times New Roman" w:hAnsi="Times New Roman"/>
+          <w:sz w:val="22"/>
+          <w:szCs w:val="22"/>
+        </w:rPr>
+        <w:t xml:space="preserve">Tam yedekleme ile Chinook veritabanının tamamı 0.030 saniyede Chinook_Full.bak dosyasına alınmış, RESTORE VERIFYONLY komutuyla doğrulanmıştır. Diferansiyel yedeklemede önce Genre tablosuna iki yeni kayıt (Jazz Fusion, Ambient) eklenmiş, ardından yalnızca değişen veriler 0.007 saniyede Chinook_Diff.bak dosyasına yedeklenmiştir.</w:t>
+      </w:r>
+    </w:p>
+    <w:p>
+      <w:pPr>
+        <w:spacing w:after="100" w:before="100"/>
+      </w:pPr>
+    </w:p>
+    <w:p>
+      <w:pPr>
+        <w:spacing w:after="80" w:before="80"/>
+        <w:jc w:val="both"/>
+      </w:pPr>
+      <w:r>
+        <w:rPr>
+          <w:rFonts w:ascii="Times New Roman" w:cs="Times New Roman" w:eastAsia="Times New Roman" w:hAnsi="Times New Roman"/>
+          <w:sz w:val="22"/>
+          <w:szCs w:val="22"/>
+        </w:rPr>
+        <w:t xml:space="preserve">Geri yükleme adımında tam yedek, Chinook_Restored adlı yeni bir veritabanına başarıyla geri yüklenmiştir. Geri yüklenen veritabanında Genre sayısının 25 olması, yedeğin tam olarak alındığı andaki durumu yansıttığını kanıtlamıştır.</w:t>
+      </w:r>
+    </w:p>
+    <w:p>
+      <w:pPr>
+        <w:spacing w:after="100" w:before="100"/>
+      </w:pPr>
+    </w:p>
+    <w:tbl>
+      <w:tblPr>
+        <w:tblW w:type="dxa" w:w="8526"/>
+        <w:tblBorders>
+          <w:top w:val="single" w:color="auto" w:sz="4"/>
+          <w:left w:val="single" w:color="auto" w:sz="4"/>
+          <w:bottom w:val="single" w:color="auto" w:sz="4"/>
+          <w:right w:val="single" w:color="auto" w:sz="4"/>
+          <w:insideH w:val="single" w:color="auto" w:sz="4"/>
+          <w:insideV w:val="single" w:color="auto" w:sz="4"/>
+        </w:tblBorders>
+      </w:tblPr>
+      <w:tblGrid>
+        <w:gridCol w:w="2800"/>
+        <w:gridCol w:w="2800"/>
+        <w:gridCol w:w="1500"/>
+        <w:gridCol w:w="1426"/>
+      </w:tblGrid>
+      <w:tr>
+        <w:tc>
+          <w:tcPr>
+            <w:tcW w:type="dxa" w:w="2800"/>
+            <w:tcBorders>
+              <w:top w:val="single" w:color="AAAAAA" w:sz="1"/>
+              <w:left w:val="single" w:color="AAAAAA" w:sz="1"/>
+              <w:bottom w:val="single" w:color="AAAAAA" w:sz="1"/>
+              <w:right w:val="single" w:color="AAAAAA" w:sz="1"/>
+            </w:tcBorders>
+            <w:shd w:fill="DDDDDD" w:val="clear"/>
+            <w:tcMar>
+              <w:top w:type="dxa" w:w="60"/>
+              <w:left w:type="dxa" w:w="100"/>
+              <w:bottom w:type="dxa" w:w="60"/>
+              <w:right w:type="dxa" w:w="100"/>
+            </w:tcMar>
+          </w:tcPr>
+          <w:p>
+            <w:r>
+              <w:rPr>
+                <w:rFonts w:ascii="Times New Roman" w:cs="Times New Roman" w:eastAsia="Times New Roman" w:hAnsi="Times New Roman"/>
+                <w:b/>
+                <w:bCs/>
+                <w:sz w:val="20"/>
+                <w:szCs w:val="20"/>
+              </w:rPr>
+              <w:t xml:space="preserve">Yedekleme Türü</w:t>
+            </w:r>
+          </w:p>
+        </w:tc>
+        <w:tc>
+          <w:tcPr>
+            <w:tcW w:type="dxa" w:w="2800"/>
+            <w:tcBorders>
+              <w:top w:val="single" w:color="AAAAAA" w:sz="1"/>
+              <w:left w:val="single" w:color="AAAAAA" w:sz="1"/>
+              <w:bottom w:val="single" w:color="AAAAAA" w:sz="1"/>
+              <w:right w:val="single" w:color="AAAAAA" w:sz="1"/>
+            </w:tcBorders>
+            <w:shd w:fill="DDDDDD" w:val="clear"/>
+            <w:tcMar>
+              <w:top w:type="dxa" w:w="60"/>
+              <w:left w:type="dxa" w:w="100"/>
+              <w:bottom w:type="dxa" w:w="60"/>
+              <w:right w:type="dxa" w:w="100"/>
+            </w:tcMar>
+          </w:tcPr>
+          <w:p>
+            <w:r>
+              <w:rPr>
+                <w:rFonts w:ascii="Times New Roman" w:cs="Times New Roman" w:eastAsia="Times New Roman" w:hAnsi="Times New Roman"/>
+                <w:b/>
+                <w:bCs/>
+                <w:sz w:val="20"/>
+                <w:szCs w:val="20"/>
+              </w:rPr>
+              <w:t xml:space="preserve">Dosya</w:t>
+            </w:r>
+          </w:p>
+        </w:tc>
+        <w:tc>
+          <w:tcPr>
+            <w:tcW w:type="dxa" w:w="1500"/>
+            <w:tcBorders>
+              <w:top w:val="single" w:color="AAAAAA" w:sz="1"/>
+              <w:left w:val="single" w:color="AAAAAA" w:sz="1"/>
+              <w:bottom w:val="single" w:color="AAAAAA" w:sz="1"/>
+              <w:right w:val="single" w:color="AAAAAA" w:sz="1"/>
+            </w:tcBorders>
+            <w:shd w:fill="DDDDDD" w:val="clear"/>
+            <w:tcMar>
+              <w:top w:type="dxa" w:w="60"/>
+              <w:left w:type="dxa" w:w="100"/>
+              <w:bottom w:type="dxa" w:w="60"/>
+              <w:right w:type="dxa" w:w="100"/>
+            </w:tcMar>
+          </w:tcPr>
+          <w:p>
+            <w:r>
+              <w:rPr>
+                <w:rFonts w:ascii="Times New Roman" w:cs="Times New Roman" w:eastAsia="Times New Roman" w:hAnsi="Times New Roman"/>
+                <w:b/>
+                <w:bCs/>
+                <w:sz w:val="20"/>
+                <w:szCs w:val="20"/>
+              </w:rPr>
+              <w:t xml:space="preserve">Boyut</w:t>
+            </w:r>
+          </w:p>
+        </w:tc>
+        <w:tc>
+          <w:tcPr>
+            <w:tcW w:type="dxa" w:w="1426"/>
+            <w:tcBorders>
+              <w:top w:val="single" w:color="AAAAAA" w:sz="1"/>
+              <w:left w:val="single" w:color="AAAAAA" w:sz="1"/>
+              <w:bottom w:val="single" w:color="AAAAAA" w:sz="1"/>
+              <w:right w:val="single" w:color="AAAAAA" w:sz="1"/>
+            </w:tcBorders>
+            <w:shd w:fill="DDDDDD" w:val="clear"/>
+            <w:tcMar>
+              <w:top w:type="dxa" w:w="60"/>
+              <w:left w:type="dxa" w:w="100"/>
+              <w:bottom w:type="dxa" w:w="60"/>
+              <w:right w:type="dxa" w:w="100"/>
+            </w:tcMar>
+          </w:tcPr>
+          <w:p>
+            <w:r>
+              <w:rPr>
+                <w:rFonts w:ascii="Times New Roman" w:cs="Times New Roman" w:eastAsia="Times New Roman" w:hAnsi="Times New Roman"/>
+                <w:b/>
+                <w:bCs/>
+                <w:sz w:val="20"/>
+                <w:szCs w:val="20"/>
+              </w:rPr>
+              <w:t xml:space="preserve">Süre</w:t>
+            </w:r>
+          </w:p>
+        </w:tc>
+      </w:tr>
+      <w:tr>
+        <w:tc>
+          <w:tcPr>
+            <w:tcW w:type="dxa" w:w="2800"/>
+            <w:tcBorders>
+              <w:top w:val="single" w:color="AAAAAA" w:sz="1"/>
+              <w:left w:val="single" w:color="AAAAAA" w:sz="1"/>
+              <w:bottom w:val="single" w:color="AAAAAA" w:sz="1"/>
+              <w:right w:val="single" w:color="AAAAAA" w:sz="1"/>
+            </w:tcBorders>
+            <w:shd w:fill="FFFFFF" w:val="clear"/>
+            <w:tcMar>
+              <w:top w:type="dxa" w:w="60"/>
+              <w:left w:type="dxa" w:w="100"/>
+              <w:bottom w:type="dxa" w:w="60"/>
+              <w:right w:type="dxa" w:w="100"/>
+            </w:tcMar>
+          </w:tcPr>
+          <w:p>
+            <w:r>
+              <w:rPr>
+                <w:rFonts w:ascii="Times New Roman" w:cs="Times New Roman" w:eastAsia="Times New Roman" w:hAnsi="Times New Roman"/>
+                <w:b w:val="false"/>
+                <w:bCs w:val="false"/>
+                <w:sz w:val="20"/>
+                <w:szCs w:val="20"/>
+              </w:rPr>
+              <w:t xml:space="preserve">Tam Yedek (Full)</w:t>
+            </w:r>
+          </w:p>
+        </w:tc>
+        <w:tc>
+          <w:tcPr>
+            <w:tcW w:type="dxa" w:w="2800"/>
+            <w:tcBorders>
+              <w:top w:val="single" w:color="AAAAAA" w:sz="1"/>
+              <w:left w:val="single" w:color="AAAAAA" w:sz="1"/>
+              <w:bottom w:val="single" w:color="AAAAAA" w:sz="1"/>
+              <w:right w:val="single" w:color="AAAAAA" w:sz="1"/>
+            </w:tcBorders>
+            <w:shd w:fill="FFFFFF" w:val="clear"/>
+            <w:tcMar>
+              <w:top w:type="dxa" w:w="60"/>
+              <w:left w:type="dxa" w:w="100"/>
+              <w:bottom w:type="dxa" w:w="60"/>
+              <w:right w:type="dxa" w:w="100"/>
+            </w:tcMar>
+          </w:tcPr>
+          <w:p>
+            <w:r>
+              <w:rPr>
+                <w:rFonts w:ascii="Times New Roman" w:cs="Times New Roman" w:eastAsia="Times New Roman" w:hAnsi="Times New Roman"/>
+                <w:b w:val="false"/>
+                <w:bCs w:val="false"/>
+                <w:sz w:val="20"/>
+                <w:szCs w:val="20"/>
+              </w:rPr>
+              <w:t xml:space="preserve">Chinook_Full.bak</w:t>
+            </w:r>
+          </w:p>
+        </w:tc>
+        <w:tc>
+          <w:tcPr>
+            <w:tcW w:type="dxa" w:w="1500"/>
+            <w:tcBorders>
+              <w:top w:val="single" w:color="AAAAAA" w:sz="1"/>
+              <w:left w:val="single" w:color="AAAAAA" w:sz="1"/>
+              <w:bottom w:val="single" w:color="AAAAAA" w:sz="1"/>
+              <w:right w:val="single" w:color="AAAAAA" w:sz="1"/>
+            </w:tcBorders>
+            <w:shd w:fill="FFFFFF" w:val="clear"/>
+            <w:tcMar>
+              <w:top w:type="dxa" w:w="60"/>
+              <w:left w:type="dxa" w:w="100"/>
+              <w:bottom w:type="dxa" w:w="60"/>
+              <w:right w:type="dxa" w:w="100"/>
+            </w:tcMar>
+          </w:tcPr>
+          <w:p>
+            <w:r>
+              <w:rPr>
+                <w:rFonts w:ascii="Times New Roman" w:cs="Times New Roman" w:eastAsia="Times New Roman" w:hAnsi="Times New Roman"/>
+                <w:b w:val="false"/>
+                <w:bCs w:val="false"/>
+                <w:sz w:val="20"/>
+                <w:szCs w:val="20"/>
+              </w:rPr>
+              <w:t xml:space="preserve">6.03 MB</w:t>
+            </w:r>
+          </w:p>
+        </w:tc>
+        <w:tc>
+          <w:tcPr>
+            <w:tcW w:type="dxa" w:w="1426"/>
+            <w:tcBorders>
+              <w:top w:val="single" w:color="AAAAAA" w:sz="1"/>
+              <w:left w:val="single" w:color="AAAAAA" w:sz="1"/>
+              <w:bottom w:val="single" w:color="AAAAAA" w:sz="1"/>
+              <w:right w:val="single" w:color="AAAAAA" w:sz="1"/>
+            </w:tcBorders>
+            <w:shd w:fill="FFFFFF" w:val="clear"/>
+            <w:tcMar>
+              <w:top w:type="dxa" w:w="60"/>
+              <w:left w:type="dxa" w:w="100"/>
+              <w:bottom w:type="dxa" w:w="60"/>
+              <w:right w:type="dxa" w:w="100"/>
+            </w:tcMar>
+          </w:tcPr>
+          <w:p>
+            <w:r>
+              <w:rPr>
+                <w:rFonts w:ascii="Times New Roman" w:cs="Times New Roman" w:eastAsia="Times New Roman" w:hAnsi="Times New Roman"/>
+                <w:b w:val="false"/>
+                <w:bCs w:val="false"/>
+                <w:sz w:val="20"/>
+                <w:szCs w:val="20"/>
+              </w:rPr>
+              <w:t xml:space="preserve">0.030 sn</w:t>
+            </w:r>
+          </w:p>
+        </w:tc>
+      </w:tr>
+      <w:tr>
+        <w:tc>
+          <w:tcPr>
+            <w:tcW w:type="dxa" w:w="2800"/>
+            <w:tcBorders>
+              <w:top w:val="single" w:color="AAAAAA" w:sz="1"/>
+              <w:left w:val="single" w:color="AAAAAA" w:sz="1"/>
+              <w:bottom w:val="single" w:color="AAAAAA" w:sz="1"/>
+              <w:right w:val="single" w:color="AAAAAA" w:sz="1"/>
+            </w:tcBorders>
+            <w:shd w:fill="FFFFFF" w:val="clear"/>
+            <w:tcMar>
+              <w:top w:type="dxa" w:w="60"/>
+              <w:left w:type="dxa" w:w="100"/>
+              <w:bottom w:type="dxa" w:w="60"/>
+              <w:right w:type="dxa" w:w="100"/>
+            </w:tcMar>
+          </w:tcPr>
+          <w:p>
+            <w:r>
+              <w:rPr>
+                <w:rFonts w:ascii="Times New Roman" w:cs="Times New Roman" w:eastAsia="Times New Roman" w:hAnsi="Times New Roman"/>
+                <w:b w:val="false"/>
+                <w:bCs w:val="false"/>
+                <w:sz w:val="20"/>
+                <w:szCs w:val="20"/>
+              </w:rPr>
+              <w:t xml:space="preserve">Diferansiyel</w:t>
+            </w:r>
+          </w:p>
+        </w:tc>
+        <w:tc>
+          <w:tcPr>
+            <w:tcW w:type="dxa" w:w="2800"/>
+            <w:tcBorders>
+              <w:top w:val="single" w:color="AAAAAA" w:sz="1"/>
+              <w:left w:val="single" w:color="AAAAAA" w:sz="1"/>
+              <w:bottom w:val="single" w:color="AAAAAA" w:sz="1"/>
+              <w:right w:val="single" w:color="AAAAAA" w:sz="1"/>
+            </w:tcBorders>
+            <w:shd w:fill="FFFFFF" w:val="clear"/>
+            <w:tcMar>
+              <w:top w:type="dxa" w:w="60"/>
+              <w:left w:type="dxa" w:w="100"/>
+              <w:bottom w:type="dxa" w:w="60"/>
+              <w:right w:type="dxa" w:w="100"/>
+            </w:tcMar>
+          </w:tcPr>
+          <w:p>
+            <w:r>
+              <w:rPr>
+                <w:rFonts w:ascii="Times New Roman" w:cs="Times New Roman" w:eastAsia="Times New Roman" w:hAnsi="Times New Roman"/>
+                <w:b w:val="false"/>
+                <w:bCs w:val="false"/>
+                <w:sz w:val="20"/>
+                <w:szCs w:val="20"/>
+              </w:rPr>
+              <w:t xml:space="preserve">Chinook_Diff.bak</w:t>
+            </w:r>
+          </w:p>
+        </w:tc>
+        <w:tc>
+          <w:tcPr>
+            <w:tcW w:type="dxa" w:w="1500"/>
+            <w:tcBorders>
+              <w:top w:val="single" w:color="AAAAAA" w:sz="1"/>
+              <w:left w:val="single" w:color="AAAAAA" w:sz="1"/>
+              <w:bottom w:val="single" w:color="AAAAAA" w:sz="1"/>
+              <w:right w:val="single" w:color="AAAAAA" w:sz="1"/>
+            </w:tcBorders>
+            <w:shd w:fill="FFFFFF" w:val="clear"/>
+            <w:tcMar>
+              <w:top w:type="dxa" w:w="60"/>
+              <w:left w:type="dxa" w:w="100"/>
+              <w:bottom w:type="dxa" w:w="60"/>
+              <w:right w:type="dxa" w:w="100"/>
+            </w:tcMar>
+          </w:tcPr>
+          <w:p>
+            <w:r>
+              <w:rPr>
+                <w:rFonts w:ascii="Times New Roman" w:cs="Times New Roman" w:eastAsia="Times New Roman" w:hAnsi="Times New Roman"/>
+                <w:b w:val="false"/>
+                <w:bCs w:val="false"/>
+                <w:sz w:val="20"/>
+                <w:szCs w:val="20"/>
+              </w:rPr>
+              <w:t xml:space="preserve">0.78 MB</w:t>
+            </w:r>
+          </w:p>
+        </w:tc>
+        <w:tc>
+          <w:tcPr>
+            <w:tcW w:type="dxa" w:w="1426"/>
+            <w:tcBorders>
+              <w:top w:val="single" w:color="AAAAAA" w:sz="1"/>
+              <w:left w:val="single" w:color="AAAAAA" w:sz="1"/>
+              <w:bottom w:val="single" w:color="AAAAAA" w:sz="1"/>
+              <w:right w:val="single" w:color="AAAAAA" w:sz="1"/>
+            </w:tcBorders>
+            <w:shd w:fill="FFFFFF" w:val="clear"/>
+            <w:tcMar>
+              <w:top w:type="dxa" w:w="60"/>
+              <w:left w:type="dxa" w:w="100"/>
+              <w:bottom w:type="dxa" w:w="60"/>
+              <w:right w:type="dxa" w:w="100"/>
+            </w:tcMar>
+          </w:tcPr>
+          <w:p>
+            <w:r>
+              <w:rPr>
+                <w:rFonts w:ascii="Times New Roman" w:cs="Times New Roman" w:eastAsia="Times New Roman" w:hAnsi="Times New Roman"/>
+                <w:b w:val="false"/>
+                <w:bCs w:val="false"/>
+                <w:sz w:val="20"/>
+                <w:szCs w:val="20"/>
+              </w:rPr>
+              <w:t xml:space="preserve">0.007 sn</w:t>
+            </w:r>
+          </w:p>
+        </w:tc>
+      </w:tr>
+      <w:tr>
+        <w:tc>
+          <w:tcPr>
+            <w:tcW w:type="dxa" w:w="2800"/>
+            <w:tcBorders>
+              <w:top w:val="single" w:color="AAAAAA" w:sz="1"/>
+              <w:left w:val="single" w:color="AAAAAA" w:sz="1"/>
+              <w:bottom w:val="single" w:color="AAAAAA" w:sz="1"/>
+              <w:right w:val="single" w:color="AAAAAA" w:sz="1"/>
+            </w:tcBorders>
+            <w:shd w:fill="FFFFFF" w:val="clear"/>
+            <w:tcMar>
+              <w:top w:type="dxa" w:w="60"/>
+              <w:left w:type="dxa" w:w="100"/>
+              <w:bottom w:type="dxa" w:w="60"/>
+              <w:right w:type="dxa" w:w="100"/>
+            </w:tcMar>
+          </w:tcPr>
+          <w:p>
+            <w:r>
+              <w:rPr>
+                <w:rFonts w:ascii="Times New Roman" w:cs="Times New Roman" w:eastAsia="Times New Roman" w:hAnsi="Times New Roman"/>
+                <w:b w:val="false"/>
+                <w:bCs w:val="false"/>
+                <w:sz w:val="20"/>
+                <w:szCs w:val="20"/>
+              </w:rPr>
+              <w:t xml:space="preserve">Geri Yükleme</w:t>
+            </w:r>
+          </w:p>
+        </w:tc>
+        <w:tc>
+          <w:tcPr>
+            <w:tcW w:type="dxa" w:w="2800"/>
+            <w:tcBorders>
+              <w:top w:val="single" w:color="AAAAAA" w:sz="1"/>
+              <w:left w:val="single" w:color="AAAAAA" w:sz="1"/>
+              <w:bottom w:val="single" w:color="AAAAAA" w:sz="1"/>
+              <w:right w:val="single" w:color="AAAAAA" w:sz="1"/>
+            </w:tcBorders>
+            <w:shd w:fill="FFFFFF" w:val="clear"/>
+            <w:tcMar>
+              <w:top w:type="dxa" w:w="60"/>
+              <w:left w:type="dxa" w:w="100"/>
+              <w:bottom w:type="dxa" w:w="60"/>
+              <w:right w:type="dxa" w:w="100"/>
+            </w:tcMar>
+          </w:tcPr>
+          <w:p>
+            <w:r>
+              <w:rPr>
+                <w:rFonts w:ascii="Times New Roman" w:cs="Times New Roman" w:eastAsia="Times New Roman" w:hAnsi="Times New Roman"/>
+                <w:b w:val="false"/>
+                <w:bCs w:val="false"/>
+                <w:sz w:val="20"/>
+                <w:szCs w:val="20"/>
+              </w:rPr>
+              <w:t xml:space="preserve">Chinook_Restored</w:t>
+            </w:r>
+          </w:p>
+        </w:tc>
+        <w:tc>
+          <w:tcPr>
+            <w:tcW w:type="dxa" w:w="1500"/>
+            <w:tcBorders>
+              <w:top w:val="single" w:color="AAAAAA" w:sz="1"/>
+              <w:left w:val="single" w:color="AAAAAA" w:sz="1"/>
+              <w:bottom w:val="single" w:color="AAAAAA" w:sz="1"/>
+              <w:right w:val="single" w:color="AAAAAA" w:sz="1"/>
+            </w:tcBorders>
+            <w:shd w:fill="FFFFFF" w:val="clear"/>
+            <w:tcMar>
+              <w:top w:type="dxa" w:w="60"/>
+              <w:left w:type="dxa" w:w="100"/>
+              <w:bottom w:type="dxa" w:w="60"/>
+              <w:right w:type="dxa" w:w="100"/>
+            </w:tcMar>
+          </w:tcPr>
+          <w:p>
+            <w:r>
+              <w:rPr>
+                <w:rFonts w:ascii="Times New Roman" w:cs="Times New Roman" w:eastAsia="Times New Roman" w:hAnsi="Times New Roman"/>
+                <w:b w:val="false"/>
+                <w:bCs w:val="false"/>
+                <w:sz w:val="20"/>
+                <w:szCs w:val="20"/>
+              </w:rPr>
+              <w:t xml:space="preserve">762 sayfa</w:t>
+            </w:r>
+          </w:p>
+        </w:tc>
+        <w:tc>
+          <w:tcPr>
+            <w:tcW w:type="dxa" w:w="1426"/>
+            <w:tcBorders>
+              <w:top w:val="single" w:color="AAAAAA" w:sz="1"/>
+              <w:left w:val="single" w:color="AAAAAA" w:sz="1"/>
+              <w:bottom w:val="single" w:color="AAAAAA" w:sz="1"/>
+              <w:right w:val="single" w:color="AAAAAA" w:sz="1"/>
+            </w:tcBorders>
+            <w:shd w:fill="FFFFFF" w:val="clear"/>
+            <w:tcMar>
+              <w:top w:type="dxa" w:w="60"/>
+              <w:left w:type="dxa" w:w="100"/>
+              <w:bottom w:type="dxa" w:w="60"/>
+              <w:right w:type="dxa" w:w="100"/>
+            </w:tcMar>
+          </w:tcPr>
+          <w:p>
+            <w:r>
+              <w:rPr>
+                <w:rFonts w:ascii="Times New Roman" w:cs="Times New Roman" w:eastAsia="Times New Roman" w:hAnsi="Times New Roman"/>
+                <w:b w:val="false"/>
+                <w:bCs w:val="false"/>
+                <w:sz w:val="20"/>
+                <w:szCs w:val="20"/>
+              </w:rPr>
+              <w:t xml:space="preserve">0.014 sn</w:t>
+            </w:r>
+          </w:p>
+        </w:tc>
+      </w:tr>
+    </w:tbl>
+    <w:p>
+      <w:pPr>
+        <w:spacing w:after="100" w:before="100"/>
+      </w:pPr>
     </w:p>
     <w:sectPr>
       <w:headerReference w:type="default" r:id="rId7"/>

</xml_diff>

<commit_message>
Proje2 Adim5: Transaction Log Backup - FULL recovery model, log yedekleme, tum yedek gecmisi; birlesik rapor guncellendi
</commit_message>
<xml_diff>
--- a/Proje2-YedeklemeveKurtarma/Proje2_Rapor.docx
+++ b/Proje2-YedeklemeveKurtarma/Proje2_Rapor.docx
@@ -2872,7 +2872,7 @@
           <w:sz w:val="28"/>
           <w:szCs w:val="28"/>
         </w:rPr>
-        <w:t xml:space="preserve">6. Sonuç</w:t>
+        <w:t xml:space="preserve">6. Transaction Log Backup</w:t>
       </w:r>
     </w:p>
     <w:p>
@@ -2886,13 +2886,29 @@
           <w:sz w:val="22"/>
           <w:szCs w:val="22"/>
         </w:rPr>
-        <w:t xml:space="preserve">Bu proje kapsamında Chinook veritabanı üzerinde kapsamlı bir yedekleme ve felaketten kurtarma çalışması gerçekleştirilmiştir. Üç farklı yedekleme yöntemi uygulanmış ve geri yükleme senaryosu test edilmiştir.</w:t>
+        <w:t xml:space="preserve">Transaction Log Backup, veritabanının işlem günlüğünü (transaction log) yedekler. FULL recovery model gerektirir ve belirli bir zaman noktasına geri yükleme (point-in-time recovery) imkânı sağlar.</w:t>
       </w:r>
     </w:p>
     <w:p>
       <w:pPr>
         <w:spacing w:after="100" w:before="100"/>
       </w:pPr>
+    </w:p>
+    <w:p>
+      <w:pPr>
+        <w:pStyle w:val="Heading2"/>
+        <w:spacing w:after="80" w:before="200"/>
+      </w:pPr>
+      <w:r>
+        <w:rPr>
+          <w:rFonts w:ascii="Times New Roman" w:cs="Times New Roman" w:eastAsia="Times New Roman" w:hAnsi="Times New Roman"/>
+          <w:b/>
+          <w:bCs/>
+          <w:sz w:val="24"/>
+          <w:szCs w:val="24"/>
+        </w:rPr>
+        <w:t xml:space="preserve">6.1 Recovery Model Kontrolü ve Değiştirilmesi</w:t>
+      </w:r>
     </w:p>
     <w:p>
       <w:pPr>
@@ -2905,13 +2921,265 @@
           <w:sz w:val="22"/>
           <w:szCs w:val="22"/>
         </w:rPr>
-        <w:t xml:space="preserve">Tam yedekleme ile Chinook veritabanının tamamı 0.030 saniyede Chinook_Full.bak dosyasına alınmış, RESTORE VERIFYONLY komutuyla doğrulanmıştır. Diferansiyel yedeklemede önce Genre tablosuna iki yeni kayıt (Jazz Fusion, Ambient) eklenmiş, ardından yalnızca değişen veriler 0.007 saniyede Chinook_Diff.bak dosyasına yedeklenmiştir.</w:t>
+        <w:t xml:space="preserve">Log backup yapabilmek için veritabanının SIMPLE değil, FULL recovery model'de olması gerekir. SIMPLE modelde log kayıtları otomatik temizlendiğinden log backup alınamaz.</w:t>
+      </w:r>
+    </w:p>
+    <w:p>
+      <w:pPr>
+        <w:shd w:fill="F2F2F2" w:val="clear"/>
+        <w:spacing w:after="0" w:before="0"/>
+      </w:pPr>
+      <w:r>
+        <w:rPr>
+          <w:rFonts w:ascii="Courier New" w:cs="Courier New" w:eastAsia="Courier New" w:hAnsi="Courier New"/>
+          <w:sz w:val="18"/>
+          <w:szCs w:val="18"/>
+        </w:rPr>
+        <w:t xml:space="preserve">-- Mevcut recovery model</w:t>
+      </w:r>
+    </w:p>
+    <w:p>
+      <w:pPr>
+        <w:shd w:fill="F2F2F2" w:val="clear"/>
+        <w:spacing w:after="0" w:before="0"/>
+      </w:pPr>
+      <w:r>
+        <w:rPr>
+          <w:rFonts w:ascii="Courier New" w:cs="Courier New" w:eastAsia="Courier New" w:hAnsi="Courier New"/>
+          <w:sz w:val="18"/>
+          <w:szCs w:val="18"/>
+        </w:rPr>
+        <w:t xml:space="preserve">SELECT name, recovery_model_desc FROM sys.databases WHERE name = 'Chinook';</w:t>
+      </w:r>
+    </w:p>
+    <w:p>
+      <w:pPr>
+        <w:shd w:fill="F2F2F2" w:val="clear"/>
+        <w:spacing w:after="0" w:before="0"/>
+      </w:pPr>
+      <w:r>
+        <w:rPr>
+          <w:rFonts w:ascii="Courier New" w:cs="Courier New" w:eastAsia="Courier New" w:hAnsi="Courier New"/>
+          <w:sz w:val="18"/>
+          <w:szCs w:val="18"/>
+        </w:rPr>
+        <w:t xml:space="preserve"/>
+      </w:r>
+    </w:p>
+    <w:p>
+      <w:pPr>
+        <w:shd w:fill="F2F2F2" w:val="clear"/>
+        <w:spacing w:after="0" w:before="0"/>
+      </w:pPr>
+      <w:r>
+        <w:rPr>
+          <w:rFonts w:ascii="Courier New" w:cs="Courier New" w:eastAsia="Courier New" w:hAnsi="Courier New"/>
+          <w:sz w:val="18"/>
+          <w:szCs w:val="18"/>
+        </w:rPr>
+        <w:t xml:space="preserve">-- FULL recovery model'e geç</w:t>
+      </w:r>
+    </w:p>
+    <w:p>
+      <w:pPr>
+        <w:shd w:fill="F2F2F2" w:val="clear"/>
+        <w:spacing w:after="0" w:before="0"/>
+      </w:pPr>
+      <w:r>
+        <w:rPr>
+          <w:rFonts w:ascii="Courier New" w:cs="Courier New" w:eastAsia="Courier New" w:hAnsi="Courier New"/>
+          <w:sz w:val="18"/>
+          <w:szCs w:val="18"/>
+        </w:rPr>
+        <w:t xml:space="preserve">ALTER DATABASE Chinook SET RECOVERY FULL;</w:t>
+      </w:r>
+    </w:p>
+    <w:p>
+      <w:pPr>
+        <w:shd w:fill="F2F2F2" w:val="clear"/>
+        <w:spacing w:after="0" w:before="0"/>
+      </w:pPr>
+      <w:r>
+        <w:rPr>
+          <w:rFonts w:ascii="Courier New" w:cs="Courier New" w:eastAsia="Courier New" w:hAnsi="Courier New"/>
+          <w:sz w:val="18"/>
+          <w:szCs w:val="18"/>
+        </w:rPr>
+        <w:t xml:space="preserve"/>
+      </w:r>
+    </w:p>
+    <w:p>
+      <w:pPr>
+        <w:shd w:fill="F2F2F2" w:val="clear"/>
+        <w:spacing w:after="0" w:before="0"/>
+      </w:pPr>
+      <w:r>
+        <w:rPr>
+          <w:rFonts w:ascii="Courier New" w:cs="Courier New" w:eastAsia="Courier New" w:hAnsi="Courier New"/>
+          <w:sz w:val="18"/>
+          <w:szCs w:val="18"/>
+        </w:rPr>
+        <w:t xml:space="preserve">-- Doğrula</w:t>
+      </w:r>
+    </w:p>
+    <w:p>
+      <w:pPr>
+        <w:shd w:fill="F2F2F2" w:val="clear"/>
+        <w:spacing w:after="0" w:before="0"/>
+      </w:pPr>
+      <w:r>
+        <w:rPr>
+          <w:rFonts w:ascii="Courier New" w:cs="Courier New" w:eastAsia="Courier New" w:hAnsi="Courier New"/>
+          <w:sz w:val="18"/>
+          <w:szCs w:val="18"/>
+        </w:rPr>
+        <w:t xml:space="preserve">SELECT name, recovery_model_desc FROM sys.databases WHERE name = 'Chinook';</w:t>
       </w:r>
     </w:p>
     <w:p>
       <w:pPr>
         <w:spacing w:after="100" w:before="100"/>
       </w:pPr>
+    </w:p>
+    <w:p>
+      <w:pPr>
+        <w:spacing w:after="40" w:before="100"/>
+        <w:jc w:val="center"/>
+      </w:pPr>
+      <w:r>
+        <w:drawing>
+          <wp:inline distT="0" distB="0" distL="0" distR="0">
+            <wp:extent cx="4381500" cy="2095500"/>
+            <wp:effectExtent t="0" r="0" b="0" l="0"/>
+            <wp:docPr id="1" name="SIMPLE recovery model" descr="SIMPLE recovery model" title="SIMPLE recovery model"/>
+            <wp:cNvGraphicFramePr>
+              <a:graphicFrameLocks xmlns:a="http://schemas.openxmlformats.org/drawingml/2006/main" noChangeAspect="1"/>
+            </wp:cNvGraphicFramePr>
+            <a:graphic xmlns:a="http://schemas.openxmlformats.org/drawingml/2006/main">
+              <a:graphicData uri="http://schemas.openxmlformats.org/drawingml/2006/picture">
+                <pic:pic xmlns:pic="http://schemas.openxmlformats.org/drawingml/2006/picture">
+                  <pic:nvPicPr>
+                    <pic:cNvPr id="0" name="" descr=""/>
+                    <pic:cNvPicPr>
+                      <a:picLocks noChangeAspect="1" noChangeArrowheads="1"/>
+                    </pic:cNvPicPr>
+                  </pic:nvPicPr>
+                  <pic:blipFill>
+                    <a:blip r:embed="rId25" cstate="none"/>
+                    <a:srcRect/>
+                    <a:stretch>
+                      <a:fillRect/>
+                    </a:stretch>
+                  </pic:blipFill>
+                  <pic:spPr bwMode="auto">
+                    <a:xfrm>
+                      <a:off x="0" y="0"/>
+                      <a:ext cx="4381500" cy="2095500"/>
+                    </a:xfrm>
+                    <a:prstGeom prst="rect">
+                      <a:avLst/>
+                    </a:prstGeom>
+                  </pic:spPr>
+                </pic:pic>
+              </a:graphicData>
+            </a:graphic>
+          </wp:inline>
+        </w:drawing>
+      </w:r>
+    </w:p>
+    <w:p>
+      <w:pPr>
+        <w:spacing w:after="160" w:before="40"/>
+        <w:jc w:val="center"/>
+      </w:pPr>
+      <w:r>
+        <w:rPr>
+          <w:rFonts w:ascii="Times New Roman" w:cs="Times New Roman" w:eastAsia="Times New Roman" w:hAnsi="Times New Roman"/>
+          <w:i/>
+          <w:iCs/>
+          <w:sz w:val="18"/>
+          <w:szCs w:val="18"/>
+        </w:rPr>
+        <w:t xml:space="preserve">Şekil 17 – Başlangıç durumu: Chinook SIMPLE recovery model</w:t>
+      </w:r>
+    </w:p>
+    <w:p>
+      <w:pPr>
+        <w:spacing w:after="40" w:before="100"/>
+        <w:jc w:val="center"/>
+      </w:pPr>
+      <w:r>
+        <w:drawing>
+          <wp:inline distT="0" distB="0" distL="0" distR="0">
+            <wp:extent cx="4381500" cy="2095500"/>
+            <wp:effectExtent t="0" r="0" b="0" l="0"/>
+            <wp:docPr id="1" name="FULL recovery model" descr="FULL recovery model" title="FULL recovery model"/>
+            <wp:cNvGraphicFramePr>
+              <a:graphicFrameLocks xmlns:a="http://schemas.openxmlformats.org/drawingml/2006/main" noChangeAspect="1"/>
+            </wp:cNvGraphicFramePr>
+            <a:graphic xmlns:a="http://schemas.openxmlformats.org/drawingml/2006/main">
+              <a:graphicData uri="http://schemas.openxmlformats.org/drawingml/2006/picture">
+                <pic:pic xmlns:pic="http://schemas.openxmlformats.org/drawingml/2006/picture">
+                  <pic:nvPicPr>
+                    <pic:cNvPr id="0" name="" descr=""/>
+                    <pic:cNvPicPr>
+                      <a:picLocks noChangeAspect="1" noChangeArrowheads="1"/>
+                    </pic:cNvPicPr>
+                  </pic:nvPicPr>
+                  <pic:blipFill>
+                    <a:blip r:embed="rId26" cstate="none"/>
+                    <a:srcRect/>
+                    <a:stretch>
+                      <a:fillRect/>
+                    </a:stretch>
+                  </pic:blipFill>
+                  <pic:spPr bwMode="auto">
+                    <a:xfrm>
+                      <a:off x="0" y="0"/>
+                      <a:ext cx="4381500" cy="2095500"/>
+                    </a:xfrm>
+                    <a:prstGeom prst="rect">
+                      <a:avLst/>
+                    </a:prstGeom>
+                  </pic:spPr>
+                </pic:pic>
+              </a:graphicData>
+            </a:graphic>
+          </wp:inline>
+        </w:drawing>
+      </w:r>
+    </w:p>
+    <w:p>
+      <w:pPr>
+        <w:spacing w:after="160" w:before="40"/>
+        <w:jc w:val="center"/>
+      </w:pPr>
+      <w:r>
+        <w:rPr>
+          <w:rFonts w:ascii="Times New Roman" w:cs="Times New Roman" w:eastAsia="Times New Roman" w:hAnsi="Times New Roman"/>
+          <w:i/>
+          <w:iCs/>
+          <w:sz w:val="18"/>
+          <w:szCs w:val="18"/>
+        </w:rPr>
+        <w:t xml:space="preserve">Şekil 18 – ALTER DATABASE sonrası: FULL recovery model etkin</w:t>
+      </w:r>
+    </w:p>
+    <w:p>
+      <w:pPr>
+        <w:pStyle w:val="Heading2"/>
+        <w:spacing w:after="80" w:before="200"/>
+      </w:pPr>
+      <w:r>
+        <w:rPr>
+          <w:rFonts w:ascii="Times New Roman" w:cs="Times New Roman" w:eastAsia="Times New Roman" w:hAnsi="Times New Roman"/>
+          <w:b/>
+          <w:bCs/>
+          <w:sz w:val="24"/>
+          <w:szCs w:val="24"/>
+        </w:rPr>
+        <w:t xml:space="preserve">6.2 Log Backup Öncesi Tam Yedek</w:t>
+      </w:r>
     </w:p>
     <w:p>
       <w:pPr>
@@ -2924,7 +3192,532 @@
           <w:sz w:val="22"/>
           <w:szCs w:val="22"/>
         </w:rPr>
-        <w:t xml:space="preserve">Geri yükleme adımında tam yedek, Chinook_Restored adlı yeni bir veritabanına başarıyla geri yüklenmiştir. Geri yüklenen veritabanında Genre sayısının 25 olması, yedeğin tam olarak alındığı andaki durumu yansıttığını kanıtlamıştır.</w:t>
+        <w:t xml:space="preserve">Transaction Log Backup alabilmek için önce mutlaka bir tam yedek alınmalıdır. Bu, log zincirinin başlangıç noktasını oluşturur.</w:t>
+      </w:r>
+    </w:p>
+    <w:p>
+      <w:pPr>
+        <w:shd w:fill="F2F2F2" w:val="clear"/>
+        <w:spacing w:after="0" w:before="0"/>
+      </w:pPr>
+      <w:r>
+        <w:rPr>
+          <w:rFonts w:ascii="Courier New" w:cs="Courier New" w:eastAsia="Courier New" w:hAnsi="Courier New"/>
+          <w:sz w:val="18"/>
+          <w:szCs w:val="18"/>
+        </w:rPr>
+        <w:t xml:space="preserve">BACKUP DATABASE Chinook</w:t>
+      </w:r>
+    </w:p>
+    <w:p>
+      <w:pPr>
+        <w:shd w:fill="F2F2F2" w:val="clear"/>
+        <w:spacing w:after="0" w:before="0"/>
+      </w:pPr>
+      <w:r>
+        <w:rPr>
+          <w:rFonts w:ascii="Courier New" w:cs="Courier New" w:eastAsia="Courier New" w:hAnsi="Courier New"/>
+          <w:sz w:val="18"/>
+          <w:szCs w:val="18"/>
+        </w:rPr>
+        <w:t xml:space="preserve">TO DISK = 'C:\Backup\Chinook_Full2.bak'</w:t>
+      </w:r>
+    </w:p>
+    <w:p>
+      <w:pPr>
+        <w:shd w:fill="F2F2F2" w:val="clear"/>
+        <w:spacing w:after="0" w:before="0"/>
+      </w:pPr>
+      <w:r>
+        <w:rPr>
+          <w:rFonts w:ascii="Courier New" w:cs="Courier New" w:eastAsia="Courier New" w:hAnsi="Courier New"/>
+          <w:sz w:val="18"/>
+          <w:szCs w:val="18"/>
+        </w:rPr>
+        <w:t xml:space="preserve">WITH FORMAT, NAME = 'Chinook Tam Yedek 2';</w:t>
+      </w:r>
+    </w:p>
+    <w:p>
+      <w:pPr>
+        <w:spacing w:after="100" w:before="100"/>
+      </w:pPr>
+    </w:p>
+    <w:p>
+      <w:pPr>
+        <w:spacing w:after="40" w:before="100"/>
+        <w:jc w:val="center"/>
+      </w:pPr>
+      <w:r>
+        <w:drawing>
+          <wp:inline distT="0" distB="0" distL="0" distR="0">
+            <wp:extent cx="4953000" cy="2095500"/>
+            <wp:effectExtent t="0" r="0" b="0" l="0"/>
+            <wp:docPr id="1" name="Tam yedek 2" descr="Tam yedek 2" title="Tam yedek 2"/>
+            <wp:cNvGraphicFramePr>
+              <a:graphicFrameLocks xmlns:a="http://schemas.openxmlformats.org/drawingml/2006/main" noChangeAspect="1"/>
+            </wp:cNvGraphicFramePr>
+            <a:graphic xmlns:a="http://schemas.openxmlformats.org/drawingml/2006/main">
+              <a:graphicData uri="http://schemas.openxmlformats.org/drawingml/2006/picture">
+                <pic:pic xmlns:pic="http://schemas.openxmlformats.org/drawingml/2006/picture">
+                  <pic:nvPicPr>
+                    <pic:cNvPr id="0" name="" descr=""/>
+                    <pic:cNvPicPr>
+                      <a:picLocks noChangeAspect="1" noChangeArrowheads="1"/>
+                    </pic:cNvPicPr>
+                  </pic:nvPicPr>
+                  <pic:blipFill>
+                    <a:blip r:embed="rId27" cstate="none"/>
+                    <a:srcRect/>
+                    <a:stretch>
+                      <a:fillRect/>
+                    </a:stretch>
+                  </pic:blipFill>
+                  <pic:spPr bwMode="auto">
+                    <a:xfrm>
+                      <a:off x="0" y="0"/>
+                      <a:ext cx="4953000" cy="2095500"/>
+                    </a:xfrm>
+                    <a:prstGeom prst="rect">
+                      <a:avLst/>
+                    </a:prstGeom>
+                  </pic:spPr>
+                </pic:pic>
+              </a:graphicData>
+            </a:graphic>
+          </wp:inline>
+        </w:drawing>
+      </w:r>
+    </w:p>
+    <w:p>
+      <w:pPr>
+        <w:spacing w:after="160" w:before="40"/>
+        <w:jc w:val="center"/>
+      </w:pPr>
+      <w:r>
+        <w:rPr>
+          <w:rFonts w:ascii="Times New Roman" w:cs="Times New Roman" w:eastAsia="Times New Roman" w:hAnsi="Times New Roman"/>
+          <w:i/>
+          <w:iCs/>
+          <w:sz w:val="18"/>
+          <w:szCs w:val="18"/>
+        </w:rPr>
+        <w:t xml:space="preserve">Şekil 19 – Log backup öncesi tam yedek: 762 sayfa, 0.018 saniyede (330.512 MB/sn)</w:t>
+      </w:r>
+    </w:p>
+    <w:p>
+      <w:pPr>
+        <w:pStyle w:val="Heading2"/>
+        <w:spacing w:after="80" w:before="200"/>
+      </w:pPr>
+      <w:r>
+        <w:rPr>
+          <w:rFonts w:ascii="Times New Roman" w:cs="Times New Roman" w:eastAsia="Times New Roman" w:hAnsi="Times New Roman"/>
+          <w:b/>
+          <w:bCs/>
+          <w:sz w:val="24"/>
+          <w:szCs w:val="24"/>
+        </w:rPr>
+        <w:t xml:space="preserve">6.3 Transaction Log Backup</w:t>
+      </w:r>
+    </w:p>
+    <w:p>
+      <w:pPr>
+        <w:spacing w:after="80" w:before="80"/>
+        <w:jc w:val="both"/>
+      </w:pPr>
+      <w:r>
+        <w:rPr>
+          <w:rFonts w:ascii="Times New Roman" w:cs="Times New Roman" w:eastAsia="Times New Roman" w:hAnsi="Times New Roman"/>
+          <w:sz w:val="22"/>
+          <w:szCs w:val="22"/>
+        </w:rPr>
+        <w:t xml:space="preserve">BACKUP LOG komutu ile işlem günlüğü yedeklenmiştir. Log backup, tam yedekten çok daha küçük boyuttadır; yalnızca son log backup'tan bu yana gerçekleşen işlemleri içerir.</w:t>
+      </w:r>
+    </w:p>
+    <w:p>
+      <w:pPr>
+        <w:shd w:fill="F2F2F2" w:val="clear"/>
+        <w:spacing w:after="0" w:before="0"/>
+      </w:pPr>
+      <w:r>
+        <w:rPr>
+          <w:rFonts w:ascii="Courier New" w:cs="Courier New" w:eastAsia="Courier New" w:hAnsi="Courier New"/>
+          <w:sz w:val="18"/>
+          <w:szCs w:val="18"/>
+        </w:rPr>
+        <w:t xml:space="preserve">BACKUP LOG Chinook</w:t>
+      </w:r>
+    </w:p>
+    <w:p>
+      <w:pPr>
+        <w:shd w:fill="F2F2F2" w:val="clear"/>
+        <w:spacing w:after="0" w:before="0"/>
+      </w:pPr>
+      <w:r>
+        <w:rPr>
+          <w:rFonts w:ascii="Courier New" w:cs="Courier New" w:eastAsia="Courier New" w:hAnsi="Courier New"/>
+          <w:sz w:val="18"/>
+          <w:szCs w:val="18"/>
+        </w:rPr>
+        <w:t xml:space="preserve">TO DISK = 'C:\Backup\Chinook_Log.bak'</w:t>
+      </w:r>
+    </w:p>
+    <w:p>
+      <w:pPr>
+        <w:shd w:fill="F2F2F2" w:val="clear"/>
+        <w:spacing w:after="0" w:before="0"/>
+      </w:pPr>
+      <w:r>
+        <w:rPr>
+          <w:rFonts w:ascii="Courier New" w:cs="Courier New" w:eastAsia="Courier New" w:hAnsi="Courier New"/>
+          <w:sz w:val="18"/>
+          <w:szCs w:val="18"/>
+        </w:rPr>
+        <w:t xml:space="preserve">WITH NAME = 'Chinook Log Yedek';</w:t>
+      </w:r>
+    </w:p>
+    <w:p>
+      <w:pPr>
+        <w:spacing w:after="100" w:before="100"/>
+      </w:pPr>
+    </w:p>
+    <w:p>
+      <w:pPr>
+        <w:spacing w:after="40" w:before="100"/>
+        <w:jc w:val="center"/>
+      </w:pPr>
+      <w:r>
+        <w:drawing>
+          <wp:inline distT="0" distB="0" distL="0" distR="0">
+            <wp:extent cx="4953000" cy="2000250"/>
+            <wp:effectExtent t="0" r="0" b="0" l="0"/>
+            <wp:docPr id="1" name="Log backup" descr="Log backup" title="Log backup"/>
+            <wp:cNvGraphicFramePr>
+              <a:graphicFrameLocks xmlns:a="http://schemas.openxmlformats.org/drawingml/2006/main" noChangeAspect="1"/>
+            </wp:cNvGraphicFramePr>
+            <a:graphic xmlns:a="http://schemas.openxmlformats.org/drawingml/2006/main">
+              <a:graphicData uri="http://schemas.openxmlformats.org/drawingml/2006/picture">
+                <pic:pic xmlns:pic="http://schemas.openxmlformats.org/drawingml/2006/picture">
+                  <pic:nvPicPr>
+                    <pic:cNvPr id="0" name="" descr=""/>
+                    <pic:cNvPicPr>
+                      <a:picLocks noChangeAspect="1" noChangeArrowheads="1"/>
+                    </pic:cNvPicPr>
+                  </pic:nvPicPr>
+                  <pic:blipFill>
+                    <a:blip r:embed="rId28" cstate="none"/>
+                    <a:srcRect/>
+                    <a:stretch>
+                      <a:fillRect/>
+                    </a:stretch>
+                  </pic:blipFill>
+                  <pic:spPr bwMode="auto">
+                    <a:xfrm>
+                      <a:off x="0" y="0"/>
+                      <a:ext cx="4953000" cy="2000250"/>
+                    </a:xfrm>
+                    <a:prstGeom prst="rect">
+                      <a:avLst/>
+                    </a:prstGeom>
+                  </pic:spPr>
+                </pic:pic>
+              </a:graphicData>
+            </a:graphic>
+          </wp:inline>
+        </w:drawing>
+      </w:r>
+    </w:p>
+    <w:p>
+      <w:pPr>
+        <w:spacing w:after="160" w:before="40"/>
+        <w:jc w:val="center"/>
+      </w:pPr>
+      <w:r>
+        <w:rPr>
+          <w:rFonts w:ascii="Times New Roman" w:cs="Times New Roman" w:eastAsia="Times New Roman" w:hAnsi="Times New Roman"/>
+          <w:i/>
+          <w:iCs/>
+          <w:sz w:val="18"/>
+          <w:szCs w:val="18"/>
+        </w:rPr>
+        <w:t xml:space="preserve">Şekil 20 – Transaction Log Backup: 7 sayfa, 0.003 saniyede (16.927 MB/sn)</w:t>
+      </w:r>
+    </w:p>
+    <w:p>
+      <w:pPr>
+        <w:pStyle w:val="Heading2"/>
+        <w:spacing w:after="80" w:before="200"/>
+      </w:pPr>
+      <w:r>
+        <w:rPr>
+          <w:rFonts w:ascii="Times New Roman" w:cs="Times New Roman" w:eastAsia="Times New Roman" w:hAnsi="Times New Roman"/>
+          <w:b/>
+          <w:bCs/>
+          <w:sz w:val="24"/>
+          <w:szCs w:val="24"/>
+        </w:rPr>
+        <w:t xml:space="preserve">6.4 Tam Yedek Geçmişi</w:t>
+      </w:r>
+    </w:p>
+    <w:p>
+      <w:pPr>
+        <w:spacing w:after="80" w:before="80"/>
+        <w:jc w:val="both"/>
+      </w:pPr>
+      <w:r>
+        <w:rPr>
+          <w:rFonts w:ascii="Times New Roman" w:cs="Times New Roman" w:eastAsia="Times New Roman" w:hAnsi="Times New Roman"/>
+          <w:sz w:val="22"/>
+          <w:szCs w:val="22"/>
+        </w:rPr>
+        <w:t xml:space="preserve">Tüm yedekleme işlemlerinin geçmişi msdb.dbo.backupset görünümü ile listelenmiştir.</w:t>
+      </w:r>
+    </w:p>
+    <w:p>
+      <w:pPr>
+        <w:shd w:fill="F2F2F2" w:val="clear"/>
+        <w:spacing w:after="0" w:before="0"/>
+      </w:pPr>
+      <w:r>
+        <w:rPr>
+          <w:rFonts w:ascii="Courier New" w:cs="Courier New" w:eastAsia="Courier New" w:hAnsi="Courier New"/>
+          <w:sz w:val="18"/>
+          <w:szCs w:val="18"/>
+        </w:rPr>
+        <w:t xml:space="preserve">SELECT bs.database_name, bs.backup_start_date,</w:t>
+      </w:r>
+    </w:p>
+    <w:p>
+      <w:pPr>
+        <w:shd w:fill="F2F2F2" w:val="clear"/>
+        <w:spacing w:after="0" w:before="0"/>
+      </w:pPr>
+      <w:r>
+        <w:rPr>
+          <w:rFonts w:ascii="Courier New" w:cs="Courier New" w:eastAsia="Courier New" w:hAnsi="Courier New"/>
+          <w:sz w:val="18"/>
+          <w:szCs w:val="18"/>
+        </w:rPr>
+        <w:t xml:space="preserve">    CASE bs.type WHEN 'D' THEN 'Tam Yedek'</w:t>
+      </w:r>
+    </w:p>
+    <w:p>
+      <w:pPr>
+        <w:shd w:fill="F2F2F2" w:val="clear"/>
+        <w:spacing w:after="0" w:before="0"/>
+      </w:pPr>
+      <w:r>
+        <w:rPr>
+          <w:rFonts w:ascii="Courier New" w:cs="Courier New" w:eastAsia="Courier New" w:hAnsi="Courier New"/>
+          <w:sz w:val="18"/>
+          <w:szCs w:val="18"/>
+        </w:rPr>
+        <w:t xml:space="preserve">                 WHEN 'I' THEN 'Diferansiyel'</w:t>
+      </w:r>
+    </w:p>
+    <w:p>
+      <w:pPr>
+        <w:shd w:fill="F2F2F2" w:val="clear"/>
+        <w:spacing w:after="0" w:before="0"/>
+      </w:pPr>
+      <w:r>
+        <w:rPr>
+          <w:rFonts w:ascii="Courier New" w:cs="Courier New" w:eastAsia="Courier New" w:hAnsi="Courier New"/>
+          <w:sz w:val="18"/>
+          <w:szCs w:val="18"/>
+        </w:rPr>
+        <w:t xml:space="preserve">                 WHEN 'L' THEN 'Log Yedek' END AS YedekTuru,</w:t>
+      </w:r>
+    </w:p>
+    <w:p>
+      <w:pPr>
+        <w:shd w:fill="F2F2F2" w:val="clear"/>
+        <w:spacing w:after="0" w:before="0"/>
+      </w:pPr>
+      <w:r>
+        <w:rPr>
+          <w:rFonts w:ascii="Courier New" w:cs="Courier New" w:eastAsia="Courier New" w:hAnsi="Courier New"/>
+          <w:sz w:val="18"/>
+          <w:szCs w:val="18"/>
+        </w:rPr>
+        <w:t xml:space="preserve">    CAST(bs.backup_size/1024.0/1024.0 AS DECIMAL(10,2)) AS BoyutMB,</w:t>
+      </w:r>
+    </w:p>
+    <w:p>
+      <w:pPr>
+        <w:shd w:fill="F2F2F2" w:val="clear"/>
+        <w:spacing w:after="0" w:before="0"/>
+      </w:pPr>
+      <w:r>
+        <w:rPr>
+          <w:rFonts w:ascii="Courier New" w:cs="Courier New" w:eastAsia="Courier New" w:hAnsi="Courier New"/>
+          <w:sz w:val="18"/>
+          <w:szCs w:val="18"/>
+        </w:rPr>
+        <w:t xml:space="preserve">    bmf.physical_device_name AS DosyaYolu</w:t>
+      </w:r>
+    </w:p>
+    <w:p>
+      <w:pPr>
+        <w:shd w:fill="F2F2F2" w:val="clear"/>
+        <w:spacing w:after="0" w:before="0"/>
+      </w:pPr>
+      <w:r>
+        <w:rPr>
+          <w:rFonts w:ascii="Courier New" w:cs="Courier New" w:eastAsia="Courier New" w:hAnsi="Courier New"/>
+          <w:sz w:val="18"/>
+          <w:szCs w:val="18"/>
+        </w:rPr>
+        <w:t xml:space="preserve">FROM msdb.dbo.backupset bs</w:t>
+      </w:r>
+    </w:p>
+    <w:p>
+      <w:pPr>
+        <w:shd w:fill="F2F2F2" w:val="clear"/>
+        <w:spacing w:after="0" w:before="0"/>
+      </w:pPr>
+      <w:r>
+        <w:rPr>
+          <w:rFonts w:ascii="Courier New" w:cs="Courier New" w:eastAsia="Courier New" w:hAnsi="Courier New"/>
+          <w:sz w:val="18"/>
+          <w:szCs w:val="18"/>
+        </w:rPr>
+        <w:t xml:space="preserve">JOIN msdb.dbo.backupmediafamily bmf ON bs.media_set_id = bmf.media_set_id</w:t>
+      </w:r>
+    </w:p>
+    <w:p>
+      <w:pPr>
+        <w:shd w:fill="F2F2F2" w:val="clear"/>
+        <w:spacing w:after="0" w:before="0"/>
+      </w:pPr>
+      <w:r>
+        <w:rPr>
+          <w:rFonts w:ascii="Courier New" w:cs="Courier New" w:eastAsia="Courier New" w:hAnsi="Courier New"/>
+          <w:sz w:val="18"/>
+          <w:szCs w:val="18"/>
+        </w:rPr>
+        <w:t xml:space="preserve">WHERE bs.database_name = 'Chinook' ORDER BY bs.backup_start_date DESC;</w:t>
+      </w:r>
+    </w:p>
+    <w:p>
+      <w:pPr>
+        <w:spacing w:after="100" w:before="100"/>
+      </w:pPr>
+    </w:p>
+    <w:p>
+      <w:pPr>
+        <w:spacing w:after="40" w:before="100"/>
+        <w:jc w:val="center"/>
+      </w:pPr>
+      <w:r>
+        <w:drawing>
+          <wp:inline distT="0" distB="0" distL="0" distR="0">
+            <wp:extent cx="5334000" cy="1905000"/>
+            <wp:effectExtent t="0" r="0" b="0" l="0"/>
+            <wp:docPr id="1" name="Tüm yedek geçmişi" descr="Tüm yedek geçmişi" title="Tüm yedek geçmişi"/>
+            <wp:cNvGraphicFramePr>
+              <a:graphicFrameLocks xmlns:a="http://schemas.openxmlformats.org/drawingml/2006/main" noChangeAspect="1"/>
+            </wp:cNvGraphicFramePr>
+            <a:graphic xmlns:a="http://schemas.openxmlformats.org/drawingml/2006/main">
+              <a:graphicData uri="http://schemas.openxmlformats.org/drawingml/2006/picture">
+                <pic:pic xmlns:pic="http://schemas.openxmlformats.org/drawingml/2006/picture">
+                  <pic:nvPicPr>
+                    <pic:cNvPr id="0" name="" descr=""/>
+                    <pic:cNvPicPr>
+                      <a:picLocks noChangeAspect="1" noChangeArrowheads="1"/>
+                    </pic:cNvPicPr>
+                  </pic:nvPicPr>
+                  <pic:blipFill>
+                    <a:blip r:embed="rId29" cstate="none"/>
+                    <a:srcRect/>
+                    <a:stretch>
+                      <a:fillRect/>
+                    </a:stretch>
+                  </pic:blipFill>
+                  <pic:spPr bwMode="auto">
+                    <a:xfrm>
+                      <a:off x="0" y="0"/>
+                      <a:ext cx="5334000" cy="1905000"/>
+                    </a:xfrm>
+                    <a:prstGeom prst="rect">
+                      <a:avLst/>
+                    </a:prstGeom>
+                  </pic:spPr>
+                </pic:pic>
+              </a:graphicData>
+            </a:graphic>
+          </wp:inline>
+        </w:drawing>
+      </w:r>
+    </w:p>
+    <w:p>
+      <w:pPr>
+        <w:spacing w:after="160" w:before="40"/>
+        <w:jc w:val="center"/>
+      </w:pPr>
+      <w:r>
+        <w:rPr>
+          <w:rFonts w:ascii="Times New Roman" w:cs="Times New Roman" w:eastAsia="Times New Roman" w:hAnsi="Times New Roman"/>
+          <w:i/>
+          <w:iCs/>
+          <w:sz w:val="18"/>
+          <w:szCs w:val="18"/>
+        </w:rPr>
+        <w:t xml:space="preserve">Şekil 21 – Tüm yedekler: Log(0.08MB) + 2×Tam(6.03MB) + Diferansiyel(0.78MB)</w:t>
+      </w:r>
+    </w:p>
+    <w:p>
+      <w:pPr>
+        <w:spacing w:after="100" w:before="100"/>
+      </w:pPr>
+    </w:p>
+    <w:p>
+      <w:pPr>
+        <w:pStyle w:val="Heading1"/>
+        <w:spacing w:after="120" w:before="320"/>
+      </w:pPr>
+      <w:r>
+        <w:rPr>
+          <w:rFonts w:ascii="Times New Roman" w:cs="Times New Roman" w:eastAsia="Times New Roman" w:hAnsi="Times New Roman"/>
+          <w:b/>
+          <w:bCs/>
+          <w:sz w:val="28"/>
+          <w:szCs w:val="28"/>
+        </w:rPr>
+        <w:t xml:space="preserve">7. Sonuç</w:t>
+      </w:r>
+    </w:p>
+    <w:p>
+      <w:pPr>
+        <w:spacing w:after="80" w:before="80"/>
+        <w:jc w:val="both"/>
+      </w:pPr>
+      <w:r>
+        <w:rPr>
+          <w:rFonts w:ascii="Times New Roman" w:cs="Times New Roman" w:eastAsia="Times New Roman" w:hAnsi="Times New Roman"/>
+          <w:sz w:val="22"/>
+          <w:szCs w:val="22"/>
+        </w:rPr>
+        <w:t xml:space="preserve">Bu proje kapsamında Chinook veritabanı üzerinde kapsamlı bir yedekleme ve felaketten kurtarma çalışması gerçekleştirilmiştir. Dört farklı yedekleme yöntemi uygulanmış ve geri yükleme senaryosu test edilmiştir.</w:t>
+      </w:r>
+    </w:p>
+    <w:p>
+      <w:pPr>
+        <w:spacing w:after="100" w:before="100"/>
+      </w:pPr>
+    </w:p>
+    <w:p>
+      <w:pPr>
+        <w:spacing w:after="80" w:before="80"/>
+        <w:jc w:val="both"/>
+      </w:pPr>
+      <w:r>
+        <w:rPr>
+          <w:rFonts w:ascii="Times New Roman" w:cs="Times New Roman" w:eastAsia="Times New Roman" w:hAnsi="Times New Roman"/>
+          <w:sz w:val="22"/>
+          <w:szCs w:val="22"/>
+        </w:rPr>
+        <w:t xml:space="preserve">Tam yedekleme ile veritabanı 0.030 saniyede yedeklenmiş ve RESTORE VERIFYONLY ile doğrulanmıştır. Diferansiyel yedeklemede yalnızca değişen veriler 0.007 saniyede yedeklenmiştir. Geri yükleme testinde tam yedek Chinook_Restored veritabanına başarıyla aktarılmıştır. Transaction Log Backup için veritabanı FULL recovery model'e alınmış ve log yedekleme 0.003 saniyede tamamlanmıştır.</w:t>
       </w:r>
     </w:p>
     <w:p>
@@ -3438,6 +4231,128 @@
           </w:p>
         </w:tc>
       </w:tr>
+      <w:tr>
+        <w:tc>
+          <w:tcPr>
+            <w:tcW w:type="dxa" w:w="2800"/>
+            <w:tcBorders>
+              <w:top w:val="single" w:color="AAAAAA" w:sz="1"/>
+              <w:left w:val="single" w:color="AAAAAA" w:sz="1"/>
+              <w:bottom w:val="single" w:color="AAAAAA" w:sz="1"/>
+              <w:right w:val="single" w:color="AAAAAA" w:sz="1"/>
+            </w:tcBorders>
+            <w:shd w:fill="FFFFFF" w:val="clear"/>
+            <w:tcMar>
+              <w:top w:type="dxa" w:w="60"/>
+              <w:left w:type="dxa" w:w="100"/>
+              <w:bottom w:type="dxa" w:w="60"/>
+              <w:right w:type="dxa" w:w="100"/>
+            </w:tcMar>
+          </w:tcPr>
+          <w:p>
+            <w:r>
+              <w:rPr>
+                <w:rFonts w:ascii="Times New Roman" w:cs="Times New Roman" w:eastAsia="Times New Roman" w:hAnsi="Times New Roman"/>
+                <w:b w:val="false"/>
+                <w:bCs w:val="false"/>
+                <w:sz w:val="20"/>
+                <w:szCs w:val="20"/>
+              </w:rPr>
+              <w:t xml:space="preserve">Transaction Log</w:t>
+            </w:r>
+          </w:p>
+        </w:tc>
+        <w:tc>
+          <w:tcPr>
+            <w:tcW w:type="dxa" w:w="2800"/>
+            <w:tcBorders>
+              <w:top w:val="single" w:color="AAAAAA" w:sz="1"/>
+              <w:left w:val="single" w:color="AAAAAA" w:sz="1"/>
+              <w:bottom w:val="single" w:color="AAAAAA" w:sz="1"/>
+              <w:right w:val="single" w:color="AAAAAA" w:sz="1"/>
+            </w:tcBorders>
+            <w:shd w:fill="FFFFFF" w:val="clear"/>
+            <w:tcMar>
+              <w:top w:type="dxa" w:w="60"/>
+              <w:left w:type="dxa" w:w="100"/>
+              <w:bottom w:type="dxa" w:w="60"/>
+              <w:right w:type="dxa" w:w="100"/>
+            </w:tcMar>
+          </w:tcPr>
+          <w:p>
+            <w:r>
+              <w:rPr>
+                <w:rFonts w:ascii="Times New Roman" w:cs="Times New Roman" w:eastAsia="Times New Roman" w:hAnsi="Times New Roman"/>
+                <w:b w:val="false"/>
+                <w:bCs w:val="false"/>
+                <w:sz w:val="20"/>
+                <w:szCs w:val="20"/>
+              </w:rPr>
+              <w:t xml:space="preserve">Chinook_Log.bak</w:t>
+            </w:r>
+          </w:p>
+        </w:tc>
+        <w:tc>
+          <w:tcPr>
+            <w:tcW w:type="dxa" w:w="1500"/>
+            <w:tcBorders>
+              <w:top w:val="single" w:color="AAAAAA" w:sz="1"/>
+              <w:left w:val="single" w:color="AAAAAA" w:sz="1"/>
+              <w:bottom w:val="single" w:color="AAAAAA" w:sz="1"/>
+              <w:right w:val="single" w:color="AAAAAA" w:sz="1"/>
+            </w:tcBorders>
+            <w:shd w:fill="FFFFFF" w:val="clear"/>
+            <w:tcMar>
+              <w:top w:type="dxa" w:w="60"/>
+              <w:left w:type="dxa" w:w="100"/>
+              <w:bottom w:type="dxa" w:w="60"/>
+              <w:right w:type="dxa" w:w="100"/>
+            </w:tcMar>
+          </w:tcPr>
+          <w:p>
+            <w:r>
+              <w:rPr>
+                <w:rFonts w:ascii="Times New Roman" w:cs="Times New Roman" w:eastAsia="Times New Roman" w:hAnsi="Times New Roman"/>
+                <w:b w:val="false"/>
+                <w:bCs w:val="false"/>
+                <w:sz w:val="20"/>
+                <w:szCs w:val="20"/>
+              </w:rPr>
+              <w:t xml:space="preserve">0.08 MB</w:t>
+            </w:r>
+          </w:p>
+        </w:tc>
+        <w:tc>
+          <w:tcPr>
+            <w:tcW w:type="dxa" w:w="1426"/>
+            <w:tcBorders>
+              <w:top w:val="single" w:color="AAAAAA" w:sz="1"/>
+              <w:left w:val="single" w:color="AAAAAA" w:sz="1"/>
+              <w:bottom w:val="single" w:color="AAAAAA" w:sz="1"/>
+              <w:right w:val="single" w:color="AAAAAA" w:sz="1"/>
+            </w:tcBorders>
+            <w:shd w:fill="FFFFFF" w:val="clear"/>
+            <w:tcMar>
+              <w:top w:type="dxa" w:w="60"/>
+              <w:left w:type="dxa" w:w="100"/>
+              <w:bottom w:type="dxa" w:w="60"/>
+              <w:right w:type="dxa" w:w="100"/>
+            </w:tcMar>
+          </w:tcPr>
+          <w:p>
+            <w:r>
+              <w:rPr>
+                <w:rFonts w:ascii="Times New Roman" w:cs="Times New Roman" w:eastAsia="Times New Roman" w:hAnsi="Times New Roman"/>
+                <w:b w:val="false"/>
+                <w:bCs w:val="false"/>
+                <w:sz w:val="20"/>
+                <w:szCs w:val="20"/>
+              </w:rPr>
+              <w:t xml:space="preserve">0.003 sn</w:t>
+            </w:r>
+          </w:p>
+        </w:tc>
+      </w:tr>
     </w:tbl>
     <w:p>
       <w:pPr>

</xml_diff>

<commit_message>
Proje2 Adim7: Otomatik yedekleme - SQL Server Agent job tanimi, zamanlayici kurulumu
</commit_message>
<xml_diff>
--- a/Proje2-YedeklemeveKurtarma/Proje2_Rapor.docx
+++ b/Proje2-YedeklemeveKurtarma/Proje2_Rapor.docx
@@ -776,7 +776,7 @@
         </w:rPr>
         <w:lastRenderedPageBreak/>
         <w:drawing>
-          <wp:inline distT="0" distB="0" distL="0" distR="0" wp14:anchorId="6BF365CF" wp14:editId="7395B86C">
+          <wp:inline distT="0" distB="0" distL="0" distR="0" wp14:anchorId="06F81604" wp14:editId="767139C4">
             <wp:extent cx="3238500" cy="3048000"/>
             <wp:effectExtent l="0" t="0" r="0" b="0"/>
             <wp:docPr id="1" name="Tablo listesi" descr="Tablo listesi" title="Tablo listesi"/>
@@ -1411,10 +1411,10 @@
           <w:noProof/>
         </w:rPr>
         <w:drawing>
-          <wp:inline distT="0" distB="0" distL="0" distR="0" wp14:anchorId="51D0FBBF" wp14:editId="5956B99C">
+          <wp:inline distT="0" distB="0" distL="0" distR="0" wp14:anchorId="70C21BBF" wp14:editId="61AF5EDA">
             <wp:extent cx="3619500" cy="2667000"/>
             <wp:effectExtent l="0" t="0" r="0" b="0"/>
-            <wp:docPr id="972199123" name="Kayıt sayıları" descr="Kayıt sayıları" title="Kayıt sayıları"/>
+            <wp:docPr id="1868543445" name="Kayıt sayıları" descr="Kayıt sayıları" title="Kayıt sayıları"/>
             <wp:cNvGraphicFramePr>
               <a:graphicFrameLocks xmlns:a="http://schemas.openxmlformats.org/drawingml/2006/main" noChangeAspect="1"/>
             </wp:cNvGraphicFramePr>
@@ -1673,10 +1673,10 @@
         </w:rPr>
         <w:lastRenderedPageBreak/>
         <w:drawing>
-          <wp:inline distT="0" distB="0" distL="0" distR="0" wp14:anchorId="6F1B6CBC" wp14:editId="0A276B0D">
+          <wp:inline distT="0" distB="0" distL="0" distR="0" wp14:anchorId="1FD6C3C3" wp14:editId="0D20DF44">
             <wp:extent cx="4381500" cy="3429000"/>
             <wp:effectExtent l="0" t="0" r="0" b="0"/>
-            <wp:docPr id="882599883" name="Sütun yapısı 1" descr="Sütun yapısı 1" title="Sütun yapısı 1"/>
+            <wp:docPr id="1245111065" name="Sütun yapısı 1" descr="Sütun yapısı 1" title="Sütun yapısı 1"/>
             <wp:cNvGraphicFramePr>
               <a:graphicFrameLocks xmlns:a="http://schemas.openxmlformats.org/drawingml/2006/main" noChangeAspect="1"/>
             </wp:cNvGraphicFramePr>
@@ -1777,10 +1777,10 @@
           <w:noProof/>
         </w:rPr>
         <w:drawing>
-          <wp:inline distT="0" distB="0" distL="0" distR="0" wp14:anchorId="254283DA" wp14:editId="03C90988">
+          <wp:inline distT="0" distB="0" distL="0" distR="0" wp14:anchorId="4121FBDC" wp14:editId="4FC7FDB0">
             <wp:extent cx="4381500" cy="3429000"/>
             <wp:effectExtent l="0" t="0" r="0" b="0"/>
-            <wp:docPr id="158523159" name="Sütun yapısı 2" descr="Sütun yapısı 2" title="Sütun yapısı 2"/>
+            <wp:docPr id="2068452106" name="Sütun yapısı 2" descr="Sütun yapısı 2" title="Sütun yapısı 2"/>
             <wp:cNvGraphicFramePr>
               <a:graphicFrameLocks xmlns:a="http://schemas.openxmlformats.org/drawingml/2006/main" noChangeAspect="1"/>
             </wp:cNvGraphicFramePr>
@@ -1902,10 +1902,10 @@
         </w:rPr>
         <w:lastRenderedPageBreak/>
         <w:drawing>
-          <wp:inline distT="0" distB="0" distL="0" distR="0" wp14:anchorId="527F56E2" wp14:editId="7A3509F1">
+          <wp:inline distT="0" distB="0" distL="0" distR="0" wp14:anchorId="465C2FD0" wp14:editId="59A32776">
             <wp:extent cx="4381500" cy="2667000"/>
             <wp:effectExtent l="0" t="0" r="0" b="0"/>
-            <wp:docPr id="802545463" name="Sütun yapısı 3" descr="Sütun yapısı 3" title="Sütun yapısı 3"/>
+            <wp:docPr id="1400037242" name="Sütun yapısı 3" descr="Sütun yapısı 3" title="Sütun yapısı 3"/>
             <wp:cNvGraphicFramePr>
               <a:graphicFrameLocks xmlns:a="http://schemas.openxmlformats.org/drawingml/2006/main" noChangeAspect="1"/>
             </wp:cNvGraphicFramePr>
@@ -2050,10 +2050,10 @@
           <w:noProof/>
         </w:rPr>
         <w:drawing>
-          <wp:inline distT="0" distB="0" distL="0" distR="0" wp14:anchorId="5FCB6DB1" wp14:editId="1A3C04FB">
+          <wp:inline distT="0" distB="0" distL="0" distR="0" wp14:anchorId="632DBF18" wp14:editId="6D08E4C4">
             <wp:extent cx="5334000" cy="2667000"/>
             <wp:effectExtent l="0" t="0" r="0" b="0"/>
-            <wp:docPr id="832986831" name="Örnek veri" descr="Örnek veri" title="Örnek veri"/>
+            <wp:docPr id="1540173287" name="Örnek veri" descr="Örnek veri" title="Örnek veri"/>
             <wp:cNvGraphicFramePr>
               <a:graphicFrameLocks xmlns:a="http://schemas.openxmlformats.org/drawingml/2006/main" noChangeAspect="1"/>
             </wp:cNvGraphicFramePr>
@@ -2437,10 +2437,10 @@
           <w:noProof/>
         </w:rPr>
         <w:drawing>
-          <wp:inline distT="0" distB="0" distL="0" distR="0" wp14:anchorId="0B97D752" wp14:editId="5B2C18DD">
+          <wp:inline distT="0" distB="0" distL="0" distR="0" wp14:anchorId="093D265F" wp14:editId="09F5C509">
             <wp:extent cx="5143500" cy="2476500"/>
             <wp:effectExtent l="0" t="0" r="0" b="0"/>
-            <wp:docPr id="575141555" name="Tam yedekleme" descr="Tam yedekleme" title="Tam yedekleme"/>
+            <wp:docPr id="1188607943" name="Tam yedekleme" descr="Tam yedekleme" title="Tam yedekleme"/>
             <wp:cNvGraphicFramePr>
               <a:graphicFrameLocks xmlns:a="http://schemas.openxmlformats.org/drawingml/2006/main" noChangeAspect="1"/>
             </wp:cNvGraphicFramePr>
@@ -2623,10 +2623,10 @@
           <w:noProof/>
         </w:rPr>
         <w:drawing>
-          <wp:inline distT="0" distB="0" distL="0" distR="0" wp14:anchorId="45C2B957" wp14:editId="5A4D1D63">
+          <wp:inline distT="0" distB="0" distL="0" distR="0" wp14:anchorId="3494986D" wp14:editId="43A8633E">
             <wp:extent cx="5143500" cy="2095500"/>
             <wp:effectExtent l="0" t="0" r="0" b="0"/>
-            <wp:docPr id="1516909240" name="Yedek doğrulama" descr="Yedek doğrulama" title="Yedek doğrulama"/>
+            <wp:docPr id="921375241" name="Yedek doğrulama" descr="Yedek doğrulama" title="Yedek doğrulama"/>
             <wp:cNvGraphicFramePr>
               <a:graphicFrameLocks xmlns:a="http://schemas.openxmlformats.org/drawingml/2006/main" noChangeAspect="1"/>
             </wp:cNvGraphicFramePr>
@@ -3029,10 +3029,10 @@
           <w:noProof/>
         </w:rPr>
         <w:drawing>
-          <wp:inline distT="0" distB="0" distL="0" distR="0" wp14:anchorId="5B6D568D" wp14:editId="0C9E352B">
+          <wp:inline distT="0" distB="0" distL="0" distR="0" wp14:anchorId="2DF40C9A" wp14:editId="069449F0">
             <wp:extent cx="3619500" cy="3619500"/>
             <wp:effectExtent l="0" t="0" r="0" b="0"/>
-            <wp:docPr id="1470121781" name="Genre tablosu 1" descr="Genre tablosu 1" title="Genre tablosu 1"/>
+            <wp:docPr id="128381332" name="Genre tablosu 1" descr="Genre tablosu 1" title="Genre tablosu 1"/>
             <wp:cNvGraphicFramePr>
               <a:graphicFrameLocks xmlns:a="http://schemas.openxmlformats.org/drawingml/2006/main" noChangeAspect="1"/>
             </wp:cNvGraphicFramePr>
@@ -3114,10 +3114,10 @@
         </w:rPr>
         <w:lastRenderedPageBreak/>
         <w:drawing>
-          <wp:inline distT="0" distB="0" distL="0" distR="0" wp14:anchorId="2C6A7336" wp14:editId="0AD2A820">
+          <wp:inline distT="0" distB="0" distL="0" distR="0" wp14:anchorId="01E53570" wp14:editId="513FB479">
             <wp:extent cx="3619500" cy="3238500"/>
             <wp:effectExtent l="0" t="0" r="0" b="0"/>
-            <wp:docPr id="1923400004" name="Genre tablosu 2" descr="Genre tablosu 2" title="Genre tablosu 2"/>
+            <wp:docPr id="16634692" name="Genre tablosu 2" descr="Genre tablosu 2" title="Genre tablosu 2"/>
             <wp:cNvGraphicFramePr>
               <a:graphicFrameLocks xmlns:a="http://schemas.openxmlformats.org/drawingml/2006/main" noChangeAspect="1"/>
             </wp:cNvGraphicFramePr>
@@ -3509,10 +3509,10 @@
           <w:noProof/>
         </w:rPr>
         <w:drawing>
-          <wp:inline distT="0" distB="0" distL="0" distR="0" wp14:anchorId="4E888E5E" wp14:editId="67CA9592">
+          <wp:inline distT="0" distB="0" distL="0" distR="0" wp14:anchorId="13FB54F0" wp14:editId="2BF6308A">
             <wp:extent cx="5143500" cy="2286000"/>
             <wp:effectExtent l="0" t="0" r="0" b="0"/>
-            <wp:docPr id="1878445364" name="Diferansiyel yedek" descr="Diferansiyel yedek" title="Diferansiyel yedek"/>
+            <wp:docPr id="1043567345" name="Diferansiyel yedek" descr="Diferansiyel yedek" title="Diferansiyel yedek"/>
             <wp:cNvGraphicFramePr>
               <a:graphicFrameLocks xmlns:a="http://schemas.openxmlformats.org/drawingml/2006/main" noChangeAspect="1"/>
             </wp:cNvGraphicFramePr>
@@ -4074,10 +4074,10 @@
           <w:noProof/>
         </w:rPr>
         <w:drawing>
-          <wp:inline distT="0" distB="0" distL="0" distR="0" wp14:anchorId="61D8F1AE" wp14:editId="5ABC92C6">
+          <wp:inline distT="0" distB="0" distL="0" distR="0" wp14:anchorId="1EB0DE33" wp14:editId="0249099F">
             <wp:extent cx="5334000" cy="1714500"/>
             <wp:effectExtent l="0" t="0" r="0" b="0"/>
-            <wp:docPr id="853716938" name="Yedek geçmişi" descr="Yedek geçmişi" title="Yedek geçmişi"/>
+            <wp:docPr id="1539607443" name="Yedek geçmişi" descr="Yedek geçmişi" title="Yedek geçmişi"/>
             <wp:cNvGraphicFramePr>
               <a:graphicFrameLocks xmlns:a="http://schemas.openxmlformats.org/drawingml/2006/main" noChangeAspect="1"/>
             </wp:cNvGraphicFramePr>
@@ -4499,10 +4499,10 @@
         </w:rPr>
         <w:lastRenderedPageBreak/>
         <w:drawing>
-          <wp:inline distT="0" distB="0" distL="0" distR="0" wp14:anchorId="0F57ABB8" wp14:editId="31637A00">
+          <wp:inline distT="0" distB="0" distL="0" distR="0" wp14:anchorId="4702C9FD" wp14:editId="510BD5B7">
             <wp:extent cx="5143500" cy="2286000"/>
             <wp:effectExtent l="0" t="0" r="0" b="0"/>
-            <wp:docPr id="299870809" name="Geri yükleme" descr="Geri yükleme" title="Geri yükleme"/>
+            <wp:docPr id="980870160" name="Geri yükleme" descr="Geri yükleme" title="Geri yükleme"/>
             <wp:cNvGraphicFramePr>
               <a:graphicFrameLocks xmlns:a="http://schemas.openxmlformats.org/drawingml/2006/main" noChangeAspect="1"/>
             </wp:cNvGraphicFramePr>
@@ -4758,10 +4758,10 @@
           <w:noProof/>
         </w:rPr>
         <w:drawing>
-          <wp:inline distT="0" distB="0" distL="0" distR="0" wp14:anchorId="504C28C4" wp14:editId="14C4CE15">
+          <wp:inline distT="0" distB="0" distL="0" distR="0" wp14:anchorId="4E12A00D" wp14:editId="3B92F302">
             <wp:extent cx="3619500" cy="3619500"/>
             <wp:effectExtent l="0" t="0" r="0" b="0"/>
-            <wp:docPr id="1601541297" name="Doğrulama 1" descr="Doğrulama 1" title="Doğrulama 1"/>
+            <wp:docPr id="969568513" name="Doğrulama 1" descr="Doğrulama 1" title="Doğrulama 1"/>
             <wp:cNvGraphicFramePr>
               <a:graphicFrameLocks xmlns:a="http://schemas.openxmlformats.org/drawingml/2006/main" noChangeAspect="1"/>
             </wp:cNvGraphicFramePr>
@@ -4863,10 +4863,10 @@
         </w:rPr>
         <w:lastRenderedPageBreak/>
         <w:drawing>
-          <wp:inline distT="0" distB="0" distL="0" distR="0" wp14:anchorId="5D22BE2A" wp14:editId="18E6367D">
+          <wp:inline distT="0" distB="0" distL="0" distR="0" wp14:anchorId="0F8156DE" wp14:editId="6FEE2C88">
             <wp:extent cx="3619500" cy="3048000"/>
             <wp:effectExtent l="0" t="0" r="0" b="0"/>
-            <wp:docPr id="249833918" name="Doğrulama 2" descr="Doğrulama 2" title="Doğrulama 2"/>
+            <wp:docPr id="586629517" name="Doğrulama 2" descr="Doğrulama 2" title="Doğrulama 2"/>
             <wp:cNvGraphicFramePr>
               <a:graphicFrameLocks xmlns:a="http://schemas.openxmlformats.org/drawingml/2006/main" noChangeAspect="1"/>
             </wp:cNvGraphicFramePr>
@@ -4967,10 +4967,10 @@
           <w:noProof/>
         </w:rPr>
         <w:drawing>
-          <wp:inline distT="0" distB="0" distL="0" distR="0" wp14:anchorId="52C51C18" wp14:editId="6ED3B7E2">
+          <wp:inline distT="0" distB="0" distL="0" distR="0" wp14:anchorId="1F2F4BDA" wp14:editId="747DBA24">
             <wp:extent cx="3619500" cy="2667000"/>
             <wp:effectExtent l="0" t="0" r="0" b="0"/>
-            <wp:docPr id="142679470" name="Doğrulama 3" descr="Doğrulama 3" title="Doğrulama 3"/>
+            <wp:docPr id="1516585273" name="Doğrulama 3" descr="Doğrulama 3" title="Doğrulama 3"/>
             <wp:cNvGraphicFramePr>
               <a:graphicFrameLocks xmlns:a="http://schemas.openxmlformats.org/drawingml/2006/main" noChangeAspect="1"/>
             </wp:cNvGraphicFramePr>
@@ -5584,10 +5584,10 @@
           <w:noProof/>
         </w:rPr>
         <w:drawing>
-          <wp:inline distT="0" distB="0" distL="0" distR="0" wp14:anchorId="4B4239E9" wp14:editId="46B46D32">
+          <wp:inline distT="0" distB="0" distL="0" distR="0" wp14:anchorId="165AF004" wp14:editId="39B68386">
             <wp:extent cx="4381500" cy="2095500"/>
             <wp:effectExtent l="0" t="0" r="0" b="0"/>
-            <wp:docPr id="649907076" name="SIMPLE recovery model" descr="SIMPLE recovery model" title="SIMPLE recovery model"/>
+            <wp:docPr id="1170860563" name="SIMPLE recovery model" descr="SIMPLE recovery model" title="SIMPLE recovery model"/>
             <wp:cNvGraphicFramePr>
               <a:graphicFrameLocks xmlns:a="http://schemas.openxmlformats.org/drawingml/2006/main" noChangeAspect="1"/>
             </wp:cNvGraphicFramePr>
@@ -5688,10 +5688,10 @@
           <w:noProof/>
         </w:rPr>
         <w:drawing>
-          <wp:inline distT="0" distB="0" distL="0" distR="0" wp14:anchorId="12CDF0EE" wp14:editId="01A0A52B">
+          <wp:inline distT="0" distB="0" distL="0" distR="0" wp14:anchorId="29E07CC1" wp14:editId="241EC01F">
             <wp:extent cx="4381500" cy="2095500"/>
             <wp:effectExtent l="0" t="0" r="0" b="0"/>
-            <wp:docPr id="503649289" name="FULL recovery model" descr="FULL recovery model" title="FULL recovery model"/>
+            <wp:docPr id="1389606978" name="FULL recovery model" descr="FULL recovery model" title="FULL recovery model"/>
             <wp:cNvGraphicFramePr>
               <a:graphicFrameLocks xmlns:a="http://schemas.openxmlformats.org/drawingml/2006/main" noChangeAspect="1"/>
             </wp:cNvGraphicFramePr>
@@ -5901,10 +5901,10 @@
         </w:rPr>
         <w:lastRenderedPageBreak/>
         <w:drawing>
-          <wp:inline distT="0" distB="0" distL="0" distR="0" wp14:anchorId="0AED19C6" wp14:editId="4502686B">
+          <wp:inline distT="0" distB="0" distL="0" distR="0" wp14:anchorId="4ABD2E17" wp14:editId="569E1779">
             <wp:extent cx="4953000" cy="2095500"/>
             <wp:effectExtent l="0" t="0" r="0" b="0"/>
-            <wp:docPr id="1540436711" name="Tam yedek 2" descr="Tam yedek 2" title="Tam yedek 2"/>
+            <wp:docPr id="2111392162" name="Tam yedek 2" descr="Tam yedek 2" title="Tam yedek 2"/>
             <wp:cNvGraphicFramePr>
               <a:graphicFrameLocks xmlns:a="http://schemas.openxmlformats.org/drawingml/2006/main" noChangeAspect="1"/>
             </wp:cNvGraphicFramePr>
@@ -6139,10 +6139,10 @@
           <w:noProof/>
         </w:rPr>
         <w:drawing>
-          <wp:inline distT="0" distB="0" distL="0" distR="0" wp14:anchorId="086CABA7" wp14:editId="4C01C822">
+          <wp:inline distT="0" distB="0" distL="0" distR="0" wp14:anchorId="09F7651C" wp14:editId="72EEA914">
             <wp:extent cx="4953000" cy="2000250"/>
             <wp:effectExtent l="0" t="0" r="0" b="0"/>
-            <wp:docPr id="981767435" name="Log backup" descr="Log backup" title="Log backup"/>
+            <wp:docPr id="763436435" name="Log backup" descr="Log backup" title="Log backup"/>
             <wp:cNvGraphicFramePr>
               <a:graphicFrameLocks xmlns:a="http://schemas.openxmlformats.org/drawingml/2006/main" noChangeAspect="1"/>
             </wp:cNvGraphicFramePr>
@@ -6721,10 +6721,10 @@
         </w:rPr>
         <w:lastRenderedPageBreak/>
         <w:drawing>
-          <wp:inline distT="0" distB="0" distL="0" distR="0" wp14:anchorId="7B67AF78" wp14:editId="53C376BE">
+          <wp:inline distT="0" distB="0" distL="0" distR="0" wp14:anchorId="48D9502A" wp14:editId="53E52450">
             <wp:extent cx="5334000" cy="1905000"/>
             <wp:effectExtent l="0" t="0" r="0" b="0"/>
-            <wp:docPr id="2014886622" name="Tüm yedek geçmişi" descr="Tüm yedek geçmişi" title="Tüm yedek geçmişi"/>
+            <wp:docPr id="414355771" name="Tüm yedek geçmişi" descr="Tüm yedek geçmişi" title="Tüm yedek geçmişi"/>
             <wp:cNvGraphicFramePr>
               <a:graphicFrameLocks xmlns:a="http://schemas.openxmlformats.org/drawingml/2006/main" noChangeAspect="1"/>
             </wp:cNvGraphicFramePr>
@@ -7136,10 +7136,10 @@
           <w:noProof/>
         </w:rPr>
         <w:drawing>
-          <wp:inline distT="0" distB="0" distL="0" distR="0" wp14:anchorId="0CAF4373" wp14:editId="3ABB3FE3">
+          <wp:inline distT="0" distB="0" distL="0" distR="0" wp14:anchorId="18AEEEBA" wp14:editId="0A090AFF">
             <wp:extent cx="4381500" cy="3048000"/>
             <wp:effectExtent l="0" t="0" r="0" b="0"/>
-            <wp:docPr id="371496842" name="Felaket simülasyonu" descr="Felaket simülasyonu" title="Felaket simülasyonu"/>
+            <wp:docPr id="1080737452" name="Felaket simülasyonu" descr="Felaket simülasyonu" title="Felaket simülasyonu"/>
             <wp:cNvGraphicFramePr>
               <a:graphicFrameLocks xmlns:a="http://schemas.openxmlformats.org/drawingml/2006/main" noChangeAspect="1"/>
             </wp:cNvGraphicFramePr>
@@ -7353,10 +7353,10 @@
           <w:noProof/>
         </w:rPr>
         <w:drawing>
-          <wp:inline distT="0" distB="0" distL="0" distR="0" wp14:anchorId="3C8EA847" wp14:editId="47DA8A34">
+          <wp:inline distT="0" distB="0" distL="0" distR="0" wp14:anchorId="17F79FAC" wp14:editId="11B54475">
             <wp:extent cx="4381500" cy="2857500"/>
             <wp:effectExtent l="0" t="0" r="0" b="0"/>
-            <wp:docPr id="1460394579" name="Başarısız kurtarma" descr="Başarısız kurtarma" title="Başarısız kurtarma"/>
+            <wp:docPr id="655538033" name="Başarısız kurtarma" descr="Başarısız kurtarma" title="Başarısız kurtarma"/>
             <wp:cNvGraphicFramePr>
               <a:graphicFrameLocks xmlns:a="http://schemas.openxmlformats.org/drawingml/2006/main" noChangeAspect="1"/>
             </wp:cNvGraphicFramePr>
@@ -7715,10 +7715,10 @@
         </w:rPr>
         <w:lastRenderedPageBreak/>
         <w:drawing>
-          <wp:inline distT="0" distB="0" distL="0" distR="0" wp14:anchorId="25F4C1A3" wp14:editId="39B54E66">
+          <wp:inline distT="0" distB="0" distL="0" distR="0" wp14:anchorId="720FEE1B" wp14:editId="682E6516">
             <wp:extent cx="4953000" cy="2095500"/>
             <wp:effectExtent l="0" t="0" r="0" b="0"/>
-            <wp:docPr id="2135486002" name="Chinook_Recovery oluşturma" descr="Chinook_Recovery oluşturma" title="Chinook_Recovery oluşturma"/>
+            <wp:docPr id="326335909" name="Chinook_Recovery oluşturma" descr="Chinook_Recovery oluşturma" title="Chinook_Recovery oluşturma"/>
             <wp:cNvGraphicFramePr>
               <a:graphicFrameLocks xmlns:a="http://schemas.openxmlformats.org/drawingml/2006/main" noChangeAspect="1"/>
             </wp:cNvGraphicFramePr>
@@ -8170,10 +8170,10 @@
           <w:noProof/>
         </w:rPr>
         <w:drawing>
-          <wp:inline distT="0" distB="0" distL="0" distR="0" wp14:anchorId="7B8D8421" wp14:editId="7F12E776">
+          <wp:inline distT="0" distB="0" distL="0" distR="0" wp14:anchorId="56E8F0C1" wp14:editId="41690E4E">
             <wp:extent cx="4572000" cy="3048000"/>
             <wp:effectExtent l="0" t="0" r="0" b="0"/>
-            <wp:docPr id="275777599" name="Kurtarma başarılı" descr="Kurtarma başarılı" title="Kurtarma başarılı"/>
+            <wp:docPr id="1603833296" name="Kurtarma başarılı" descr="Kurtarma başarılı" title="Kurtarma başarılı"/>
             <wp:cNvGraphicFramePr>
               <a:graphicFrameLocks xmlns:a="http://schemas.openxmlformats.org/drawingml/2006/main" noChangeAspect="1"/>
             </wp:cNvGraphicFramePr>
@@ -8322,14 +8322,8 @@
       <w:pPr>
         <w:pStyle w:val="Balk1"/>
       </w:pPr>
-    </w:p>
-    <w:p>
-      <w:pPr>
-        <w:pStyle w:val="Balk1"/>
-      </w:pPr>
-      <w:r>
-        <w:lastRenderedPageBreak/>
-        <w:t>8. Sonuç</w:t>
+      <w:r>
+        <w:t>8. Zamanlayıcılarla Otomatik Yedekleme</w:t>
       </w:r>
     </w:p>
     <w:p>
@@ -8338,6 +8332,697 @@
         <w:jc w:val="both"/>
       </w:pPr>
       <w:r>
+        <w:lastRenderedPageBreak/>
+        <w:t xml:space="preserve">Otomatik yedekleme, insan müdahalesi olmadan düzenli aralıklarla yedek alınmasını sağlar. SQL Server ortamında bu işlem SQL Server Agent üzerinden </w:t>
+      </w:r>
+      <w:proofErr w:type="spellStart"/>
+      <w:r>
+        <w:t>Job</w:t>
+      </w:r>
+      <w:proofErr w:type="spellEnd"/>
+      <w:r>
+        <w:t xml:space="preserve"> tanımlanarak gerçekleştirilir.</w:t>
+      </w:r>
+    </w:p>
+    <w:p>
+      <w:pPr>
+        <w:spacing w:before="100" w:after="100"/>
+      </w:pPr>
+    </w:p>
+    <w:p>
+      <w:pPr>
+        <w:pStyle w:val="Balk2"/>
+      </w:pPr>
+      <w:r>
+        <w:t xml:space="preserve">8.1 SQL Server Agent </w:t>
+      </w:r>
+      <w:proofErr w:type="spellStart"/>
+      <w:r>
+        <w:t>Job</w:t>
+      </w:r>
+      <w:proofErr w:type="spellEnd"/>
+      <w:r>
+        <w:t xml:space="preserve"> Tanımı</w:t>
+      </w:r>
+    </w:p>
+    <w:p>
+      <w:pPr>
+        <w:spacing w:before="80" w:after="80"/>
+        <w:jc w:val="both"/>
+      </w:pPr>
+      <w:proofErr w:type="spellStart"/>
+      <w:proofErr w:type="gramStart"/>
+      <w:r>
+        <w:t>msdb</w:t>
+      </w:r>
+      <w:proofErr w:type="spellEnd"/>
+      <w:proofErr w:type="gramEnd"/>
+      <w:r>
+        <w:t xml:space="preserve"> </w:t>
+      </w:r>
+      <w:proofErr w:type="spellStart"/>
+      <w:r>
+        <w:t>veritabanında</w:t>
+      </w:r>
+      <w:proofErr w:type="spellEnd"/>
+      <w:r>
+        <w:t xml:space="preserve"> </w:t>
+      </w:r>
+      <w:proofErr w:type="spellStart"/>
+      <w:r>
+        <w:t>sp_add_job</w:t>
+      </w:r>
+      <w:proofErr w:type="spellEnd"/>
+      <w:r>
+        <w:t xml:space="preserve">, </w:t>
+      </w:r>
+      <w:proofErr w:type="spellStart"/>
+      <w:r>
+        <w:t>sp_add_jobstep</w:t>
+      </w:r>
+      <w:proofErr w:type="spellEnd"/>
+      <w:r>
+        <w:t xml:space="preserve"> ve </w:t>
+      </w:r>
+      <w:proofErr w:type="spellStart"/>
+      <w:r>
+        <w:t>sp_add_schedule</w:t>
+      </w:r>
+      <w:proofErr w:type="spellEnd"/>
+      <w:r>
+        <w:t xml:space="preserve"> prosedürleri kullanılarak her gece otomatik tam yedek alacak bir </w:t>
+      </w:r>
+      <w:proofErr w:type="spellStart"/>
+      <w:r>
+        <w:t>job</w:t>
+      </w:r>
+      <w:proofErr w:type="spellEnd"/>
+      <w:r>
+        <w:t xml:space="preserve"> tanımlanmıştır.</w:t>
+      </w:r>
+    </w:p>
+    <w:p>
+      <w:pPr>
+        <w:shd w:val="clear" w:color="auto" w:fill="F2F2F2"/>
+      </w:pPr>
+      <w:r>
+        <w:rPr>
+          <w:rFonts w:ascii="Courier New" w:eastAsia="Courier New" w:hAnsi="Courier New" w:cs="Courier New"/>
+          <w:sz w:val="18"/>
+          <w:szCs w:val="18"/>
+        </w:rPr>
+        <w:t xml:space="preserve">USE </w:t>
+      </w:r>
+      <w:proofErr w:type="spellStart"/>
+      <w:r>
+        <w:rPr>
+          <w:rFonts w:ascii="Courier New" w:eastAsia="Courier New" w:hAnsi="Courier New" w:cs="Courier New"/>
+          <w:sz w:val="18"/>
+          <w:szCs w:val="18"/>
+        </w:rPr>
+        <w:t>msdb</w:t>
+      </w:r>
+      <w:proofErr w:type="spellEnd"/>
+      <w:r>
+        <w:rPr>
+          <w:rFonts w:ascii="Courier New" w:eastAsia="Courier New" w:hAnsi="Courier New" w:cs="Courier New"/>
+          <w:sz w:val="18"/>
+          <w:szCs w:val="18"/>
+        </w:rPr>
+        <w:t>;</w:t>
+      </w:r>
+    </w:p>
+    <w:p>
+      <w:pPr>
+        <w:shd w:val="clear" w:color="auto" w:fill="F2F2F2"/>
+      </w:pPr>
+    </w:p>
+    <w:p>
+      <w:pPr>
+        <w:shd w:val="clear" w:color="auto" w:fill="F2F2F2"/>
+      </w:pPr>
+      <w:r>
+        <w:rPr>
+          <w:rFonts w:ascii="Courier New" w:eastAsia="Courier New" w:hAnsi="Courier New" w:cs="Courier New"/>
+          <w:sz w:val="18"/>
+          <w:szCs w:val="18"/>
+        </w:rPr>
+        <w:t xml:space="preserve">EXEC </w:t>
+      </w:r>
+      <w:proofErr w:type="spellStart"/>
+      <w:r>
+        <w:rPr>
+          <w:rFonts w:ascii="Courier New" w:eastAsia="Courier New" w:hAnsi="Courier New" w:cs="Courier New"/>
+          <w:sz w:val="18"/>
+          <w:szCs w:val="18"/>
+        </w:rPr>
+        <w:t>sp_add_job</w:t>
+      </w:r>
+      <w:proofErr w:type="spellEnd"/>
+      <w:r>
+        <w:rPr>
+          <w:rFonts w:ascii="Courier New" w:eastAsia="Courier New" w:hAnsi="Courier New" w:cs="Courier New"/>
+          <w:sz w:val="18"/>
+          <w:szCs w:val="18"/>
+        </w:rPr>
+        <w:t xml:space="preserve"> @job_name = </w:t>
+      </w:r>
+      <w:proofErr w:type="spellStart"/>
+      <w:r>
+        <w:rPr>
+          <w:rFonts w:ascii="Courier New" w:eastAsia="Courier New" w:hAnsi="Courier New" w:cs="Courier New"/>
+          <w:sz w:val="18"/>
+          <w:szCs w:val="18"/>
+        </w:rPr>
+        <w:t>N'Chinook_Otomatik_Yedekleme</w:t>
+      </w:r>
+      <w:proofErr w:type="spellEnd"/>
+      <w:r>
+        <w:rPr>
+          <w:rFonts w:ascii="Courier New" w:eastAsia="Courier New" w:hAnsi="Courier New" w:cs="Courier New"/>
+          <w:sz w:val="18"/>
+          <w:szCs w:val="18"/>
+        </w:rPr>
+        <w:t>';</w:t>
+      </w:r>
+    </w:p>
+    <w:p>
+      <w:pPr>
+        <w:shd w:val="clear" w:color="auto" w:fill="F2F2F2"/>
+      </w:pPr>
+    </w:p>
+    <w:p>
+      <w:pPr>
+        <w:shd w:val="clear" w:color="auto" w:fill="F2F2F2"/>
+      </w:pPr>
+      <w:r>
+        <w:rPr>
+          <w:rFonts w:ascii="Courier New" w:eastAsia="Courier New" w:hAnsi="Courier New" w:cs="Courier New"/>
+          <w:sz w:val="18"/>
+          <w:szCs w:val="18"/>
+        </w:rPr>
+        <w:t xml:space="preserve">EXEC </w:t>
+      </w:r>
+      <w:proofErr w:type="spellStart"/>
+      <w:r>
+        <w:rPr>
+          <w:rFonts w:ascii="Courier New" w:eastAsia="Courier New" w:hAnsi="Courier New" w:cs="Courier New"/>
+          <w:sz w:val="18"/>
+          <w:szCs w:val="18"/>
+        </w:rPr>
+        <w:t>sp_add_jobstep</w:t>
+      </w:r>
+      <w:proofErr w:type="spellEnd"/>
+    </w:p>
+    <w:p>
+      <w:pPr>
+        <w:shd w:val="clear" w:color="auto" w:fill="F2F2F2"/>
+      </w:pPr>
+      <w:r>
+        <w:rPr>
+          <w:rFonts w:ascii="Courier New" w:eastAsia="Courier New" w:hAnsi="Courier New" w:cs="Courier New"/>
+          <w:sz w:val="18"/>
+          <w:szCs w:val="18"/>
+        </w:rPr>
+        <w:t xml:space="preserve">    @job_name = </w:t>
+      </w:r>
+      <w:proofErr w:type="spellStart"/>
+      <w:r>
+        <w:rPr>
+          <w:rFonts w:ascii="Courier New" w:eastAsia="Courier New" w:hAnsi="Courier New" w:cs="Courier New"/>
+          <w:sz w:val="18"/>
+          <w:szCs w:val="18"/>
+        </w:rPr>
+        <w:t>N'Chinook_Otomatik_Yedekleme</w:t>
+      </w:r>
+      <w:proofErr w:type="spellEnd"/>
+      <w:r>
+        <w:rPr>
+          <w:rFonts w:ascii="Courier New" w:eastAsia="Courier New" w:hAnsi="Courier New" w:cs="Courier New"/>
+          <w:sz w:val="18"/>
+          <w:szCs w:val="18"/>
+        </w:rPr>
+        <w:t>',</w:t>
+      </w:r>
+    </w:p>
+    <w:p>
+      <w:pPr>
+        <w:shd w:val="clear" w:color="auto" w:fill="F2F2F2"/>
+      </w:pPr>
+      <w:r>
+        <w:rPr>
+          <w:rFonts w:ascii="Courier New" w:eastAsia="Courier New" w:hAnsi="Courier New" w:cs="Courier New"/>
+          <w:sz w:val="18"/>
+          <w:szCs w:val="18"/>
+        </w:rPr>
+        <w:t xml:space="preserve">    @step_name = </w:t>
+      </w:r>
+      <w:proofErr w:type="spellStart"/>
+      <w:r>
+        <w:rPr>
+          <w:rFonts w:ascii="Courier New" w:eastAsia="Courier New" w:hAnsi="Courier New" w:cs="Courier New"/>
+          <w:sz w:val="18"/>
+          <w:szCs w:val="18"/>
+        </w:rPr>
+        <w:t>N'Tam</w:t>
+      </w:r>
+      <w:proofErr w:type="spellEnd"/>
+      <w:r>
+        <w:rPr>
+          <w:rFonts w:ascii="Courier New" w:eastAsia="Courier New" w:hAnsi="Courier New" w:cs="Courier New"/>
+          <w:sz w:val="18"/>
+          <w:szCs w:val="18"/>
+        </w:rPr>
+        <w:t xml:space="preserve"> Yedek Al',</w:t>
+      </w:r>
+    </w:p>
+    <w:p>
+      <w:pPr>
+        <w:shd w:val="clear" w:color="auto" w:fill="F2F2F2"/>
+      </w:pPr>
+      <w:r>
+        <w:rPr>
+          <w:rFonts w:ascii="Courier New" w:eastAsia="Courier New" w:hAnsi="Courier New" w:cs="Courier New"/>
+          <w:sz w:val="18"/>
+          <w:szCs w:val="18"/>
+        </w:rPr>
+        <w:t xml:space="preserve">    @command = N'BACKUP DATABASE </w:t>
+      </w:r>
+      <w:proofErr w:type="spellStart"/>
+      <w:r>
+        <w:rPr>
+          <w:rFonts w:ascii="Courier New" w:eastAsia="Courier New" w:hAnsi="Courier New" w:cs="Courier New"/>
+          <w:sz w:val="18"/>
+          <w:szCs w:val="18"/>
+        </w:rPr>
+        <w:t>Chinook</w:t>
+      </w:r>
+      <w:proofErr w:type="spellEnd"/>
+    </w:p>
+    <w:p>
+      <w:pPr>
+        <w:shd w:val="clear" w:color="auto" w:fill="F2F2F2"/>
+      </w:pPr>
+      <w:r>
+        <w:rPr>
+          <w:rFonts w:ascii="Courier New" w:eastAsia="Courier New" w:hAnsi="Courier New" w:cs="Courier New"/>
+          <w:sz w:val="18"/>
+          <w:szCs w:val="18"/>
+        </w:rPr>
+        <w:t>TO DISK = ''''C:\</w:t>
+      </w:r>
+      <w:proofErr w:type="spellStart"/>
+      <w:r>
+        <w:rPr>
+          <w:rFonts w:ascii="Courier New" w:eastAsia="Courier New" w:hAnsi="Courier New" w:cs="Courier New"/>
+          <w:sz w:val="18"/>
+          <w:szCs w:val="18"/>
+        </w:rPr>
+        <w:t>Backup</w:t>
+      </w:r>
+      <w:proofErr w:type="spellEnd"/>
+      <w:r>
+        <w:rPr>
+          <w:rFonts w:ascii="Courier New" w:eastAsia="Courier New" w:hAnsi="Courier New" w:cs="Courier New"/>
+          <w:sz w:val="18"/>
+          <w:szCs w:val="18"/>
+        </w:rPr>
+        <w:t>\</w:t>
+      </w:r>
+      <w:proofErr w:type="spellStart"/>
+      <w:r>
+        <w:rPr>
+          <w:rFonts w:ascii="Courier New" w:eastAsia="Courier New" w:hAnsi="Courier New" w:cs="Courier New"/>
+          <w:sz w:val="18"/>
+          <w:szCs w:val="18"/>
+        </w:rPr>
+        <w:t>Chinook_Otomatik.bak</w:t>
+      </w:r>
+      <w:proofErr w:type="spellEnd"/>
+      <w:r>
+        <w:rPr>
+          <w:rFonts w:ascii="Courier New" w:eastAsia="Courier New" w:hAnsi="Courier New" w:cs="Courier New"/>
+          <w:sz w:val="18"/>
+          <w:szCs w:val="18"/>
+        </w:rPr>
+        <w:t>''''</w:t>
+      </w:r>
+    </w:p>
+    <w:p>
+      <w:pPr>
+        <w:shd w:val="clear" w:color="auto" w:fill="F2F2F2"/>
+      </w:pPr>
+      <w:r>
+        <w:rPr>
+          <w:rFonts w:ascii="Courier New" w:eastAsia="Courier New" w:hAnsi="Courier New" w:cs="Courier New"/>
+          <w:sz w:val="18"/>
+          <w:szCs w:val="18"/>
+        </w:rPr>
+        <w:t>WITH FORMAT, NAME = ''''Otomatik Yedek'''';';</w:t>
+      </w:r>
+    </w:p>
+    <w:p>
+      <w:pPr>
+        <w:shd w:val="clear" w:color="auto" w:fill="F2F2F2"/>
+      </w:pPr>
+    </w:p>
+    <w:p>
+      <w:pPr>
+        <w:shd w:val="clear" w:color="auto" w:fill="F2F2F2"/>
+      </w:pPr>
+      <w:r>
+        <w:rPr>
+          <w:rFonts w:ascii="Courier New" w:eastAsia="Courier New" w:hAnsi="Courier New" w:cs="Courier New"/>
+          <w:sz w:val="18"/>
+          <w:szCs w:val="18"/>
+        </w:rPr>
+        <w:t xml:space="preserve">EXEC </w:t>
+      </w:r>
+      <w:proofErr w:type="spellStart"/>
+      <w:r>
+        <w:rPr>
+          <w:rFonts w:ascii="Courier New" w:eastAsia="Courier New" w:hAnsi="Courier New" w:cs="Courier New"/>
+          <w:sz w:val="18"/>
+          <w:szCs w:val="18"/>
+        </w:rPr>
+        <w:t>sp_add_schedule</w:t>
+      </w:r>
+      <w:proofErr w:type="spellEnd"/>
+    </w:p>
+    <w:p>
+      <w:pPr>
+        <w:shd w:val="clear" w:color="auto" w:fill="F2F2F2"/>
+      </w:pPr>
+      <w:r>
+        <w:rPr>
+          <w:rFonts w:ascii="Courier New" w:eastAsia="Courier New" w:hAnsi="Courier New" w:cs="Courier New"/>
+          <w:sz w:val="18"/>
+          <w:szCs w:val="18"/>
+        </w:rPr>
+        <w:t xml:space="preserve">    @schedule_name = </w:t>
+      </w:r>
+      <w:proofErr w:type="spellStart"/>
+      <w:r>
+        <w:rPr>
+          <w:rFonts w:ascii="Courier New" w:eastAsia="Courier New" w:hAnsi="Courier New" w:cs="Courier New"/>
+          <w:sz w:val="18"/>
+          <w:szCs w:val="18"/>
+        </w:rPr>
+        <w:t>N'Her_Gun_Gece_Yaris</w:t>
+      </w:r>
+      <w:proofErr w:type="spellEnd"/>
+      <w:r>
+        <w:rPr>
+          <w:rFonts w:ascii="Courier New" w:eastAsia="Courier New" w:hAnsi="Courier New" w:cs="Courier New"/>
+          <w:sz w:val="18"/>
+          <w:szCs w:val="18"/>
+        </w:rPr>
+        <w:t>',</w:t>
+      </w:r>
+    </w:p>
+    <w:p>
+      <w:pPr>
+        <w:shd w:val="clear" w:color="auto" w:fill="F2F2F2"/>
+      </w:pPr>
+      <w:r>
+        <w:rPr>
+          <w:rFonts w:ascii="Courier New" w:eastAsia="Courier New" w:hAnsi="Courier New" w:cs="Courier New"/>
+          <w:sz w:val="18"/>
+          <w:szCs w:val="18"/>
+        </w:rPr>
+        <w:t xml:space="preserve">    @freq_type = 4, @freq_interval = 1,</w:t>
+      </w:r>
+    </w:p>
+    <w:p>
+      <w:pPr>
+        <w:shd w:val="clear" w:color="auto" w:fill="F2F2F2"/>
+      </w:pPr>
+      <w:r>
+        <w:rPr>
+          <w:rFonts w:ascii="Courier New" w:eastAsia="Courier New" w:hAnsi="Courier New" w:cs="Courier New"/>
+          <w:sz w:val="18"/>
+          <w:szCs w:val="18"/>
+        </w:rPr>
+        <w:t xml:space="preserve">    @active_start_time = 000000;</w:t>
+      </w:r>
+    </w:p>
+    <w:p>
+      <w:pPr>
+        <w:shd w:val="clear" w:color="auto" w:fill="F2F2F2"/>
+      </w:pPr>
+    </w:p>
+    <w:p>
+      <w:pPr>
+        <w:shd w:val="clear" w:color="auto" w:fill="F2F2F2"/>
+      </w:pPr>
+      <w:r>
+        <w:rPr>
+          <w:rFonts w:ascii="Courier New" w:eastAsia="Courier New" w:hAnsi="Courier New" w:cs="Courier New"/>
+          <w:sz w:val="18"/>
+          <w:szCs w:val="18"/>
+        </w:rPr>
+        <w:t xml:space="preserve">EXEC </w:t>
+      </w:r>
+      <w:proofErr w:type="spellStart"/>
+      <w:r>
+        <w:rPr>
+          <w:rFonts w:ascii="Courier New" w:eastAsia="Courier New" w:hAnsi="Courier New" w:cs="Courier New"/>
+          <w:sz w:val="18"/>
+          <w:szCs w:val="18"/>
+        </w:rPr>
+        <w:t>sp_attach_schedule</w:t>
+      </w:r>
+      <w:proofErr w:type="spellEnd"/>
+    </w:p>
+    <w:p>
+      <w:pPr>
+        <w:shd w:val="clear" w:color="auto" w:fill="F2F2F2"/>
+      </w:pPr>
+      <w:r>
+        <w:rPr>
+          <w:rFonts w:ascii="Courier New" w:eastAsia="Courier New" w:hAnsi="Courier New" w:cs="Courier New"/>
+          <w:sz w:val="18"/>
+          <w:szCs w:val="18"/>
+        </w:rPr>
+        <w:t xml:space="preserve">    @job_name = </w:t>
+      </w:r>
+      <w:proofErr w:type="spellStart"/>
+      <w:r>
+        <w:rPr>
+          <w:rFonts w:ascii="Courier New" w:eastAsia="Courier New" w:hAnsi="Courier New" w:cs="Courier New"/>
+          <w:sz w:val="18"/>
+          <w:szCs w:val="18"/>
+        </w:rPr>
+        <w:t>N'Chinook_Otomatik_Yedekleme</w:t>
+      </w:r>
+      <w:proofErr w:type="spellEnd"/>
+      <w:r>
+        <w:rPr>
+          <w:rFonts w:ascii="Courier New" w:eastAsia="Courier New" w:hAnsi="Courier New" w:cs="Courier New"/>
+          <w:sz w:val="18"/>
+          <w:szCs w:val="18"/>
+        </w:rPr>
+        <w:t>',</w:t>
+      </w:r>
+    </w:p>
+    <w:p>
+      <w:pPr>
+        <w:shd w:val="clear" w:color="auto" w:fill="F2F2F2"/>
+      </w:pPr>
+      <w:r>
+        <w:rPr>
+          <w:rFonts w:ascii="Courier New" w:eastAsia="Courier New" w:hAnsi="Courier New" w:cs="Courier New"/>
+          <w:sz w:val="18"/>
+          <w:szCs w:val="18"/>
+        </w:rPr>
+        <w:t xml:space="preserve">    @schedule_name = </w:t>
+      </w:r>
+      <w:proofErr w:type="spellStart"/>
+      <w:r>
+        <w:rPr>
+          <w:rFonts w:ascii="Courier New" w:eastAsia="Courier New" w:hAnsi="Courier New" w:cs="Courier New"/>
+          <w:sz w:val="18"/>
+          <w:szCs w:val="18"/>
+        </w:rPr>
+        <w:t>N'Her_Gun_Gece_Yaris</w:t>
+      </w:r>
+      <w:proofErr w:type="spellEnd"/>
+      <w:r>
+        <w:rPr>
+          <w:rFonts w:ascii="Courier New" w:eastAsia="Courier New" w:hAnsi="Courier New" w:cs="Courier New"/>
+          <w:sz w:val="18"/>
+          <w:szCs w:val="18"/>
+        </w:rPr>
+        <w:t>';</w:t>
+      </w:r>
+    </w:p>
+    <w:p>
+      <w:pPr>
+        <w:spacing w:before="100" w:after="100"/>
+      </w:pPr>
+    </w:p>
+    <w:p>
+      <w:pPr>
+        <w:spacing w:before="100" w:after="40"/>
+        <w:jc w:val="center"/>
+      </w:pPr>
+      <w:r>
+        <w:rPr>
+          <w:noProof/>
+        </w:rPr>
+        <w:drawing>
+          <wp:inline distT="0" distB="0" distL="0" distR="0" wp14:anchorId="76569947" wp14:editId="73433BEA">
+            <wp:extent cx="5143500" cy="3048000"/>
+            <wp:effectExtent l="0" t="0" r="0" b="0"/>
+            <wp:docPr id="1355600168" name="Otomatik yedekleme" descr="Otomatik yedekleme" title="Otomatik yedekleme"/>
+            <wp:cNvGraphicFramePr>
+              <a:graphicFrameLocks xmlns:a="http://schemas.openxmlformats.org/drawingml/2006/main" noChangeAspect="1"/>
+            </wp:cNvGraphicFramePr>
+            <a:graphic xmlns:a="http://schemas.openxmlformats.org/drawingml/2006/main">
+              <a:graphicData uri="http://schemas.openxmlformats.org/drawingml/2006/picture">
+                <pic:pic xmlns:pic="http://schemas.openxmlformats.org/drawingml/2006/picture">
+                  <pic:nvPicPr>
+                    <pic:cNvPr id="0" name=""/>
+                    <pic:cNvPicPr>
+                      <a:picLocks noChangeAspect="1" noChangeArrowheads="1"/>
+                    </pic:cNvPicPr>
+                  </pic:nvPicPr>
+                  <pic:blipFill>
+                    <a:blip r:embed="rId32"/>
+                    <a:srcRect/>
+                    <a:stretch>
+                      <a:fillRect/>
+                    </a:stretch>
+                  </pic:blipFill>
+                  <pic:spPr bwMode="auto">
+                    <a:xfrm>
+                      <a:off x="0" y="0"/>
+                      <a:ext cx="5143500" cy="3048000"/>
+                    </a:xfrm>
+                    <a:prstGeom prst="rect">
+                      <a:avLst/>
+                    </a:prstGeom>
+                  </pic:spPr>
+                </pic:pic>
+              </a:graphicData>
+            </a:graphic>
+          </wp:inline>
+        </w:drawing>
+      </w:r>
+    </w:p>
+    <w:p>
+      <w:pPr>
+        <w:spacing w:before="40" w:after="160"/>
+        <w:jc w:val="center"/>
+      </w:pPr>
+      <w:r>
+        <w:rPr>
+          <w:i/>
+          <w:iCs/>
+          <w:sz w:val="18"/>
+          <w:szCs w:val="18"/>
+        </w:rPr>
+        <w:t xml:space="preserve">Şekil 26 – SQL Server Agent </w:t>
+      </w:r>
+      <w:proofErr w:type="spellStart"/>
+      <w:r>
+        <w:rPr>
+          <w:i/>
+          <w:iCs/>
+          <w:sz w:val="18"/>
+          <w:szCs w:val="18"/>
+        </w:rPr>
+        <w:t>job</w:t>
+      </w:r>
+      <w:proofErr w:type="spellEnd"/>
+      <w:r>
+        <w:rPr>
+          <w:i/>
+          <w:iCs/>
+          <w:sz w:val="18"/>
+          <w:szCs w:val="18"/>
+        </w:rPr>
+        <w:t xml:space="preserve"> tanımı; </w:t>
+      </w:r>
+      <w:proofErr w:type="spellStart"/>
+      <w:r>
+        <w:rPr>
+          <w:i/>
+          <w:iCs/>
+          <w:sz w:val="18"/>
+          <w:szCs w:val="18"/>
+        </w:rPr>
+        <w:t>LocalDB'de</w:t>
+      </w:r>
+      <w:proofErr w:type="spellEnd"/>
+      <w:r>
+        <w:rPr>
+          <w:i/>
+          <w:iCs/>
+          <w:sz w:val="18"/>
+          <w:szCs w:val="18"/>
+        </w:rPr>
+        <w:t xml:space="preserve"> İleti 22001 beklenen davranıştır</w:t>
+      </w:r>
+    </w:p>
+    <w:p>
+      <w:pPr>
+        <w:spacing w:before="80" w:after="80"/>
+        <w:jc w:val="both"/>
+      </w:pPr>
+      <w:r>
+        <w:t xml:space="preserve">Not: SQL Server Agent, </w:t>
+      </w:r>
+      <w:proofErr w:type="spellStart"/>
+      <w:r>
+        <w:t>LocalDB</w:t>
+      </w:r>
+      <w:proofErr w:type="spellEnd"/>
+      <w:r>
+        <w:t xml:space="preserve"> (geliştirme) ortamında desteklenmemektedir. Bu nedenle İleti 22001 uyarısı alınmaktadır. Aynı </w:t>
+      </w:r>
+      <w:proofErr w:type="spellStart"/>
+      <w:r>
+        <w:t>script</w:t>
+      </w:r>
+      <w:proofErr w:type="spellEnd"/>
+      <w:r>
+        <w:t xml:space="preserve"> tam SQL Server kurulumunda çalıştırıldığında </w:t>
+      </w:r>
+      <w:proofErr w:type="spellStart"/>
+      <w:r>
+        <w:t>job</w:t>
+      </w:r>
+      <w:proofErr w:type="spellEnd"/>
+      <w:r>
+        <w:t xml:space="preserve"> başarıyla oluşturulur ve her gece 00:00'da otomatik yedek alır.</w:t>
+      </w:r>
+    </w:p>
+    <w:p>
+      <w:pPr>
+        <w:spacing w:before="100" w:after="100"/>
+      </w:pPr>
+    </w:p>
+    <w:p>
+      <w:pPr>
+        <w:pStyle w:val="Balk1"/>
+      </w:pPr>
+    </w:p>
+    <w:p>
+      <w:pPr>
+        <w:pStyle w:val="Balk1"/>
+      </w:pPr>
+      <w:r>
+        <w:lastRenderedPageBreak/>
+        <w:t>9. Sonuç</w:t>
+      </w:r>
+    </w:p>
+    <w:p>
+      <w:pPr>
+        <w:spacing w:before="80" w:after="80"/>
+        <w:jc w:val="both"/>
+      </w:pPr>
+      <w:r>
         <w:t xml:space="preserve">Bu proje kapsamında </w:t>
       </w:r>
       <w:proofErr w:type="spellStart"/>
@@ -8354,7 +9039,7 @@
       </w:r>
       <w:proofErr w:type="spellEnd"/>
       <w:r>
-        <w:t xml:space="preserve"> üzerinde kapsamlı bir yedekleme ve felaketten kurtarma çalışması gerçekleştirilmiştir. Beş farklı konu ele alınmış ve tüm senaryolar başarıyla test edilmiştir.</w:t>
+        <w:t xml:space="preserve"> üzerinde kapsamlı bir yedekleme ve felaketten kurtarma çalışması gerçekleştirilmiştir. Altı farklı konu ele alınmış ve tüm senaryolar test edilmiştir.</w:t>
       </w:r>
     </w:p>
     <w:p>
@@ -9169,8 +9854,8 @@
       </w:pPr>
     </w:p>
     <w:sectPr>
-      <w:headerReference w:type="default" r:id="rId32"/>
-      <w:footerReference w:type="default" r:id="rId33"/>
+      <w:headerReference w:type="default" r:id="rId33"/>
+      <w:footerReference w:type="default" r:id="rId34"/>
       <w:pgSz w:w="11906" w:h="16838"/>
       <w:pgMar w:top="1440" w:right="1800" w:bottom="1440" w:left="1800" w:header="708" w:footer="708" w:gutter="0"/>
       <w:cols w:space="708"/>
@@ -9357,10 +10042,10 @@
 <file path=word/numbering.xml><?xml version="1.0" encoding="utf-8"?>
 <w:numbering xmlns:wpc="http://schemas.microsoft.com/office/word/2010/wordprocessingCanvas" xmlns:cx="http://schemas.microsoft.com/office/drawing/2014/chartex" xmlns:cx1="http://schemas.microsoft.com/office/drawing/2015/9/8/chartex" xmlns:cx2="http://schemas.microsoft.com/office/drawing/2015/10/21/chartex" xmlns:cx3="http://schemas.microsoft.com/office/drawing/2016/5/9/chartex" xmlns:cx4="http://schemas.microsoft.com/office/drawing/2016/5/10/chartex" xmlns:cx5="http://schemas.microsoft.com/office/drawing/2016/5/11/chartex" xmlns:cx6="http://schemas.microsoft.com/office/drawing/2016/5/12/chartex" xmlns:cx7="http://schemas.microsoft.com/office/drawing/2016/5/13/chartex" xmlns:cx8="http://schemas.microsoft.com/office/drawing/2016/5/14/chartex" xmlns:mc="http://schemas.openxmlformats.org/markup-compatibility/2006" xmlns:aink="http://schemas.microsoft.com/office/drawing/2016/ink" xmlns:am3d="http://schemas.microsoft.com/office/drawing/2017/model3d" xmlns:o="urn:schemas-microsoft-com:office:office" xmlns:oel="http://schemas.microsoft.com/office/2019/extlst" xmlns:r="http://schemas.openxmlformats.org/officeDocument/2006/relationships" xmlns:m="http://schemas.openxmlformats.org/officeDocument/2006/math" xmlns:v="urn:schemas-microsoft-com:vml" xmlns:wp14="http://schemas.microsoft.com/office/word/2010/wordprocessingDrawing" xmlns:wp="http://schemas.openxmlformats.org/drawingml/2006/wordprocessingDrawing" xmlns:w10="urn:schemas-microsoft-com:office:word" xmlns:w="http://schemas.openxmlformats.org/wordprocessingml/2006/main" xmlns:w14="http://schemas.microsoft.com/office/word/2010/wordml" xmlns:w15="http://schemas.microsoft.com/office/word/2012/wordml" xmlns:w16cex="http://schemas.microsoft.com/office/word/2018/wordml/cex" xmlns:w16cid="http://schemas.microsoft.com/office/word/2016/wordml/cid" xmlns:w16="http://schemas.microsoft.com/office/word/2018/wordml" xmlns:w16du="http://schemas.microsoft.com/office/word/2023/wordml/word16du" xmlns:w16sdtdh="http://schemas.microsoft.com/office/word/2020/wordml/sdtdatahash" xmlns:w16sdtfl="http://schemas.microsoft.com/office/word/2024/wordml/sdtformatlock" xmlns:w16se="http://schemas.microsoft.com/office/word/2015/wordml/symex" xmlns:wpg="http://schemas.microsoft.com/office/word/2010/wordprocessingGroup" xmlns:wpi="http://schemas.microsoft.com/office/word/2010/wordprocessingInk" xmlns:wne="http://schemas.microsoft.com/office/word/2006/wordml" xmlns:wps="http://schemas.microsoft.com/office/word/2010/wordprocessingShape" mc:Ignorable="w14 w15 w16se w16cid w16 w16cex w16sdtdh w16sdtfl w16du wp14">
   <w:abstractNum w:abstractNumId="0" w15:restartNumberingAfterBreak="0">
-    <w:nsid w:val="56F25AA8"/>
+    <w:nsid w:val="071E472C"/>
     <w:multiLevelType w:val="hybridMultilevel"/>
-    <w:tmpl w:val="630EADB0"/>
-    <w:lvl w:ilvl="0" w:tplc="E2A4625C">
+    <w:tmpl w:val="37427202"/>
+    <w:lvl w:ilvl="0" w:tplc="307A14EA">
       <w:start w:val="1"/>
       <w:numFmt w:val="bullet"/>
       <w:lvlText w:val="•"/>
@@ -9369,52 +10054,52 @@
         <w:ind w:left="720" w:hanging="360"/>
       </w:pPr>
     </w:lvl>
-    <w:lvl w:ilvl="1" w:tplc="E3329042">
+    <w:lvl w:ilvl="1" w:tplc="B96624BE">
       <w:numFmt w:val="decimal"/>
       <w:lvlText w:val=""/>
       <w:lvlJc w:val="left"/>
     </w:lvl>
-    <w:lvl w:ilvl="2" w:tplc="A02A1A96">
+    <w:lvl w:ilvl="2" w:tplc="EDECF636">
       <w:numFmt w:val="decimal"/>
       <w:lvlText w:val=""/>
       <w:lvlJc w:val="left"/>
     </w:lvl>
-    <w:lvl w:ilvl="3" w:tplc="6184657A">
+    <w:lvl w:ilvl="3" w:tplc="2EE43C72">
       <w:numFmt w:val="decimal"/>
       <w:lvlText w:val=""/>
       <w:lvlJc w:val="left"/>
     </w:lvl>
-    <w:lvl w:ilvl="4" w:tplc="8EB893D6">
+    <w:lvl w:ilvl="4" w:tplc="557CF808">
       <w:numFmt w:val="decimal"/>
       <w:lvlText w:val=""/>
       <w:lvlJc w:val="left"/>
     </w:lvl>
-    <w:lvl w:ilvl="5" w:tplc="0D5E350E">
+    <w:lvl w:ilvl="5" w:tplc="15860CBA">
       <w:numFmt w:val="decimal"/>
       <w:lvlText w:val=""/>
       <w:lvlJc w:val="left"/>
     </w:lvl>
-    <w:lvl w:ilvl="6" w:tplc="DA9AEB2A">
+    <w:lvl w:ilvl="6" w:tplc="777A296C">
       <w:numFmt w:val="decimal"/>
       <w:lvlText w:val=""/>
       <w:lvlJc w:val="left"/>
     </w:lvl>
-    <w:lvl w:ilvl="7" w:tplc="2DAC88D0">
+    <w:lvl w:ilvl="7" w:tplc="8800CCA6">
       <w:numFmt w:val="decimal"/>
       <w:lvlText w:val=""/>
       <w:lvlJc w:val="left"/>
     </w:lvl>
-    <w:lvl w:ilvl="8" w:tplc="3D960BC0">
+    <w:lvl w:ilvl="8" w:tplc="8B5E220E">
       <w:numFmt w:val="decimal"/>
       <w:lvlText w:val=""/>
       <w:lvlJc w:val="left"/>
     </w:lvl>
   </w:abstractNum>
   <w:abstractNum w:abstractNumId="1" w15:restartNumberingAfterBreak="0">
-    <w:nsid w:val="63592443"/>
+    <w:nsid w:val="45EE7397"/>
     <w:multiLevelType w:val="hybridMultilevel"/>
-    <w:tmpl w:val="EC9A545C"/>
-    <w:lvl w:ilvl="0" w:tplc="B6A4615C">
+    <w:tmpl w:val="442804AA"/>
+    <w:lvl w:ilvl="0" w:tplc="342CE200">
       <w:start w:val="1"/>
       <w:numFmt w:val="bullet"/>
       <w:lvlText w:val="●"/>
@@ -9423,7 +10108,7 @@
         <w:ind w:left="720" w:hanging="360"/>
       </w:pPr>
     </w:lvl>
-    <w:lvl w:ilvl="1" w:tplc="7152C086">
+    <w:lvl w:ilvl="1" w:tplc="C59A506E">
       <w:start w:val="1"/>
       <w:numFmt w:val="bullet"/>
       <w:lvlText w:val="○"/>
@@ -9432,7 +10117,7 @@
         <w:ind w:left="1440" w:hanging="360"/>
       </w:pPr>
     </w:lvl>
-    <w:lvl w:ilvl="2" w:tplc="51BC3242">
+    <w:lvl w:ilvl="2" w:tplc="222ECACE">
       <w:start w:val="1"/>
       <w:numFmt w:val="bullet"/>
       <w:lvlText w:val="■"/>
@@ -9441,7 +10126,7 @@
         <w:ind w:left="2160" w:hanging="360"/>
       </w:pPr>
     </w:lvl>
-    <w:lvl w:ilvl="3" w:tplc="62B8C6F6">
+    <w:lvl w:ilvl="3" w:tplc="CDDAB0C4">
       <w:start w:val="1"/>
       <w:numFmt w:val="bullet"/>
       <w:lvlText w:val="●"/>
@@ -9450,7 +10135,7 @@
         <w:ind w:left="2880" w:hanging="360"/>
       </w:pPr>
     </w:lvl>
-    <w:lvl w:ilvl="4" w:tplc="6212D8C2">
+    <w:lvl w:ilvl="4" w:tplc="D948546A">
       <w:start w:val="1"/>
       <w:numFmt w:val="bullet"/>
       <w:lvlText w:val="○"/>
@@ -9459,7 +10144,7 @@
         <w:ind w:left="3600" w:hanging="360"/>
       </w:pPr>
     </w:lvl>
-    <w:lvl w:ilvl="5" w:tplc="46546750">
+    <w:lvl w:ilvl="5" w:tplc="E1EE241E">
       <w:start w:val="1"/>
       <w:numFmt w:val="bullet"/>
       <w:lvlText w:val="■"/>
@@ -9468,7 +10153,7 @@
         <w:ind w:left="4320" w:hanging="360"/>
       </w:pPr>
     </w:lvl>
-    <w:lvl w:ilvl="6" w:tplc="03448ACA">
+    <w:lvl w:ilvl="6" w:tplc="E246354A">
       <w:start w:val="1"/>
       <w:numFmt w:val="bullet"/>
       <w:lvlText w:val="●"/>
@@ -9477,7 +10162,7 @@
         <w:ind w:left="5040" w:hanging="360"/>
       </w:pPr>
     </w:lvl>
-    <w:lvl w:ilvl="7" w:tplc="F120E52E">
+    <w:lvl w:ilvl="7" w:tplc="C2721B04">
       <w:start w:val="1"/>
       <w:numFmt w:val="bullet"/>
       <w:lvlText w:val="●"/>
@@ -9486,7 +10171,7 @@
         <w:ind w:left="5760" w:hanging="360"/>
       </w:pPr>
     </w:lvl>
-    <w:lvl w:ilvl="8" w:tplc="D8583B1E">
+    <w:lvl w:ilvl="8" w:tplc="A89862DA">
       <w:start w:val="1"/>
       <w:numFmt w:val="bullet"/>
       <w:lvlText w:val="●"/>
@@ -9496,13 +10181,13 @@
       </w:pPr>
     </w:lvl>
   </w:abstractNum>
-  <w:num w:numId="1" w16cid:durableId="841698179">
+  <w:num w:numId="1" w16cid:durableId="1991448034">
     <w:abstractNumId w:val="1"/>
     <w:lvlOverride w:ilvl="0">
       <w:startOverride w:val="1"/>
     </w:lvlOverride>
   </w:num>
-  <w:num w:numId="2" w16cid:durableId="337316697">
+  <w:num w:numId="2" w16cid:durableId="210577823">
     <w:abstractNumId w:val="0"/>
     <w:lvlOverride w:ilvl="0">
       <w:startOverride w:val="1"/>

</xml_diff>